<commit_message>
docs -- SI1: filling in the docs, fill in the section with grammar
</commit_message>
<xml_diff>
--- a/42SI Stvorennja IDE/1/SI_KNT-122_Onyshchenko_19_PR1.docx
+++ b/42SI Stvorennja IDE/1/SI_KNT-122_Onyshchenko_19_PR1.docx
@@ -748,6 +748,1959 @@
       <w:r>
         <w:rPr/>
         <w:t>Лексична граматика</w:t>
+      </w:r>
+    </w:p>
+    <w:p>
+      <w:pPr>
+        <w:pStyle w:val="P1"/>
+        <w:rPr/>
+      </w:pPr>
+      <w:r>
+        <w:rPr/>
+      </w:r>
+    </w:p>
+    <w:p>
+      <w:pPr>
+        <w:pStyle w:val="Code"/>
+        <w:rPr>
+          <w:rFonts w:ascii="Consolas" w:hAnsi="Consolas"/>
+        </w:rPr>
+      </w:pPr>
+      <w:r>
+        <w:rPr>
+          <w:rFonts w:ascii="Consolas" w:hAnsi="Consolas"/>
+        </w:rPr>
+        <w:t>grammar Rust;</w:t>
+      </w:r>
+    </w:p>
+    <w:p>
+      <w:pPr>
+        <w:pStyle w:val="Code"/>
+        <w:rPr>
+          <w:rFonts w:ascii="Consolas" w:hAnsi="Consolas"/>
+        </w:rPr>
+      </w:pPr>
+      <w:r>
+        <w:rPr>
+          <w:rFonts w:ascii="Consolas" w:hAnsi="Consolas"/>
+        </w:rPr>
+      </w:r>
+    </w:p>
+    <w:p>
+      <w:pPr>
+        <w:pStyle w:val="Code"/>
+        <w:rPr>
+          <w:rFonts w:ascii="Consolas" w:hAnsi="Consolas"/>
+        </w:rPr>
+      </w:pPr>
+      <w:r>
+        <w:rPr>
+          <w:rFonts w:ascii="Consolas" w:hAnsi="Consolas"/>
+        </w:rPr>
+        <w:t>// --- PARSER ---</w:t>
+      </w:r>
+    </w:p>
+    <w:p>
+      <w:pPr>
+        <w:pStyle w:val="Code"/>
+        <w:rPr>
+          <w:rFonts w:ascii="Consolas" w:hAnsi="Consolas"/>
+        </w:rPr>
+      </w:pPr>
+      <w:r>
+        <w:rPr>
+          <w:rFonts w:ascii="Consolas" w:hAnsi="Consolas"/>
+        </w:rPr>
+        <w:t>start: block | method | function | struct | if | else | if_else | else_if;</w:t>
+      </w:r>
+    </w:p>
+    <w:p>
+      <w:pPr>
+        <w:pStyle w:val="Code"/>
+        <w:rPr>
+          <w:rFonts w:ascii="Consolas" w:hAnsi="Consolas"/>
+        </w:rPr>
+      </w:pPr>
+      <w:r>
+        <w:rPr>
+          <w:rFonts w:ascii="Consolas" w:hAnsi="Consolas"/>
+        </w:rPr>
+      </w:r>
+    </w:p>
+    <w:p>
+      <w:pPr>
+        <w:pStyle w:val="Code"/>
+        <w:rPr>
+          <w:rFonts w:ascii="Consolas" w:hAnsi="Consolas"/>
+        </w:rPr>
+      </w:pPr>
+      <w:r>
+        <w:rPr>
+          <w:rFonts w:ascii="Consolas" w:hAnsi="Consolas"/>
+        </w:rPr>
+        <w:t>// Block</w:t>
+      </w:r>
+    </w:p>
+    <w:p>
+      <w:pPr>
+        <w:pStyle w:val="Code"/>
+        <w:rPr>
+          <w:rFonts w:ascii="Consolas" w:hAnsi="Consolas"/>
+        </w:rPr>
+      </w:pPr>
+      <w:r>
+        <w:rPr>
+          <w:rFonts w:ascii="Consolas" w:hAnsi="Consolas"/>
+        </w:rPr>
+        <w:t>block: LEFT_CURLY_BRACE .*? RIGHT_CURLY_BRACE;</w:t>
+      </w:r>
+    </w:p>
+    <w:p>
+      <w:pPr>
+        <w:pStyle w:val="Code"/>
+        <w:rPr>
+          <w:rFonts w:ascii="Consolas" w:hAnsi="Consolas"/>
+        </w:rPr>
+      </w:pPr>
+      <w:r>
+        <w:rPr>
+          <w:rFonts w:ascii="Consolas" w:hAnsi="Consolas"/>
+        </w:rPr>
+        <w:t>method: FN ID LEFT_PARANTHESIS .*? RIGHT_PARANTHESIS RIGHT_ARROW? ID? block;</w:t>
+      </w:r>
+    </w:p>
+    <w:p>
+      <w:pPr>
+        <w:pStyle w:val="Code"/>
+        <w:rPr>
+          <w:rFonts w:ascii="Consolas" w:hAnsi="Consolas"/>
+        </w:rPr>
+      </w:pPr>
+      <w:r>
+        <w:rPr>
+          <w:rFonts w:ascii="Consolas" w:hAnsi="Consolas"/>
+        </w:rPr>
+        <w:t>function: FN ID LEFT_PARANTHESIS .*? RIGHT_PARANTHESIS block;</w:t>
+      </w:r>
+    </w:p>
+    <w:p>
+      <w:pPr>
+        <w:pStyle w:val="Code"/>
+        <w:rPr>
+          <w:rFonts w:ascii="Consolas" w:hAnsi="Consolas"/>
+        </w:rPr>
+      </w:pPr>
+      <w:r>
+        <w:rPr>
+          <w:rFonts w:ascii="Consolas" w:hAnsi="Consolas"/>
+        </w:rPr>
+        <w:t>struct: STRUCT ID LEFT_CURLY_BRACE .*? RIGHT_CURLY_BRACE | IMPL ID block;</w:t>
+      </w:r>
+    </w:p>
+    <w:p>
+      <w:pPr>
+        <w:pStyle w:val="Code"/>
+        <w:rPr>
+          <w:rFonts w:ascii="Consolas" w:hAnsi="Consolas"/>
+        </w:rPr>
+      </w:pPr>
+      <w:r>
+        <w:rPr>
+          <w:rFonts w:ascii="Consolas" w:hAnsi="Consolas"/>
+        </w:rPr>
+        <w:t>if: IF .*? block;</w:t>
+      </w:r>
+    </w:p>
+    <w:p>
+      <w:pPr>
+        <w:pStyle w:val="Code"/>
+        <w:rPr>
+          <w:rFonts w:ascii="Consolas" w:hAnsi="Consolas"/>
+        </w:rPr>
+      </w:pPr>
+      <w:r>
+        <w:rPr>
+          <w:rFonts w:ascii="Consolas" w:hAnsi="Consolas"/>
+        </w:rPr>
+        <w:t>else: ELSE .*? block;</w:t>
+      </w:r>
+    </w:p>
+    <w:p>
+      <w:pPr>
+        <w:pStyle w:val="Code"/>
+        <w:rPr>
+          <w:rFonts w:ascii="Consolas" w:hAnsi="Consolas"/>
+        </w:rPr>
+      </w:pPr>
+      <w:r>
+        <w:rPr>
+          <w:rFonts w:ascii="Consolas" w:hAnsi="Consolas"/>
+        </w:rPr>
+        <w:t>if_else: if else;</w:t>
+      </w:r>
+    </w:p>
+    <w:p>
+      <w:pPr>
+        <w:pStyle w:val="Code"/>
+        <w:rPr>
+          <w:rFonts w:ascii="Consolas" w:hAnsi="Consolas"/>
+        </w:rPr>
+      </w:pPr>
+      <w:r>
+        <w:rPr>
+          <w:rFonts w:ascii="Consolas" w:hAnsi="Consolas"/>
+        </w:rPr>
+        <w:t>else_if: ELSE IF .*? block;</w:t>
+      </w:r>
+    </w:p>
+    <w:p>
+      <w:pPr>
+        <w:pStyle w:val="Code"/>
+        <w:rPr>
+          <w:rFonts w:ascii="Consolas" w:hAnsi="Consolas"/>
+        </w:rPr>
+      </w:pPr>
+      <w:r>
+        <w:rPr>
+          <w:rFonts w:ascii="Consolas" w:hAnsi="Consolas"/>
+        </w:rPr>
+      </w:r>
+    </w:p>
+    <w:p>
+      <w:pPr>
+        <w:pStyle w:val="Code"/>
+        <w:rPr>
+          <w:rFonts w:ascii="Consolas" w:hAnsi="Consolas"/>
+        </w:rPr>
+      </w:pPr>
+      <w:r>
+        <w:rPr>
+          <w:rFonts w:ascii="Consolas" w:hAnsi="Consolas"/>
+        </w:rPr>
+        <w:t>// Inline</w:t>
+      </w:r>
+    </w:p>
+    <w:p>
+      <w:pPr>
+        <w:pStyle w:val="Code"/>
+        <w:rPr>
+          <w:rFonts w:ascii="Consolas" w:hAnsi="Consolas"/>
+        </w:rPr>
+      </w:pPr>
+      <w:r>
+        <w:rPr>
+          <w:rFonts w:ascii="Consolas" w:hAnsi="Consolas"/>
+        </w:rPr>
+        <w:t>variable: LET MUT? ID COLON? (data_types)? EQ binding;</w:t>
+      </w:r>
+    </w:p>
+    <w:p>
+      <w:pPr>
+        <w:pStyle w:val="Code"/>
+        <w:rPr>
+          <w:rFonts w:ascii="Consolas" w:hAnsi="Consolas"/>
+        </w:rPr>
+      </w:pPr>
+      <w:r>
+        <w:rPr>
+          <w:rFonts w:ascii="Consolas" w:hAnsi="Consolas"/>
+        </w:rPr>
+        <w:t>binding: FLOAT_LIT | INT_LIT | STRING_LIT | BOOL_LIT;</w:t>
+      </w:r>
+    </w:p>
+    <w:p>
+      <w:pPr>
+        <w:pStyle w:val="Code"/>
+        <w:rPr>
+          <w:rFonts w:ascii="Consolas" w:hAnsi="Consolas"/>
+        </w:rPr>
+      </w:pPr>
+      <w:r>
+        <w:rPr>
+          <w:rFonts w:ascii="Consolas" w:hAnsi="Consolas"/>
+        </w:rPr>
+        <w:t>vector: VEC_MACRO LEFT_SQUARE_BRACE .*? RIGHT_SQUARE_BRACE;</w:t>
+      </w:r>
+    </w:p>
+    <w:p>
+      <w:pPr>
+        <w:pStyle w:val="Code"/>
+        <w:rPr>
+          <w:rFonts w:ascii="Consolas" w:hAnsi="Consolas"/>
+        </w:rPr>
+      </w:pPr>
+      <w:r>
+        <w:rPr>
+          <w:rFonts w:ascii="Consolas" w:hAnsi="Consolas"/>
+        </w:rPr>
+        <w:t>loop: LOOP block | WHILE .*? block | FOR .*? block;</w:t>
+      </w:r>
+    </w:p>
+    <w:p>
+      <w:pPr>
+        <w:pStyle w:val="Code"/>
+        <w:rPr>
+          <w:rFonts w:ascii="Consolas" w:hAnsi="Consolas"/>
+        </w:rPr>
+      </w:pPr>
+      <w:r>
+        <w:rPr>
+          <w:rFonts w:ascii="Consolas" w:hAnsi="Consolas"/>
+        </w:rPr>
+      </w:r>
+    </w:p>
+    <w:p>
+      <w:pPr>
+        <w:pStyle w:val="Code"/>
+        <w:rPr>
+          <w:rFonts w:ascii="Consolas" w:hAnsi="Consolas"/>
+        </w:rPr>
+      </w:pPr>
+      <w:r>
+        <w:rPr>
+          <w:rFonts w:ascii="Consolas" w:hAnsi="Consolas"/>
+        </w:rPr>
+        <w:t>// Helper</w:t>
+      </w:r>
+    </w:p>
+    <w:p>
+      <w:pPr>
+        <w:pStyle w:val="Code"/>
+        <w:rPr>
+          <w:rFonts w:ascii="Consolas" w:hAnsi="Consolas"/>
+        </w:rPr>
+      </w:pPr>
+      <w:r>
+        <w:rPr>
+          <w:rFonts w:ascii="Consolas" w:hAnsi="Consolas"/>
+        </w:rPr>
+        <w:t>data_types: INTEGER | UNSIGNED_INTEGER | FLOAT | BOOL | CHAR | STRING;</w:t>
+      </w:r>
+    </w:p>
+    <w:p>
+      <w:pPr>
+        <w:pStyle w:val="Code"/>
+        <w:rPr>
+          <w:rFonts w:ascii="Consolas" w:hAnsi="Consolas"/>
+        </w:rPr>
+      </w:pPr>
+      <w:r>
+        <w:rPr>
+          <w:rFonts w:ascii="Consolas" w:hAnsi="Consolas"/>
+        </w:rPr>
+      </w:r>
+    </w:p>
+    <w:p>
+      <w:pPr>
+        <w:pStyle w:val="Code"/>
+        <w:rPr>
+          <w:rFonts w:ascii="Consolas" w:hAnsi="Consolas"/>
+        </w:rPr>
+      </w:pPr>
+      <w:r>
+        <w:rPr>
+          <w:rFonts w:ascii="Consolas" w:hAnsi="Consolas"/>
+        </w:rPr>
+        <w:t>// --- LEXER ---</w:t>
+      </w:r>
+    </w:p>
+    <w:p>
+      <w:pPr>
+        <w:pStyle w:val="Code"/>
+        <w:rPr>
+          <w:rFonts w:ascii="Consolas" w:hAnsi="Consolas"/>
+        </w:rPr>
+      </w:pPr>
+      <w:r>
+        <w:rPr>
+          <w:rFonts w:ascii="Consolas" w:hAnsi="Consolas"/>
+        </w:rPr>
+        <w:t>// Space and commentaries</w:t>
+      </w:r>
+    </w:p>
+    <w:p>
+      <w:pPr>
+        <w:pStyle w:val="Code"/>
+        <w:rPr>
+          <w:rFonts w:ascii="Consolas" w:hAnsi="Consolas"/>
+        </w:rPr>
+      </w:pPr>
+      <w:r>
+        <w:rPr>
+          <w:rFonts w:ascii="Consolas" w:hAnsi="Consolas"/>
+        </w:rPr>
+        <w:t>WS: [ \t\r\n]+ -&gt; skip;</w:t>
+      </w:r>
+    </w:p>
+    <w:p>
+      <w:pPr>
+        <w:pStyle w:val="Code"/>
+        <w:rPr>
+          <w:rFonts w:ascii="Consolas" w:hAnsi="Consolas"/>
+        </w:rPr>
+      </w:pPr>
+      <w:r>
+        <w:rPr>
+          <w:rFonts w:ascii="Consolas" w:hAnsi="Consolas"/>
+        </w:rPr>
+        <w:t>SINGLE_COMMENT: '//' ~[\r\n]* -&gt; skip;</w:t>
+      </w:r>
+    </w:p>
+    <w:p>
+      <w:pPr>
+        <w:pStyle w:val="Code"/>
+        <w:rPr>
+          <w:rFonts w:ascii="Consolas" w:hAnsi="Consolas"/>
+        </w:rPr>
+      </w:pPr>
+      <w:r>
+        <w:rPr>
+          <w:rFonts w:ascii="Consolas" w:hAnsi="Consolas"/>
+        </w:rPr>
+        <w:t>DOUBLE_COMMENT: '/*' .*? '*/' -&gt; skip;</w:t>
+      </w:r>
+    </w:p>
+    <w:p>
+      <w:pPr>
+        <w:pStyle w:val="Code"/>
+        <w:rPr>
+          <w:rFonts w:ascii="Consolas" w:hAnsi="Consolas"/>
+        </w:rPr>
+      </w:pPr>
+      <w:r>
+        <w:rPr>
+          <w:rFonts w:ascii="Consolas" w:hAnsi="Consolas"/>
+        </w:rPr>
+      </w:r>
+    </w:p>
+    <w:p>
+      <w:pPr>
+        <w:pStyle w:val="Code"/>
+        <w:rPr>
+          <w:rFonts w:ascii="Consolas" w:hAnsi="Consolas"/>
+        </w:rPr>
+      </w:pPr>
+      <w:r>
+        <w:rPr>
+          <w:rFonts w:ascii="Consolas" w:hAnsi="Consolas"/>
+        </w:rPr>
+        <w:t>// Key words</w:t>
+      </w:r>
+    </w:p>
+    <w:p>
+      <w:pPr>
+        <w:pStyle w:val="Code"/>
+        <w:rPr>
+          <w:rFonts w:ascii="Consolas" w:hAnsi="Consolas"/>
+        </w:rPr>
+      </w:pPr>
+      <w:r>
+        <w:rPr>
+          <w:rFonts w:ascii="Consolas" w:hAnsi="Consolas"/>
+        </w:rPr>
+        <w:t>AS: 'as';</w:t>
+      </w:r>
+    </w:p>
+    <w:p>
+      <w:pPr>
+        <w:pStyle w:val="Code"/>
+        <w:rPr>
+          <w:rFonts w:ascii="Consolas" w:hAnsi="Consolas"/>
+        </w:rPr>
+      </w:pPr>
+      <w:r>
+        <w:rPr>
+          <w:rFonts w:ascii="Consolas" w:hAnsi="Consolas"/>
+        </w:rPr>
+        <w:t>ASYNC: 'async';</w:t>
+      </w:r>
+    </w:p>
+    <w:p>
+      <w:pPr>
+        <w:pStyle w:val="Code"/>
+        <w:rPr>
+          <w:rFonts w:ascii="Consolas" w:hAnsi="Consolas"/>
+        </w:rPr>
+      </w:pPr>
+      <w:r>
+        <w:rPr>
+          <w:rFonts w:ascii="Consolas" w:hAnsi="Consolas"/>
+        </w:rPr>
+        <w:t>AWAIT: 'await';</w:t>
+      </w:r>
+    </w:p>
+    <w:p>
+      <w:pPr>
+        <w:pStyle w:val="Code"/>
+        <w:rPr>
+          <w:rFonts w:ascii="Consolas" w:hAnsi="Consolas"/>
+        </w:rPr>
+      </w:pPr>
+      <w:r>
+        <w:rPr>
+          <w:rFonts w:ascii="Consolas" w:hAnsi="Consolas"/>
+        </w:rPr>
+        <w:t>BREAK: 'break';</w:t>
+      </w:r>
+    </w:p>
+    <w:p>
+      <w:pPr>
+        <w:pStyle w:val="Code"/>
+        <w:rPr>
+          <w:rFonts w:ascii="Consolas" w:hAnsi="Consolas"/>
+        </w:rPr>
+      </w:pPr>
+      <w:r>
+        <w:rPr>
+          <w:rFonts w:ascii="Consolas" w:hAnsi="Consolas"/>
+        </w:rPr>
+        <w:t>CONST: 'const';</w:t>
+      </w:r>
+    </w:p>
+    <w:p>
+      <w:pPr>
+        <w:pStyle w:val="Code"/>
+        <w:rPr>
+          <w:rFonts w:ascii="Consolas" w:hAnsi="Consolas"/>
+        </w:rPr>
+      </w:pPr>
+      <w:r>
+        <w:rPr>
+          <w:rFonts w:ascii="Consolas" w:hAnsi="Consolas"/>
+        </w:rPr>
+        <w:t>CONTINUE: 'continue';</w:t>
+      </w:r>
+    </w:p>
+    <w:p>
+      <w:pPr>
+        <w:pStyle w:val="Code"/>
+        <w:rPr>
+          <w:rFonts w:ascii="Consolas" w:hAnsi="Consolas"/>
+        </w:rPr>
+      </w:pPr>
+      <w:r>
+        <w:rPr>
+          <w:rFonts w:ascii="Consolas" w:hAnsi="Consolas"/>
+        </w:rPr>
+        <w:t>CRATE: 'crate';</w:t>
+      </w:r>
+    </w:p>
+    <w:p>
+      <w:pPr>
+        <w:pStyle w:val="Code"/>
+        <w:rPr>
+          <w:rFonts w:ascii="Consolas" w:hAnsi="Consolas"/>
+        </w:rPr>
+      </w:pPr>
+      <w:r>
+        <w:rPr>
+          <w:rFonts w:ascii="Consolas" w:hAnsi="Consolas"/>
+        </w:rPr>
+        <w:t>DYN: 'dyn';</w:t>
+      </w:r>
+    </w:p>
+    <w:p>
+      <w:pPr>
+        <w:pStyle w:val="Code"/>
+        <w:rPr>
+          <w:rFonts w:ascii="Consolas" w:hAnsi="Consolas"/>
+        </w:rPr>
+      </w:pPr>
+      <w:r>
+        <w:rPr>
+          <w:rFonts w:ascii="Consolas" w:hAnsi="Consolas"/>
+        </w:rPr>
+        <w:t>ELSE: 'else';</w:t>
+      </w:r>
+    </w:p>
+    <w:p>
+      <w:pPr>
+        <w:pStyle w:val="Code"/>
+        <w:rPr>
+          <w:rFonts w:ascii="Consolas" w:hAnsi="Consolas"/>
+        </w:rPr>
+      </w:pPr>
+      <w:r>
+        <w:rPr>
+          <w:rFonts w:ascii="Consolas" w:hAnsi="Consolas"/>
+        </w:rPr>
+        <w:t>ENUM: 'enum';</w:t>
+      </w:r>
+    </w:p>
+    <w:p>
+      <w:pPr>
+        <w:pStyle w:val="Code"/>
+        <w:rPr>
+          <w:rFonts w:ascii="Consolas" w:hAnsi="Consolas"/>
+        </w:rPr>
+      </w:pPr>
+      <w:r>
+        <w:rPr>
+          <w:rFonts w:ascii="Consolas" w:hAnsi="Consolas"/>
+        </w:rPr>
+        <w:t>EXTERN: 'extern';</w:t>
+      </w:r>
+    </w:p>
+    <w:p>
+      <w:pPr>
+        <w:pStyle w:val="Code"/>
+        <w:rPr>
+          <w:rFonts w:ascii="Consolas" w:hAnsi="Consolas"/>
+        </w:rPr>
+      </w:pPr>
+      <w:r>
+        <w:rPr>
+          <w:rFonts w:ascii="Consolas" w:hAnsi="Consolas"/>
+        </w:rPr>
+        <w:t>FALSE: 'false';</w:t>
+      </w:r>
+    </w:p>
+    <w:p>
+      <w:pPr>
+        <w:pStyle w:val="Code"/>
+        <w:rPr>
+          <w:rFonts w:ascii="Consolas" w:hAnsi="Consolas"/>
+        </w:rPr>
+      </w:pPr>
+      <w:r>
+        <w:rPr>
+          <w:rFonts w:ascii="Consolas" w:hAnsi="Consolas"/>
+        </w:rPr>
+        <w:t>FN: 'fn';</w:t>
+      </w:r>
+    </w:p>
+    <w:p>
+      <w:pPr>
+        <w:pStyle w:val="Code"/>
+        <w:rPr>
+          <w:rFonts w:ascii="Consolas" w:hAnsi="Consolas"/>
+        </w:rPr>
+      </w:pPr>
+      <w:r>
+        <w:rPr>
+          <w:rFonts w:ascii="Consolas" w:hAnsi="Consolas"/>
+        </w:rPr>
+        <w:t>FOR: 'for';</w:t>
+      </w:r>
+    </w:p>
+    <w:p>
+      <w:pPr>
+        <w:pStyle w:val="Code"/>
+        <w:rPr>
+          <w:rFonts w:ascii="Consolas" w:hAnsi="Consolas"/>
+        </w:rPr>
+      </w:pPr>
+      <w:r>
+        <w:rPr>
+          <w:rFonts w:ascii="Consolas" w:hAnsi="Consolas"/>
+        </w:rPr>
+        <w:t>IF: 'if';</w:t>
+      </w:r>
+    </w:p>
+    <w:p>
+      <w:pPr>
+        <w:pStyle w:val="Code"/>
+        <w:rPr>
+          <w:rFonts w:ascii="Consolas" w:hAnsi="Consolas"/>
+        </w:rPr>
+      </w:pPr>
+      <w:r>
+        <w:rPr>
+          <w:rFonts w:ascii="Consolas" w:hAnsi="Consolas"/>
+        </w:rPr>
+        <w:t>IMPL: 'impl';</w:t>
+      </w:r>
+    </w:p>
+    <w:p>
+      <w:pPr>
+        <w:pStyle w:val="Code"/>
+        <w:rPr>
+          <w:rFonts w:ascii="Consolas" w:hAnsi="Consolas"/>
+        </w:rPr>
+      </w:pPr>
+      <w:r>
+        <w:rPr>
+          <w:rFonts w:ascii="Consolas" w:hAnsi="Consolas"/>
+        </w:rPr>
+        <w:t>IN: 'in';</w:t>
+      </w:r>
+    </w:p>
+    <w:p>
+      <w:pPr>
+        <w:pStyle w:val="Code"/>
+        <w:rPr>
+          <w:rFonts w:ascii="Consolas" w:hAnsi="Consolas"/>
+        </w:rPr>
+      </w:pPr>
+      <w:r>
+        <w:rPr>
+          <w:rFonts w:ascii="Consolas" w:hAnsi="Consolas"/>
+        </w:rPr>
+        <w:t>LET: 'let';</w:t>
+      </w:r>
+    </w:p>
+    <w:p>
+      <w:pPr>
+        <w:pStyle w:val="Code"/>
+        <w:rPr>
+          <w:rFonts w:ascii="Consolas" w:hAnsi="Consolas"/>
+        </w:rPr>
+      </w:pPr>
+      <w:r>
+        <w:rPr>
+          <w:rFonts w:ascii="Consolas" w:hAnsi="Consolas"/>
+        </w:rPr>
+        <w:t>LOOP: 'loop';</w:t>
+      </w:r>
+    </w:p>
+    <w:p>
+      <w:pPr>
+        <w:pStyle w:val="Code"/>
+        <w:rPr>
+          <w:rFonts w:ascii="Consolas" w:hAnsi="Consolas"/>
+        </w:rPr>
+      </w:pPr>
+      <w:r>
+        <w:rPr>
+          <w:rFonts w:ascii="Consolas" w:hAnsi="Consolas"/>
+        </w:rPr>
+        <w:t>MATCH: 'match';</w:t>
+      </w:r>
+    </w:p>
+    <w:p>
+      <w:pPr>
+        <w:pStyle w:val="Code"/>
+        <w:rPr>
+          <w:rFonts w:ascii="Consolas" w:hAnsi="Consolas"/>
+        </w:rPr>
+      </w:pPr>
+      <w:r>
+        <w:rPr>
+          <w:rFonts w:ascii="Consolas" w:hAnsi="Consolas"/>
+        </w:rPr>
+        <w:t>MOD: 'mod';</w:t>
+      </w:r>
+    </w:p>
+    <w:p>
+      <w:pPr>
+        <w:pStyle w:val="Code"/>
+        <w:rPr>
+          <w:rFonts w:ascii="Consolas" w:hAnsi="Consolas"/>
+        </w:rPr>
+      </w:pPr>
+      <w:r>
+        <w:rPr>
+          <w:rFonts w:ascii="Consolas" w:hAnsi="Consolas"/>
+        </w:rPr>
+        <w:t>MOVE: 'move';</w:t>
+      </w:r>
+    </w:p>
+    <w:p>
+      <w:pPr>
+        <w:pStyle w:val="Code"/>
+        <w:rPr>
+          <w:rFonts w:ascii="Consolas" w:hAnsi="Consolas"/>
+        </w:rPr>
+      </w:pPr>
+      <w:r>
+        <w:rPr>
+          <w:rFonts w:ascii="Consolas" w:hAnsi="Consolas"/>
+        </w:rPr>
+        <w:t>MUT: 'mut';</w:t>
+      </w:r>
+    </w:p>
+    <w:p>
+      <w:pPr>
+        <w:pStyle w:val="Code"/>
+        <w:rPr>
+          <w:rFonts w:ascii="Consolas" w:hAnsi="Consolas"/>
+        </w:rPr>
+      </w:pPr>
+      <w:r>
+        <w:rPr>
+          <w:rFonts w:ascii="Consolas" w:hAnsi="Consolas"/>
+        </w:rPr>
+        <w:t>PUB: 'pub';</w:t>
+      </w:r>
+    </w:p>
+    <w:p>
+      <w:pPr>
+        <w:pStyle w:val="Code"/>
+        <w:rPr>
+          <w:rFonts w:ascii="Consolas" w:hAnsi="Consolas"/>
+        </w:rPr>
+      </w:pPr>
+      <w:r>
+        <w:rPr>
+          <w:rFonts w:ascii="Consolas" w:hAnsi="Consolas"/>
+        </w:rPr>
+        <w:t>REF: 'ref';</w:t>
+      </w:r>
+    </w:p>
+    <w:p>
+      <w:pPr>
+        <w:pStyle w:val="Code"/>
+        <w:rPr>
+          <w:rFonts w:ascii="Consolas" w:hAnsi="Consolas"/>
+        </w:rPr>
+      </w:pPr>
+      <w:r>
+        <w:rPr>
+          <w:rFonts w:ascii="Consolas" w:hAnsi="Consolas"/>
+        </w:rPr>
+        <w:t>RETURN: 'return';</w:t>
+      </w:r>
+    </w:p>
+    <w:p>
+      <w:pPr>
+        <w:pStyle w:val="Code"/>
+        <w:rPr>
+          <w:rFonts w:ascii="Consolas" w:hAnsi="Consolas"/>
+        </w:rPr>
+      </w:pPr>
+      <w:r>
+        <w:rPr>
+          <w:rFonts w:ascii="Consolas" w:hAnsi="Consolas"/>
+        </w:rPr>
+        <w:t>SELF: 'self';</w:t>
+      </w:r>
+    </w:p>
+    <w:p>
+      <w:pPr>
+        <w:pStyle w:val="Code"/>
+        <w:rPr>
+          <w:rFonts w:ascii="Consolas" w:hAnsi="Consolas"/>
+        </w:rPr>
+      </w:pPr>
+      <w:r>
+        <w:rPr>
+          <w:rFonts w:ascii="Consolas" w:hAnsi="Consolas"/>
+        </w:rPr>
+        <w:t>STATIC: 'static';</w:t>
+      </w:r>
+    </w:p>
+    <w:p>
+      <w:pPr>
+        <w:pStyle w:val="Code"/>
+        <w:rPr>
+          <w:rFonts w:ascii="Consolas" w:hAnsi="Consolas"/>
+        </w:rPr>
+      </w:pPr>
+      <w:r>
+        <w:rPr>
+          <w:rFonts w:ascii="Consolas" w:hAnsi="Consolas"/>
+        </w:rPr>
+        <w:t>STRUCT: 'struct';</w:t>
+      </w:r>
+    </w:p>
+    <w:p>
+      <w:pPr>
+        <w:pStyle w:val="Code"/>
+        <w:rPr>
+          <w:rFonts w:ascii="Consolas" w:hAnsi="Consolas"/>
+        </w:rPr>
+      </w:pPr>
+      <w:r>
+        <w:rPr>
+          <w:rFonts w:ascii="Consolas" w:hAnsi="Consolas"/>
+        </w:rPr>
+        <w:t>SUPER: 'super';</w:t>
+      </w:r>
+    </w:p>
+    <w:p>
+      <w:pPr>
+        <w:pStyle w:val="Code"/>
+        <w:rPr>
+          <w:rFonts w:ascii="Consolas" w:hAnsi="Consolas"/>
+        </w:rPr>
+      </w:pPr>
+      <w:r>
+        <w:rPr>
+          <w:rFonts w:ascii="Consolas" w:hAnsi="Consolas"/>
+        </w:rPr>
+        <w:t>TRAIT: 'trait';</w:t>
+      </w:r>
+    </w:p>
+    <w:p>
+      <w:pPr>
+        <w:pStyle w:val="Code"/>
+        <w:rPr>
+          <w:rFonts w:ascii="Consolas" w:hAnsi="Consolas"/>
+        </w:rPr>
+      </w:pPr>
+      <w:r>
+        <w:rPr>
+          <w:rFonts w:ascii="Consolas" w:hAnsi="Consolas"/>
+        </w:rPr>
+        <w:t>TRUE: 'true';</w:t>
+      </w:r>
+    </w:p>
+    <w:p>
+      <w:pPr>
+        <w:pStyle w:val="Code"/>
+        <w:rPr>
+          <w:rFonts w:ascii="Consolas" w:hAnsi="Consolas"/>
+        </w:rPr>
+      </w:pPr>
+      <w:r>
+        <w:rPr>
+          <w:rFonts w:ascii="Consolas" w:hAnsi="Consolas"/>
+        </w:rPr>
+        <w:t>TYPE: 'type';</w:t>
+      </w:r>
+    </w:p>
+    <w:p>
+      <w:pPr>
+        <w:pStyle w:val="Code"/>
+        <w:rPr>
+          <w:rFonts w:ascii="Consolas" w:hAnsi="Consolas"/>
+        </w:rPr>
+      </w:pPr>
+      <w:r>
+        <w:rPr>
+          <w:rFonts w:ascii="Consolas" w:hAnsi="Consolas"/>
+        </w:rPr>
+        <w:t>USE: 'use';</w:t>
+      </w:r>
+    </w:p>
+    <w:p>
+      <w:pPr>
+        <w:pStyle w:val="Code"/>
+        <w:rPr>
+          <w:rFonts w:ascii="Consolas" w:hAnsi="Consolas"/>
+        </w:rPr>
+      </w:pPr>
+      <w:r>
+        <w:rPr>
+          <w:rFonts w:ascii="Consolas" w:hAnsi="Consolas"/>
+        </w:rPr>
+        <w:t>WHERE: 'where';</w:t>
+      </w:r>
+    </w:p>
+    <w:p>
+      <w:pPr>
+        <w:pStyle w:val="Code"/>
+        <w:rPr>
+          <w:rFonts w:ascii="Consolas" w:hAnsi="Consolas"/>
+        </w:rPr>
+      </w:pPr>
+      <w:r>
+        <w:rPr>
+          <w:rFonts w:ascii="Consolas" w:hAnsi="Consolas"/>
+        </w:rPr>
+        <w:t>WHILE: 'while';</w:t>
+      </w:r>
+    </w:p>
+    <w:p>
+      <w:pPr>
+        <w:pStyle w:val="Code"/>
+        <w:rPr>
+          <w:rFonts w:ascii="Consolas" w:hAnsi="Consolas"/>
+        </w:rPr>
+      </w:pPr>
+      <w:r>
+        <w:rPr>
+          <w:rFonts w:ascii="Consolas" w:hAnsi="Consolas"/>
+        </w:rPr>
+      </w:r>
+    </w:p>
+    <w:p>
+      <w:pPr>
+        <w:pStyle w:val="Code"/>
+        <w:rPr>
+          <w:rFonts w:ascii="Consolas" w:hAnsi="Consolas"/>
+        </w:rPr>
+      </w:pPr>
+      <w:r>
+        <w:rPr>
+          <w:rFonts w:ascii="Consolas" w:hAnsi="Consolas"/>
+        </w:rPr>
+        <w:t>// Literals and identifiers</w:t>
+      </w:r>
+    </w:p>
+    <w:p>
+      <w:pPr>
+        <w:pStyle w:val="Code"/>
+        <w:rPr>
+          <w:rFonts w:ascii="Consolas" w:hAnsi="Consolas"/>
+        </w:rPr>
+      </w:pPr>
+      <w:r>
+        <w:rPr>
+          <w:rFonts w:ascii="Consolas" w:hAnsi="Consolas"/>
+        </w:rPr>
+        <w:t>BOOL_LIT: 'true' | 'false';</w:t>
+      </w:r>
+    </w:p>
+    <w:p>
+      <w:pPr>
+        <w:pStyle w:val="Code"/>
+        <w:rPr>
+          <w:rFonts w:ascii="Consolas" w:hAnsi="Consolas"/>
+        </w:rPr>
+      </w:pPr>
+      <w:r>
+        <w:rPr>
+          <w:rFonts w:ascii="Consolas" w:hAnsi="Consolas"/>
+        </w:rPr>
+        <w:t>INT_LIT: [0-9]+;</w:t>
+      </w:r>
+    </w:p>
+    <w:p>
+      <w:pPr>
+        <w:pStyle w:val="Code"/>
+        <w:rPr>
+          <w:rFonts w:ascii="Consolas" w:hAnsi="Consolas"/>
+        </w:rPr>
+      </w:pPr>
+      <w:r>
+        <w:rPr>
+          <w:rFonts w:ascii="Consolas" w:hAnsi="Consolas"/>
+        </w:rPr>
+        <w:t>FLOAT_LIT: [0-9]+ '.' [0-9]+ | '.' [0-9]+;</w:t>
+      </w:r>
+    </w:p>
+    <w:p>
+      <w:pPr>
+        <w:pStyle w:val="Code"/>
+        <w:rPr>
+          <w:rFonts w:ascii="Consolas" w:hAnsi="Consolas"/>
+        </w:rPr>
+      </w:pPr>
+      <w:r>
+        <w:rPr>
+          <w:rFonts w:ascii="Consolas" w:hAnsi="Consolas"/>
+        </w:rPr>
+        <w:t>STRING_LIT: '"' (~["\\] | '\\' .)* '"';</w:t>
+      </w:r>
+    </w:p>
+    <w:p>
+      <w:pPr>
+        <w:pStyle w:val="Code"/>
+        <w:rPr>
+          <w:rFonts w:ascii="Consolas" w:hAnsi="Consolas"/>
+        </w:rPr>
+      </w:pPr>
+      <w:r>
+        <w:rPr>
+          <w:rFonts w:ascii="Consolas" w:hAnsi="Consolas"/>
+        </w:rPr>
+        <w:t>ID: [a-zA-Z_] [a-zA-Z0-9_]*;</w:t>
+      </w:r>
+    </w:p>
+    <w:p>
+      <w:pPr>
+        <w:pStyle w:val="Code"/>
+        <w:rPr>
+          <w:rFonts w:ascii="Consolas" w:hAnsi="Consolas"/>
+        </w:rPr>
+      </w:pPr>
+      <w:r>
+        <w:rPr>
+          <w:rFonts w:ascii="Consolas" w:hAnsi="Consolas"/>
+        </w:rPr>
+      </w:r>
+    </w:p>
+    <w:p>
+      <w:pPr>
+        <w:pStyle w:val="Code"/>
+        <w:rPr>
+          <w:rFonts w:ascii="Consolas" w:hAnsi="Consolas"/>
+        </w:rPr>
+      </w:pPr>
+      <w:r>
+        <w:rPr>
+          <w:rFonts w:ascii="Consolas" w:hAnsi="Consolas"/>
+        </w:rPr>
+        <w:t>// Data types</w:t>
+      </w:r>
+    </w:p>
+    <w:p>
+      <w:pPr>
+        <w:pStyle w:val="Code"/>
+        <w:rPr>
+          <w:rFonts w:ascii="Consolas" w:hAnsi="Consolas"/>
+        </w:rPr>
+      </w:pPr>
+      <w:r>
+        <w:rPr>
+          <w:rFonts w:ascii="Consolas" w:hAnsi="Consolas"/>
+        </w:rPr>
+        <w:t>INTEGER: 'i8' | 'i16' | 'i32' | 'i64' | 'i128' | 'isize';</w:t>
+      </w:r>
+    </w:p>
+    <w:p>
+      <w:pPr>
+        <w:pStyle w:val="Code"/>
+        <w:rPr>
+          <w:rFonts w:ascii="Consolas" w:hAnsi="Consolas"/>
+        </w:rPr>
+      </w:pPr>
+      <w:r>
+        <w:rPr>
+          <w:rFonts w:ascii="Consolas" w:hAnsi="Consolas"/>
+        </w:rPr>
+        <w:t>UNSIGNED_INTEGER: 'u8' | 'u16' | 'u32' | 'u64' | 'u128' | 'usize';</w:t>
+      </w:r>
+    </w:p>
+    <w:p>
+      <w:pPr>
+        <w:pStyle w:val="Code"/>
+        <w:rPr>
+          <w:rFonts w:ascii="Consolas" w:hAnsi="Consolas"/>
+        </w:rPr>
+      </w:pPr>
+      <w:r>
+        <w:rPr>
+          <w:rFonts w:ascii="Consolas" w:hAnsi="Consolas"/>
+        </w:rPr>
+        <w:t>FLOAT: 'f32' | 'f64';</w:t>
+      </w:r>
+    </w:p>
+    <w:p>
+      <w:pPr>
+        <w:pStyle w:val="Code"/>
+        <w:rPr>
+          <w:rFonts w:ascii="Consolas" w:hAnsi="Consolas"/>
+        </w:rPr>
+      </w:pPr>
+      <w:r>
+        <w:rPr>
+          <w:rFonts w:ascii="Consolas" w:hAnsi="Consolas"/>
+        </w:rPr>
+        <w:t>BOOL: 'bool';</w:t>
+      </w:r>
+    </w:p>
+    <w:p>
+      <w:pPr>
+        <w:pStyle w:val="Code"/>
+        <w:rPr>
+          <w:rFonts w:ascii="Consolas" w:hAnsi="Consolas"/>
+        </w:rPr>
+      </w:pPr>
+      <w:r>
+        <w:rPr>
+          <w:rFonts w:ascii="Consolas" w:hAnsi="Consolas"/>
+        </w:rPr>
+        <w:t>CHAR: 'char';</w:t>
+      </w:r>
+    </w:p>
+    <w:p>
+      <w:pPr>
+        <w:pStyle w:val="Code"/>
+        <w:rPr>
+          <w:rFonts w:ascii="Consolas" w:hAnsi="Consolas"/>
+        </w:rPr>
+      </w:pPr>
+      <w:r>
+        <w:rPr>
+          <w:rFonts w:ascii="Consolas" w:hAnsi="Consolas"/>
+        </w:rPr>
+        <w:t>STRING: 'str' | 'String';</w:t>
+      </w:r>
+    </w:p>
+    <w:p>
+      <w:pPr>
+        <w:pStyle w:val="Code"/>
+        <w:rPr>
+          <w:rFonts w:ascii="Consolas" w:hAnsi="Consolas"/>
+        </w:rPr>
+      </w:pPr>
+      <w:r>
+        <w:rPr>
+          <w:rFonts w:ascii="Consolas" w:hAnsi="Consolas"/>
+        </w:rPr>
+      </w:r>
+    </w:p>
+    <w:p>
+      <w:pPr>
+        <w:pStyle w:val="Code"/>
+        <w:rPr>
+          <w:rFonts w:ascii="Consolas" w:hAnsi="Consolas"/>
+        </w:rPr>
+      </w:pPr>
+      <w:r>
+        <w:rPr>
+          <w:rFonts w:ascii="Consolas" w:hAnsi="Consolas"/>
+        </w:rPr>
+        <w:t>// Brackets</w:t>
+      </w:r>
+    </w:p>
+    <w:p>
+      <w:pPr>
+        <w:pStyle w:val="Code"/>
+        <w:rPr>
+          <w:rFonts w:ascii="Consolas" w:hAnsi="Consolas"/>
+        </w:rPr>
+      </w:pPr>
+      <w:r>
+        <w:rPr>
+          <w:rFonts w:ascii="Consolas" w:hAnsi="Consolas"/>
+        </w:rPr>
+        <w:t>LEFT_CURLY_BRACE: '{';</w:t>
+      </w:r>
+    </w:p>
+    <w:p>
+      <w:pPr>
+        <w:pStyle w:val="Code"/>
+        <w:rPr>
+          <w:rFonts w:ascii="Consolas" w:hAnsi="Consolas"/>
+        </w:rPr>
+      </w:pPr>
+      <w:r>
+        <w:rPr>
+          <w:rFonts w:ascii="Consolas" w:hAnsi="Consolas"/>
+        </w:rPr>
+        <w:t>RIGHT_CURLY_BRACE: '}';</w:t>
+      </w:r>
+    </w:p>
+    <w:p>
+      <w:pPr>
+        <w:pStyle w:val="Code"/>
+        <w:rPr>
+          <w:rFonts w:ascii="Consolas" w:hAnsi="Consolas"/>
+        </w:rPr>
+      </w:pPr>
+      <w:r>
+        <w:rPr>
+          <w:rFonts w:ascii="Consolas" w:hAnsi="Consolas"/>
+        </w:rPr>
+        <w:t>LEFT_SQUARE_BRACE: '[';</w:t>
+      </w:r>
+    </w:p>
+    <w:p>
+      <w:pPr>
+        <w:pStyle w:val="Code"/>
+        <w:rPr>
+          <w:rFonts w:ascii="Consolas" w:hAnsi="Consolas"/>
+        </w:rPr>
+      </w:pPr>
+      <w:r>
+        <w:rPr>
+          <w:rFonts w:ascii="Consolas" w:hAnsi="Consolas"/>
+        </w:rPr>
+        <w:t>RIGHT_SQUARE_BRACE: ']';</w:t>
+      </w:r>
+    </w:p>
+    <w:p>
+      <w:pPr>
+        <w:pStyle w:val="Code"/>
+        <w:rPr>
+          <w:rFonts w:ascii="Consolas" w:hAnsi="Consolas"/>
+        </w:rPr>
+      </w:pPr>
+      <w:r>
+        <w:rPr>
+          <w:rFonts w:ascii="Consolas" w:hAnsi="Consolas"/>
+        </w:rPr>
+        <w:t>LEFT_PARANTHESIS: '(';</w:t>
+      </w:r>
+    </w:p>
+    <w:p>
+      <w:pPr>
+        <w:pStyle w:val="Code"/>
+        <w:rPr>
+          <w:rFonts w:ascii="Consolas" w:hAnsi="Consolas"/>
+        </w:rPr>
+      </w:pPr>
+      <w:r>
+        <w:rPr>
+          <w:rFonts w:ascii="Consolas" w:hAnsi="Consolas"/>
+        </w:rPr>
+        <w:t>RIGHT_PARANTHESIS: ')';</w:t>
+      </w:r>
+    </w:p>
+    <w:p>
+      <w:pPr>
+        <w:pStyle w:val="Code"/>
+        <w:rPr>
+          <w:rFonts w:ascii="Consolas" w:hAnsi="Consolas"/>
+        </w:rPr>
+      </w:pPr>
+      <w:r>
+        <w:rPr>
+          <w:rFonts w:ascii="Consolas" w:hAnsi="Consolas"/>
+        </w:rPr>
+      </w:r>
+    </w:p>
+    <w:p>
+      <w:pPr>
+        <w:pStyle w:val="Code"/>
+        <w:rPr>
+          <w:rFonts w:ascii="Consolas" w:hAnsi="Consolas"/>
+        </w:rPr>
+      </w:pPr>
+      <w:r>
+        <w:rPr>
+          <w:rFonts w:ascii="Consolas" w:hAnsi="Consolas"/>
+        </w:rPr>
+        <w:t>// Symbols</w:t>
+      </w:r>
+    </w:p>
+    <w:p>
+      <w:pPr>
+        <w:pStyle w:val="Code"/>
+        <w:rPr>
+          <w:rFonts w:ascii="Consolas" w:hAnsi="Consolas"/>
+        </w:rPr>
+      </w:pPr>
+      <w:r>
+        <w:rPr>
+          <w:rFonts w:ascii="Consolas" w:hAnsi="Consolas"/>
+        </w:rPr>
+        <w:t>EXCLAMATION: '!';</w:t>
+      </w:r>
+    </w:p>
+    <w:p>
+      <w:pPr>
+        <w:pStyle w:val="Code"/>
+        <w:rPr>
+          <w:rFonts w:ascii="Consolas" w:hAnsi="Consolas"/>
+        </w:rPr>
+      </w:pPr>
+      <w:r>
+        <w:rPr>
+          <w:rFonts w:ascii="Consolas" w:hAnsi="Consolas"/>
+        </w:rPr>
+        <w:t>EXCLAMATORY_EQUAL: '!=';</w:t>
+      </w:r>
+    </w:p>
+    <w:p>
+      <w:pPr>
+        <w:pStyle w:val="Code"/>
+        <w:rPr>
+          <w:rFonts w:ascii="Consolas" w:hAnsi="Consolas"/>
+        </w:rPr>
+      </w:pPr>
+      <w:r>
+        <w:rPr>
+          <w:rFonts w:ascii="Consolas" w:hAnsi="Consolas"/>
+        </w:rPr>
+        <w:t>PERCENT: '%';</w:t>
+      </w:r>
+    </w:p>
+    <w:p>
+      <w:pPr>
+        <w:pStyle w:val="Code"/>
+        <w:rPr>
+          <w:rFonts w:ascii="Consolas" w:hAnsi="Consolas"/>
+        </w:rPr>
+      </w:pPr>
+      <w:r>
+        <w:rPr>
+          <w:rFonts w:ascii="Consolas" w:hAnsi="Consolas"/>
+        </w:rPr>
+        <w:t>AMPERSAND: '&amp;';</w:t>
+      </w:r>
+    </w:p>
+    <w:p>
+      <w:pPr>
+        <w:pStyle w:val="Code"/>
+        <w:rPr>
+          <w:rFonts w:ascii="Consolas" w:hAnsi="Consolas"/>
+        </w:rPr>
+      </w:pPr>
+      <w:r>
+        <w:rPr>
+          <w:rFonts w:ascii="Consolas" w:hAnsi="Consolas"/>
+        </w:rPr>
+        <w:t>AMPERSAND_EQUAL: '&amp;=';</w:t>
+      </w:r>
+    </w:p>
+    <w:p>
+      <w:pPr>
+        <w:pStyle w:val="Code"/>
+        <w:rPr>
+          <w:rFonts w:ascii="Consolas" w:hAnsi="Consolas"/>
+        </w:rPr>
+      </w:pPr>
+      <w:r>
+        <w:rPr>
+          <w:rFonts w:ascii="Consolas" w:hAnsi="Consolas"/>
+        </w:rPr>
+        <w:t>AMPERSAND_AMPERSAND: '&amp;&amp;';</w:t>
+      </w:r>
+    </w:p>
+    <w:p>
+      <w:pPr>
+        <w:pStyle w:val="Code"/>
+        <w:rPr>
+          <w:rFonts w:ascii="Consolas" w:hAnsi="Consolas"/>
+        </w:rPr>
+      </w:pPr>
+      <w:r>
+        <w:rPr>
+          <w:rFonts w:ascii="Consolas" w:hAnsi="Consolas"/>
+        </w:rPr>
+        <w:t>STAR: '*';</w:t>
+      </w:r>
+    </w:p>
+    <w:p>
+      <w:pPr>
+        <w:pStyle w:val="Code"/>
+        <w:rPr>
+          <w:rFonts w:ascii="Consolas" w:hAnsi="Consolas"/>
+        </w:rPr>
+      </w:pPr>
+      <w:r>
+        <w:rPr>
+          <w:rFonts w:ascii="Consolas" w:hAnsi="Consolas"/>
+        </w:rPr>
+        <w:t>STAR_EQUAL: '*=';</w:t>
+      </w:r>
+    </w:p>
+    <w:p>
+      <w:pPr>
+        <w:pStyle w:val="Code"/>
+        <w:rPr>
+          <w:rFonts w:ascii="Consolas" w:hAnsi="Consolas"/>
+        </w:rPr>
+      </w:pPr>
+      <w:r>
+        <w:rPr>
+          <w:rFonts w:ascii="Consolas" w:hAnsi="Consolas"/>
+        </w:rPr>
+        <w:t>PLUS: '+';</w:t>
+      </w:r>
+    </w:p>
+    <w:p>
+      <w:pPr>
+        <w:pStyle w:val="Code"/>
+        <w:rPr>
+          <w:rFonts w:ascii="Consolas" w:hAnsi="Consolas"/>
+        </w:rPr>
+      </w:pPr>
+      <w:r>
+        <w:rPr>
+          <w:rFonts w:ascii="Consolas" w:hAnsi="Consolas"/>
+        </w:rPr>
+        <w:t>PLUS_EQUAL: '+=';</w:t>
+      </w:r>
+    </w:p>
+    <w:p>
+      <w:pPr>
+        <w:pStyle w:val="Code"/>
+        <w:rPr>
+          <w:rFonts w:ascii="Consolas" w:hAnsi="Consolas"/>
+        </w:rPr>
+      </w:pPr>
+      <w:r>
+        <w:rPr>
+          <w:rFonts w:ascii="Consolas" w:hAnsi="Consolas"/>
+        </w:rPr>
+        <w:t>COMMA: ',';</w:t>
+      </w:r>
+    </w:p>
+    <w:p>
+      <w:pPr>
+        <w:pStyle w:val="Code"/>
+        <w:rPr>
+          <w:rFonts w:ascii="Consolas" w:hAnsi="Consolas"/>
+        </w:rPr>
+      </w:pPr>
+      <w:r>
+        <w:rPr>
+          <w:rFonts w:ascii="Consolas" w:hAnsi="Consolas"/>
+        </w:rPr>
+        <w:t>DASH: '-';</w:t>
+      </w:r>
+    </w:p>
+    <w:p>
+      <w:pPr>
+        <w:pStyle w:val="Code"/>
+        <w:rPr>
+          <w:rFonts w:ascii="Consolas" w:hAnsi="Consolas"/>
+        </w:rPr>
+      </w:pPr>
+      <w:r>
+        <w:rPr>
+          <w:rFonts w:ascii="Consolas" w:hAnsi="Consolas"/>
+        </w:rPr>
+        <w:t>DASH_EQUAL: '-=';</w:t>
+      </w:r>
+    </w:p>
+    <w:p>
+      <w:pPr>
+        <w:pStyle w:val="Code"/>
+        <w:rPr>
+          <w:rFonts w:ascii="Consolas" w:hAnsi="Consolas"/>
+        </w:rPr>
+      </w:pPr>
+      <w:r>
+        <w:rPr>
+          <w:rFonts w:ascii="Consolas" w:hAnsi="Consolas"/>
+        </w:rPr>
+        <w:t>RIGHT_ARROW: '-&gt;';</w:t>
+      </w:r>
+    </w:p>
+    <w:p>
+      <w:pPr>
+        <w:pStyle w:val="Code"/>
+        <w:rPr>
+          <w:rFonts w:ascii="Consolas" w:hAnsi="Consolas"/>
+        </w:rPr>
+      </w:pPr>
+      <w:r>
+        <w:rPr>
+          <w:rFonts w:ascii="Consolas" w:hAnsi="Consolas"/>
+        </w:rPr>
+        <w:t>DOT: '.';</w:t>
+      </w:r>
+    </w:p>
+    <w:p>
+      <w:pPr>
+        <w:pStyle w:val="Code"/>
+        <w:rPr>
+          <w:rFonts w:ascii="Consolas" w:hAnsi="Consolas"/>
+        </w:rPr>
+      </w:pPr>
+      <w:r>
+        <w:rPr>
+          <w:rFonts w:ascii="Consolas" w:hAnsi="Consolas"/>
+        </w:rPr>
+        <w:t>DOT_DOT: '..';</w:t>
+      </w:r>
+    </w:p>
+    <w:p>
+      <w:pPr>
+        <w:pStyle w:val="Code"/>
+        <w:rPr>
+          <w:rFonts w:ascii="Consolas" w:hAnsi="Consolas"/>
+        </w:rPr>
+      </w:pPr>
+      <w:r>
+        <w:rPr>
+          <w:rFonts w:ascii="Consolas" w:hAnsi="Consolas"/>
+        </w:rPr>
+        <w:t>DOT_DOT_EQUAL: '..=';</w:t>
+      </w:r>
+    </w:p>
+    <w:p>
+      <w:pPr>
+        <w:pStyle w:val="Code"/>
+        <w:rPr>
+          <w:rFonts w:ascii="Consolas" w:hAnsi="Consolas"/>
+        </w:rPr>
+      </w:pPr>
+      <w:r>
+        <w:rPr>
+          <w:rFonts w:ascii="Consolas" w:hAnsi="Consolas"/>
+        </w:rPr>
+        <w:t>DOT_DOT_DOT: '...';</w:t>
+      </w:r>
+    </w:p>
+    <w:p>
+      <w:pPr>
+        <w:pStyle w:val="Code"/>
+        <w:rPr>
+          <w:rFonts w:ascii="Consolas" w:hAnsi="Consolas"/>
+        </w:rPr>
+      </w:pPr>
+      <w:r>
+        <w:rPr>
+          <w:rFonts w:ascii="Consolas" w:hAnsi="Consolas"/>
+        </w:rPr>
+        <w:t>SLASH: '/';</w:t>
+      </w:r>
+    </w:p>
+    <w:p>
+      <w:pPr>
+        <w:pStyle w:val="Code"/>
+        <w:rPr>
+          <w:rFonts w:ascii="Consolas" w:hAnsi="Consolas"/>
+        </w:rPr>
+      </w:pPr>
+      <w:r>
+        <w:rPr>
+          <w:rFonts w:ascii="Consolas" w:hAnsi="Consolas"/>
+        </w:rPr>
+        <w:t>SLASH_EQUAL: '/=';</w:t>
+      </w:r>
+    </w:p>
+    <w:p>
+      <w:pPr>
+        <w:pStyle w:val="Code"/>
+        <w:rPr>
+          <w:rFonts w:ascii="Consolas" w:hAnsi="Consolas"/>
+        </w:rPr>
+      </w:pPr>
+      <w:r>
+        <w:rPr>
+          <w:rFonts w:ascii="Consolas" w:hAnsi="Consolas"/>
+        </w:rPr>
+        <w:t>COLON: ':';</w:t>
+      </w:r>
+    </w:p>
+    <w:p>
+      <w:pPr>
+        <w:pStyle w:val="Code"/>
+        <w:rPr>
+          <w:rFonts w:ascii="Consolas" w:hAnsi="Consolas"/>
+        </w:rPr>
+      </w:pPr>
+      <w:r>
+        <w:rPr>
+          <w:rFonts w:ascii="Consolas" w:hAnsi="Consolas"/>
+        </w:rPr>
+        <w:t>SEMICOLON: ';';</w:t>
+      </w:r>
+    </w:p>
+    <w:p>
+      <w:pPr>
+        <w:pStyle w:val="Code"/>
+        <w:rPr>
+          <w:rFonts w:ascii="Consolas" w:hAnsi="Consolas"/>
+        </w:rPr>
+      </w:pPr>
+      <w:r>
+        <w:rPr>
+          <w:rFonts w:ascii="Consolas" w:hAnsi="Consolas"/>
+        </w:rPr>
+        <w:t>LEFT_LEFT: '&lt;&lt;';</w:t>
+      </w:r>
+    </w:p>
+    <w:p>
+      <w:pPr>
+        <w:pStyle w:val="Code"/>
+        <w:rPr>
+          <w:rFonts w:ascii="Consolas" w:hAnsi="Consolas"/>
+        </w:rPr>
+      </w:pPr>
+      <w:r>
+        <w:rPr>
+          <w:rFonts w:ascii="Consolas" w:hAnsi="Consolas"/>
+        </w:rPr>
+        <w:t>LEFT_LEFT_EQUAL: '&lt;&lt;=';</w:t>
+      </w:r>
+    </w:p>
+    <w:p>
+      <w:pPr>
+        <w:pStyle w:val="Code"/>
+        <w:rPr>
+          <w:rFonts w:ascii="Consolas" w:hAnsi="Consolas"/>
+        </w:rPr>
+      </w:pPr>
+      <w:r>
+        <w:rPr>
+          <w:rFonts w:ascii="Consolas" w:hAnsi="Consolas"/>
+        </w:rPr>
+        <w:t>LEFT: '&lt;';</w:t>
+      </w:r>
+    </w:p>
+    <w:p>
+      <w:pPr>
+        <w:pStyle w:val="Code"/>
+        <w:rPr>
+          <w:rFonts w:ascii="Consolas" w:hAnsi="Consolas"/>
+        </w:rPr>
+      </w:pPr>
+      <w:r>
+        <w:rPr>
+          <w:rFonts w:ascii="Consolas" w:hAnsi="Consolas"/>
+        </w:rPr>
+        <w:t>LEFT_EQUAL: '&lt;=';</w:t>
+      </w:r>
+    </w:p>
+    <w:p>
+      <w:pPr>
+        <w:pStyle w:val="Code"/>
+        <w:rPr>
+          <w:rFonts w:ascii="Consolas" w:hAnsi="Consolas"/>
+        </w:rPr>
+      </w:pPr>
+      <w:r>
+        <w:rPr>
+          <w:rFonts w:ascii="Consolas" w:hAnsi="Consolas"/>
+        </w:rPr>
+        <w:t>EQUAL: '=';</w:t>
+      </w:r>
+    </w:p>
+    <w:p>
+      <w:pPr>
+        <w:pStyle w:val="Code"/>
+        <w:rPr>
+          <w:rFonts w:ascii="Consolas" w:hAnsi="Consolas"/>
+        </w:rPr>
+      </w:pPr>
+      <w:r>
+        <w:rPr>
+          <w:rFonts w:ascii="Consolas" w:hAnsi="Consolas"/>
+        </w:rPr>
+        <w:t>EQUAL_EQUAL: '==';</w:t>
+      </w:r>
+    </w:p>
+    <w:p>
+      <w:pPr>
+        <w:pStyle w:val="Code"/>
+        <w:rPr>
+          <w:rFonts w:ascii="Consolas" w:hAnsi="Consolas"/>
+        </w:rPr>
+      </w:pPr>
+      <w:r>
+        <w:rPr>
+          <w:rFonts w:ascii="Consolas" w:hAnsi="Consolas"/>
+        </w:rPr>
+        <w:t>RIGHT_ARROW_BIG: '=&gt;';</w:t>
+      </w:r>
+    </w:p>
+    <w:p>
+      <w:pPr>
+        <w:pStyle w:val="Code"/>
+        <w:rPr>
+          <w:rFonts w:ascii="Consolas" w:hAnsi="Consolas"/>
+        </w:rPr>
+      </w:pPr>
+      <w:r>
+        <w:rPr>
+          <w:rFonts w:ascii="Consolas" w:hAnsi="Consolas"/>
+        </w:rPr>
+        <w:t>RIGHT: '&gt;';</w:t>
+      </w:r>
+    </w:p>
+    <w:p>
+      <w:pPr>
+        <w:pStyle w:val="Code"/>
+        <w:rPr>
+          <w:rFonts w:ascii="Consolas" w:hAnsi="Consolas"/>
+        </w:rPr>
+      </w:pPr>
+      <w:r>
+        <w:rPr>
+          <w:rFonts w:ascii="Consolas" w:hAnsi="Consolas"/>
+        </w:rPr>
+        <w:t>RIGHT_EQUAL: '&gt;=';</w:t>
+      </w:r>
+    </w:p>
+    <w:p>
+      <w:pPr>
+        <w:pStyle w:val="Code"/>
+        <w:rPr>
+          <w:rFonts w:ascii="Consolas" w:hAnsi="Consolas"/>
+        </w:rPr>
+      </w:pPr>
+      <w:r>
+        <w:rPr>
+          <w:rFonts w:ascii="Consolas" w:hAnsi="Consolas"/>
+        </w:rPr>
+        <w:t>RIGHT_RIGHT: '&gt;&gt;';</w:t>
+      </w:r>
+    </w:p>
+    <w:p>
+      <w:pPr>
+        <w:pStyle w:val="Code"/>
+        <w:rPr>
+          <w:rFonts w:ascii="Consolas" w:hAnsi="Consolas"/>
+        </w:rPr>
+      </w:pPr>
+      <w:r>
+        <w:rPr>
+          <w:rFonts w:ascii="Consolas" w:hAnsi="Consolas"/>
+        </w:rPr>
+        <w:t>RIGHT_RIGHT_EQUAL: '&gt;&gt;=';</w:t>
+      </w:r>
+    </w:p>
+    <w:p>
+      <w:pPr>
+        <w:pStyle w:val="Code"/>
+        <w:rPr>
+          <w:rFonts w:ascii="Consolas" w:hAnsi="Consolas"/>
+        </w:rPr>
+      </w:pPr>
+      <w:r>
+        <w:rPr>
+          <w:rFonts w:ascii="Consolas" w:hAnsi="Consolas"/>
+        </w:rPr>
+        <w:t>AT: '@';</w:t>
+      </w:r>
+    </w:p>
+    <w:p>
+      <w:pPr>
+        <w:pStyle w:val="Code"/>
+        <w:rPr>
+          <w:rFonts w:ascii="Consolas" w:hAnsi="Consolas"/>
+        </w:rPr>
+      </w:pPr>
+      <w:r>
+        <w:rPr>
+          <w:rFonts w:ascii="Consolas" w:hAnsi="Consolas"/>
+        </w:rPr>
+        <w:t>CARET: '^';</w:t>
+      </w:r>
+    </w:p>
+    <w:p>
+      <w:pPr>
+        <w:pStyle w:val="Code"/>
+        <w:rPr>
+          <w:rFonts w:ascii="Consolas" w:hAnsi="Consolas"/>
+        </w:rPr>
+      </w:pPr>
+      <w:r>
+        <w:rPr>
+          <w:rFonts w:ascii="Consolas" w:hAnsi="Consolas"/>
+        </w:rPr>
+        <w:t>CARET_EQUAL: '^=';</w:t>
+      </w:r>
+    </w:p>
+    <w:p>
+      <w:pPr>
+        <w:pStyle w:val="Code"/>
+        <w:rPr>
+          <w:rFonts w:ascii="Consolas" w:hAnsi="Consolas"/>
+        </w:rPr>
+      </w:pPr>
+      <w:r>
+        <w:rPr>
+          <w:rFonts w:ascii="Consolas" w:hAnsi="Consolas"/>
+        </w:rPr>
+        <w:t>PIPE: '|';</w:t>
+      </w:r>
+    </w:p>
+    <w:p>
+      <w:pPr>
+        <w:pStyle w:val="Code"/>
+        <w:rPr>
+          <w:rFonts w:ascii="Consolas" w:hAnsi="Consolas"/>
+        </w:rPr>
+      </w:pPr>
+      <w:r>
+        <w:rPr>
+          <w:rFonts w:ascii="Consolas" w:hAnsi="Consolas"/>
+        </w:rPr>
+        <w:t>PIPE_EQUAL: '|=';</w:t>
+      </w:r>
+    </w:p>
+    <w:p>
+      <w:pPr>
+        <w:pStyle w:val="Code"/>
+        <w:rPr>
+          <w:rFonts w:ascii="Consolas" w:hAnsi="Consolas"/>
+        </w:rPr>
+      </w:pPr>
+      <w:r>
+        <w:rPr>
+          <w:rFonts w:ascii="Consolas" w:hAnsi="Consolas"/>
+        </w:rPr>
+        <w:t>PIPE_PIPE: '||';</w:t>
+      </w:r>
+    </w:p>
+    <w:p>
+      <w:pPr>
+        <w:pStyle w:val="Code"/>
+        <w:rPr>
+          <w:rFonts w:ascii="Consolas" w:hAnsi="Consolas"/>
+        </w:rPr>
+      </w:pPr>
+      <w:r>
+        <w:rPr>
+          <w:rFonts w:ascii="Consolas" w:hAnsi="Consolas"/>
+        </w:rPr>
+        <w:t>QUESTION: '?';</w:t>
+      </w:r>
+    </w:p>
+    <w:p>
+      <w:pPr>
+        <w:pStyle w:val="Code"/>
+        <w:rPr>
+          <w:rFonts w:ascii="Consolas" w:hAnsi="Consolas"/>
+        </w:rPr>
+      </w:pPr>
+      <w:r>
+        <w:rPr>
+          <w:rFonts w:ascii="Consolas" w:hAnsi="Consolas"/>
+        </w:rPr>
+        <w:t>UNDERSCORE: '_';</w:t>
+      </w:r>
+    </w:p>
+    <w:p>
+      <w:pPr>
+        <w:pStyle w:val="Code"/>
+        <w:rPr>
+          <w:rFonts w:ascii="Consolas" w:hAnsi="Consolas"/>
+        </w:rPr>
+      </w:pPr>
+      <w:r>
+        <w:rPr>
+          <w:rFonts w:ascii="Consolas" w:hAnsi="Consolas"/>
+        </w:rPr>
+        <w:t>PATH_SEPARATOR: '::';</w:t>
+      </w:r>
+    </w:p>
+    <w:p>
+      <w:pPr>
+        <w:pStyle w:val="Code"/>
+        <w:rPr>
+          <w:rFonts w:ascii="Consolas" w:hAnsi="Consolas"/>
+        </w:rPr>
+      </w:pPr>
+      <w:r>
+        <w:rPr>
+          <w:rFonts w:ascii="Consolas" w:hAnsi="Consolas"/>
+        </w:rPr>
+        <w:t>POUND: '#';</w:t>
+      </w:r>
+    </w:p>
+    <w:p>
+      <w:pPr>
+        <w:pStyle w:val="Code"/>
+        <w:rPr>
+          <w:rFonts w:ascii="Consolas" w:hAnsi="Consolas"/>
+        </w:rPr>
+      </w:pPr>
+      <w:r>
+        <w:rPr>
+          <w:rFonts w:ascii="Consolas" w:hAnsi="Consolas"/>
+        </w:rPr>
+        <w:t>DOLLAR: '$';</w:t>
+      </w:r>
+    </w:p>
+    <w:p>
+      <w:pPr>
+        <w:pStyle w:val="Code"/>
+        <w:rPr>
+          <w:rFonts w:ascii="Consolas" w:hAnsi="Consolas"/>
+        </w:rPr>
+      </w:pPr>
+      <w:r>
+        <w:rPr>
+          <w:rFonts w:ascii="Consolas" w:hAnsi="Consolas"/>
+        </w:rPr>
+      </w:r>
+    </w:p>
+    <w:p>
+      <w:pPr>
+        <w:pStyle w:val="Code"/>
+        <w:rPr>
+          <w:rFonts w:ascii="Consolas" w:hAnsi="Consolas"/>
+        </w:rPr>
+      </w:pPr>
+      <w:r>
+        <w:rPr>
+          <w:rFonts w:ascii="Consolas" w:hAnsi="Consolas"/>
+        </w:rPr>
+        <w:t>// Vector macro</w:t>
+      </w:r>
+    </w:p>
+    <w:p>
+      <w:pPr>
+        <w:pStyle w:val="Code"/>
+        <w:rPr>
+          <w:rFonts w:ascii="Consolas" w:hAnsi="Consolas"/>
+        </w:rPr>
+      </w:pPr>
+      <w:r>
+        <w:rPr>
+          <w:rFonts w:ascii="Consolas" w:hAnsi="Consolas"/>
+        </w:rPr>
+        <w:t>VEC_MACRO: 'vec!';</w:t>
+      </w:r>
+    </w:p>
+    <w:p>
+      <w:pPr>
+        <w:pStyle w:val="P1"/>
+        <w:rPr/>
+      </w:pPr>
+      <w:r>
+        <w:rPr/>
       </w:r>
     </w:p>
     <w:p>
@@ -1712,12 +3665,12 @@
       <w:lang w:val="en-US" w:eastAsia="uk-UA"/>
     </w:rPr>
   </w:style>
-  <w:style w:type="character" w:styleId="user">
-    <w:name w:val="Символ нумерації (user)"/>
+  <w:style w:type="character" w:styleId="Style12">
+    <w:name w:val="Символ нумерації"/>
     <w:qFormat/>
     <w:rPr/>
   </w:style>
-  <w:style w:type="paragraph" w:styleId="Style12">
+  <w:style w:type="paragraph" w:styleId="Style13">
     <w:name w:val="Заголовок"/>
     <w:basedOn w:val="Normal"/>
     <w:next w:val="BodyText"/>
@@ -1727,7 +3680,7 @@
       <w:spacing w:before="240" w:after="120"/>
     </w:pPr>
     <w:rPr>
-      <w:rFonts w:ascii="Liberation Sans" w:hAnsi="Liberation Sans" w:eastAsia="Microsoft YaHei" w:cs="Arial Unicode MS"/>
+      <w:rFonts w:ascii="Liberation Sans" w:hAnsi="Liberation Sans" w:eastAsia="Microsoft YaHei" w:cs="Lucida Sans"/>
       <w:sz w:val="28"/>
       <w:szCs w:val="28"/>
     </w:rPr>
@@ -1764,8 +3717,34 @@
       <w:szCs w:val="24"/>
     </w:rPr>
   </w:style>
-  <w:style w:type="paragraph" w:styleId="Style13">
+  <w:style w:type="paragraph" w:styleId="Style14">
     <w:name w:val="Покажчик"/>
+    <w:basedOn w:val="Normal"/>
+    <w:qFormat/>
+    <w:pPr>
+      <w:suppressLineNumbers/>
+    </w:pPr>
+    <w:rPr>
+      <w:rFonts w:cs="Lucida Sans"/>
+    </w:rPr>
+  </w:style>
+  <w:style w:type="paragraph" w:styleId="user">
+    <w:name w:val="Заголовок (user)"/>
+    <w:basedOn w:val="Normal"/>
+    <w:next w:val="BodyText"/>
+    <w:qFormat/>
+    <w:pPr>
+      <w:keepNext w:val="true"/>
+      <w:spacing w:before="240" w:after="120"/>
+    </w:pPr>
+    <w:rPr>
+      <w:rFonts w:ascii="Liberation Sans" w:hAnsi="Liberation Sans" w:eastAsia="Microsoft YaHei" w:cs="Arial Unicode MS"/>
+      <w:sz w:val="28"/>
+      <w:szCs w:val="28"/>
+    </w:rPr>
+  </w:style>
+  <w:style w:type="paragraph" w:styleId="user1">
+    <w:name w:val="Покажчик (user)"/>
     <w:basedOn w:val="Normal"/>
     <w:qFormat/>
     <w:pPr>
@@ -1775,35 +3754,9 @@
       <w:rFonts w:cs="Arial Unicode MS"/>
     </w:rPr>
   </w:style>
-  <w:style w:type="paragraph" w:styleId="user1">
-    <w:name w:val="Заголовок (user)"/>
-    <w:basedOn w:val="Normal"/>
-    <w:next w:val="BodyText"/>
-    <w:qFormat/>
-    <w:pPr>
-      <w:keepNext w:val="true"/>
-      <w:spacing w:before="240" w:after="120"/>
-    </w:pPr>
-    <w:rPr>
-      <w:rFonts w:ascii="Liberation Sans" w:hAnsi="Liberation Sans" w:eastAsia="Microsoft YaHei" w:cs="Lucida Sans"/>
-      <w:sz w:val="28"/>
-      <w:szCs w:val="28"/>
-    </w:rPr>
-  </w:style>
-  <w:style w:type="paragraph" w:styleId="user2">
-    <w:name w:val="Покажчик (user)"/>
-    <w:basedOn w:val="Normal"/>
-    <w:qFormat/>
-    <w:pPr>
-      <w:suppressLineNumbers/>
-    </w:pPr>
-    <w:rPr>
-      <w:rFonts w:cs="Lucida Sans"/>
-    </w:rPr>
-  </w:style>
   <w:style w:type="paragraph" w:styleId="IndexHeading">
     <w:name w:val="index heading"/>
-    <w:basedOn w:val="Style12"/>
+    <w:basedOn w:val="user"/>
     <w:pPr/>
     <w:rPr/>
   </w:style>
@@ -2076,8 +4029,8 @@
     </w:pPr>
     <w:rPr/>
   </w:style>
-  <w:style w:type="numbering" w:styleId="Style14" w:default="1">
-    <w:name w:val="Без маркерів"/>
+  <w:style w:type="numbering" w:styleId="user2" w:default="1">
+    <w:name w:val="Без маркерів (user)"/>
     <w:uiPriority w:val="99"/>
     <w:semiHidden/>
     <w:unhideWhenUsed/>

</xml_diff>

<commit_message>
feat: add a UI with react
</commit_message>
<xml_diff>
--- a/42SI Stvorennja IDE/1/SI_KNT-122_Onyshchenko_19_PR1.docx
+++ b/42SI Stvorennja IDE/1/SI_KNT-122_Onyshchenko_19_PR1.docx
@@ -747,6 +747,10 @@
       </w:pPr>
       <w:r>
         <w:rPr/>
+        <w:t xml:space="preserve">1 </w:t>
+      </w:r>
+      <w:r>
+        <w:rPr/>
         <w:t>Лексична граматика</w:t>
       </w:r>
     </w:p>
@@ -2710,7 +2714,270 @@
       </w:pPr>
       <w:r>
         <w:rPr/>
-        <w:t>Основні кінцеві автомати, які використовуються під час лексичного аналізу.</w:t>
+        <w:t>2 К</w:t>
+      </w:r>
+      <w:r>
+        <w:rPr/>
+        <w:t>інцеві автомати, які використовуються під час аналізу</w:t>
+      </w:r>
+    </w:p>
+    <w:p>
+      <w:pPr>
+        <w:pStyle w:val="P1"/>
+        <w:rPr/>
+      </w:pPr>
+      <w:r>
+        <w:rPr/>
+      </w:r>
+    </w:p>
+    <w:p>
+      <w:pPr>
+        <w:pStyle w:val="P1"/>
+        <w:rPr/>
+      </w:pPr>
+      <w:r>
+        <w:rPr/>
+        <w:t>Кінцеві автомати наведено на рисунках нижче:</w:t>
+      </w:r>
+    </w:p>
+    <w:p>
+      <w:pPr>
+        <w:pStyle w:val="P1"/>
+        <w:rPr/>
+      </w:pPr>
+      <w:r>
+        <w:rPr/>
+      </w:r>
+    </w:p>
+    <w:p>
+      <w:pPr>
+        <w:pStyle w:val="img1"/>
+        <w:rPr/>
+      </w:pPr>
+      <w:r>
+        <w:rPr/>
+        <w:drawing>
+          <wp:inline distT="0" distB="0" distL="0" distR="0">
+            <wp:extent cx="5731510" cy="6236970"/>
+            <wp:effectExtent l="0" t="0" r="0" b="0"/>
+            <wp:docPr id="1" name="Зображення1"/>
+            <wp:cNvGraphicFramePr>
+              <a:graphicFrameLocks xmlns:a="http://schemas.openxmlformats.org/drawingml/2006/main" noChangeAspect="1"/>
+            </wp:cNvGraphicFramePr>
+            <a:graphic xmlns:a="http://schemas.openxmlformats.org/drawingml/2006/main">
+              <a:graphicData uri="http://schemas.openxmlformats.org/drawingml/2006/picture">
+                <pic:pic xmlns:pic="http://schemas.openxmlformats.org/drawingml/2006/picture">
+                  <pic:nvPicPr>
+                    <pic:cNvPr id="1" name="Зображення1"/>
+                    <pic:cNvPicPr>
+                      <a:picLocks noChangeAspect="1" noChangeArrowheads="1"/>
+                    </pic:cNvPicPr>
+                  </pic:nvPicPr>
+                  <pic:blipFill>
+                    <a:blip r:embed="rId2"/>
+                    <a:stretch>
+                      <a:fillRect/>
+                    </a:stretch>
+                  </pic:blipFill>
+                  <pic:spPr bwMode="auto">
+                    <a:xfrm>
+                      <a:off x="0" y="0"/>
+                      <a:ext cx="5731510" cy="6236970"/>
+                    </a:xfrm>
+                    <a:prstGeom prst="rect">
+                      <a:avLst/>
+                    </a:prstGeom>
+                    <a:noFill/>
+                  </pic:spPr>
+                </pic:pic>
+              </a:graphicData>
+            </a:graphic>
+          </wp:inline>
+        </w:drawing>
+      </w:r>
+    </w:p>
+    <w:p>
+      <w:pPr>
+        <w:pStyle w:val="img1"/>
+        <w:rPr/>
+      </w:pPr>
+      <w:r>
+        <w:rPr/>
+        <w:t xml:space="preserve">Рисунок 2.1 — Автомат </w:t>
+      </w:r>
+      <w:r>
+        <w:rPr>
+          <w:i/>
+          <w:iCs/>
+          <w:lang w:val="en-US"/>
+        </w:rPr>
+        <w:t>block</w:t>
+      </w:r>
+    </w:p>
+    <w:p>
+      <w:pPr>
+        <w:pStyle w:val="img1"/>
+        <w:rPr/>
+      </w:pPr>
+      <w:r>
+        <w:rPr/>
+      </w:r>
+    </w:p>
+    <w:p>
+      <w:pPr>
+        <w:pStyle w:val="img1"/>
+        <w:rPr/>
+      </w:pPr>
+      <w:r>
+        <w:rPr/>
+        <w:drawing>
+          <wp:inline distT="0" distB="0" distL="0" distR="0">
+            <wp:extent cx="5731510" cy="4533900"/>
+            <wp:effectExtent l="0" t="0" r="0" b="0"/>
+            <wp:docPr id="2" name="Зображення2"/>
+            <wp:cNvGraphicFramePr>
+              <a:graphicFrameLocks xmlns:a="http://schemas.openxmlformats.org/drawingml/2006/main" noChangeAspect="1"/>
+            </wp:cNvGraphicFramePr>
+            <a:graphic xmlns:a="http://schemas.openxmlformats.org/drawingml/2006/main">
+              <a:graphicData uri="http://schemas.openxmlformats.org/drawingml/2006/picture">
+                <pic:pic xmlns:pic="http://schemas.openxmlformats.org/drawingml/2006/picture">
+                  <pic:nvPicPr>
+                    <pic:cNvPr id="2" name="Зображення2"/>
+                    <pic:cNvPicPr>
+                      <a:picLocks noChangeAspect="1" noChangeArrowheads="1"/>
+                    </pic:cNvPicPr>
+                  </pic:nvPicPr>
+                  <pic:blipFill>
+                    <a:blip r:embed="rId3"/>
+                    <a:stretch>
+                      <a:fillRect/>
+                    </a:stretch>
+                  </pic:blipFill>
+                  <pic:spPr bwMode="auto">
+                    <a:xfrm>
+                      <a:off x="0" y="0"/>
+                      <a:ext cx="5731510" cy="4533900"/>
+                    </a:xfrm>
+                    <a:prstGeom prst="rect">
+                      <a:avLst/>
+                    </a:prstGeom>
+                    <a:noFill/>
+                  </pic:spPr>
+                </pic:pic>
+              </a:graphicData>
+            </a:graphic>
+          </wp:inline>
+        </w:drawing>
+      </w:r>
+    </w:p>
+    <w:p>
+      <w:pPr>
+        <w:pStyle w:val="img1"/>
+        <w:rPr/>
+      </w:pPr>
+      <w:r>
+        <w:rPr/>
+        <w:t xml:space="preserve">Рисунок 2.2 — Автомат </w:t>
+      </w:r>
+      <w:r>
+        <w:rPr>
+          <w:i/>
+          <w:iCs/>
+          <w:lang w:val="en-US"/>
+        </w:rPr>
+        <w:t>function</w:t>
+      </w:r>
+    </w:p>
+    <w:p>
+      <w:pPr>
+        <w:pStyle w:val="img1"/>
+        <w:rPr/>
+      </w:pPr>
+      <w:r>
+        <w:rPr/>
+      </w:r>
+    </w:p>
+    <w:p>
+      <w:pPr>
+        <w:pStyle w:val="img1"/>
+        <w:rPr/>
+      </w:pPr>
+      <w:r>
+        <w:rPr/>
+        <w:drawing>
+          <wp:inline distT="0" distB="0" distL="0" distR="0">
+            <wp:extent cx="5731510" cy="3230880"/>
+            <wp:effectExtent l="0" t="0" r="0" b="0"/>
+            <wp:docPr id="3" name="Зображення3"/>
+            <wp:cNvGraphicFramePr>
+              <a:graphicFrameLocks xmlns:a="http://schemas.openxmlformats.org/drawingml/2006/main" noChangeAspect="1"/>
+            </wp:cNvGraphicFramePr>
+            <a:graphic xmlns:a="http://schemas.openxmlformats.org/drawingml/2006/main">
+              <a:graphicData uri="http://schemas.openxmlformats.org/drawingml/2006/picture">
+                <pic:pic xmlns:pic="http://schemas.openxmlformats.org/drawingml/2006/picture">
+                  <pic:nvPicPr>
+                    <pic:cNvPr id="3" name="Зображення3"/>
+                    <pic:cNvPicPr>
+                      <a:picLocks noChangeAspect="1" noChangeArrowheads="1"/>
+                    </pic:cNvPicPr>
+                  </pic:nvPicPr>
+                  <pic:blipFill>
+                    <a:blip r:embed="rId4"/>
+                    <a:stretch>
+                      <a:fillRect/>
+                    </a:stretch>
+                  </pic:blipFill>
+                  <pic:spPr bwMode="auto">
+                    <a:xfrm>
+                      <a:off x="0" y="0"/>
+                      <a:ext cx="5731510" cy="3230880"/>
+                    </a:xfrm>
+                    <a:prstGeom prst="rect">
+                      <a:avLst/>
+                    </a:prstGeom>
+                    <a:noFill/>
+                  </pic:spPr>
+                </pic:pic>
+              </a:graphicData>
+            </a:graphic>
+          </wp:inline>
+        </w:drawing>
+      </w:r>
+    </w:p>
+    <w:p>
+      <w:pPr>
+        <w:pStyle w:val="img1"/>
+        <w:rPr/>
+      </w:pPr>
+      <w:r>
+        <w:rPr/>
+        <w:t xml:space="preserve">Рисунок 2.3 — Автомат </w:t>
+      </w:r>
+      <w:r>
+        <w:rPr>
+          <w:i/>
+          <w:iCs/>
+          <w:lang w:val="en-US"/>
+        </w:rPr>
+        <w:t>if</w:t>
+      </w:r>
+    </w:p>
+    <w:p>
+      <w:pPr>
+        <w:pStyle w:val="P1"/>
+        <w:rPr>
+          <w:i/>
+          <w:i/>
+          <w:iCs/>
+          <w:lang w:val="en-US"/>
+        </w:rPr>
+      </w:pPr>
+      <w:r>
+        <w:rPr>
+          <w:i/>
+          <w:iCs/>
+          <w:lang w:val="en-US"/>
+        </w:rPr>
       </w:r>
     </w:p>
     <w:p>
@@ -3665,12 +3932,12 @@
       <w:lang w:val="en-US" w:eastAsia="uk-UA"/>
     </w:rPr>
   </w:style>
-  <w:style w:type="character" w:styleId="Style12">
-    <w:name w:val="Символ нумерації"/>
+  <w:style w:type="character" w:styleId="user">
+    <w:name w:val="Символ нумерації (user)"/>
     <w:qFormat/>
     <w:rPr/>
   </w:style>
-  <w:style w:type="paragraph" w:styleId="Style13">
+  <w:style w:type="paragraph" w:styleId="Style12">
     <w:name w:val="Заголовок"/>
     <w:basedOn w:val="Normal"/>
     <w:next w:val="BodyText"/>
@@ -3680,7 +3947,7 @@
       <w:spacing w:before="240" w:after="120"/>
     </w:pPr>
     <w:rPr>
-      <w:rFonts w:ascii="Liberation Sans" w:hAnsi="Liberation Sans" w:eastAsia="Microsoft YaHei" w:cs="Lucida Sans"/>
+      <w:rFonts w:ascii="Liberation Sans" w:hAnsi="Liberation Sans" w:eastAsia="Microsoft YaHei" w:cs="Arial Unicode MS"/>
       <w:sz w:val="28"/>
       <w:szCs w:val="28"/>
     </w:rPr>
@@ -3717,8 +3984,34 @@
       <w:szCs w:val="24"/>
     </w:rPr>
   </w:style>
-  <w:style w:type="paragraph" w:styleId="Style14">
+  <w:style w:type="paragraph" w:styleId="Style13">
     <w:name w:val="Покажчик"/>
+    <w:basedOn w:val="Normal"/>
+    <w:qFormat/>
+    <w:pPr>
+      <w:suppressLineNumbers/>
+    </w:pPr>
+    <w:rPr>
+      <w:rFonts w:cs="Arial Unicode MS"/>
+    </w:rPr>
+  </w:style>
+  <w:style w:type="paragraph" w:styleId="user1">
+    <w:name w:val="Заголовок (user)"/>
+    <w:basedOn w:val="Normal"/>
+    <w:next w:val="BodyText"/>
+    <w:qFormat/>
+    <w:pPr>
+      <w:keepNext w:val="true"/>
+      <w:spacing w:before="240" w:after="120"/>
+    </w:pPr>
+    <w:rPr>
+      <w:rFonts w:ascii="Liberation Sans" w:hAnsi="Liberation Sans" w:eastAsia="Microsoft YaHei" w:cs="Lucida Sans"/>
+      <w:sz w:val="28"/>
+      <w:szCs w:val="28"/>
+    </w:rPr>
+  </w:style>
+  <w:style w:type="paragraph" w:styleId="user2">
+    <w:name w:val="Покажчик (user)"/>
     <w:basedOn w:val="Normal"/>
     <w:qFormat/>
     <w:pPr>
@@ -3728,35 +4021,9 @@
       <w:rFonts w:cs="Lucida Sans"/>
     </w:rPr>
   </w:style>
-  <w:style w:type="paragraph" w:styleId="user">
-    <w:name w:val="Заголовок (user)"/>
-    <w:basedOn w:val="Normal"/>
-    <w:next w:val="BodyText"/>
-    <w:qFormat/>
-    <w:pPr>
-      <w:keepNext w:val="true"/>
-      <w:spacing w:before="240" w:after="120"/>
-    </w:pPr>
-    <w:rPr>
-      <w:rFonts w:ascii="Liberation Sans" w:hAnsi="Liberation Sans" w:eastAsia="Microsoft YaHei" w:cs="Arial Unicode MS"/>
-      <w:sz w:val="28"/>
-      <w:szCs w:val="28"/>
-    </w:rPr>
-  </w:style>
-  <w:style w:type="paragraph" w:styleId="user1">
-    <w:name w:val="Покажчик (user)"/>
-    <w:basedOn w:val="Normal"/>
-    <w:qFormat/>
-    <w:pPr>
-      <w:suppressLineNumbers/>
-    </w:pPr>
-    <w:rPr>
-      <w:rFonts w:cs="Arial Unicode MS"/>
-    </w:rPr>
-  </w:style>
   <w:style w:type="paragraph" w:styleId="IndexHeading">
     <w:name w:val="index heading"/>
-    <w:basedOn w:val="user"/>
+    <w:basedOn w:val="Style12"/>
     <w:pPr/>
     <w:rPr/>
   </w:style>
@@ -4029,8 +4296,30 @@
     </w:pPr>
     <w:rPr/>
   </w:style>
-  <w:style w:type="numbering" w:styleId="user2" w:default="1">
-    <w:name w:val="Без маркерів (user)"/>
+  <w:style w:type="paragraph" w:styleId="Style14">
+    <w:name w:val="Верхній і нижній колонтитули"/>
+    <w:basedOn w:val="Normal"/>
+    <w:qFormat/>
+    <w:pPr>
+      <w:suppressLineNumbers/>
+      <w:tabs>
+        <w:tab w:val="clear" w:pos="851"/>
+        <w:tab w:val="center" w:pos="4513" w:leader="none"/>
+        <w:tab w:val="right" w:pos="9026" w:leader="none"/>
+      </w:tabs>
+    </w:pPr>
+    <w:rPr/>
+  </w:style>
+  <w:style w:type="paragraph" w:styleId="Footer">
+    <w:name w:val="footer"/>
+    <w:basedOn w:val="Style14"/>
+    <w:pPr>
+      <w:suppressLineNumbers/>
+    </w:pPr>
+    <w:rPr/>
+  </w:style>
+  <w:style w:type="numbering" w:styleId="Style15" w:default="1">
+    <w:name w:val="Без маркерів"/>
     <w:uiPriority w:val="99"/>
     <w:semiHidden/>
     <w:unhideWhenUsed/>

</xml_diff>

<commit_message>
docs: add a file
</commit_message>
<xml_diff>
--- a/42SI Stvorennja IDE/1/SI_KNT-122_Onyshchenko_19_PR1.docx
+++ b/42SI Stvorennja IDE/1/SI_KNT-122_Onyshchenko_19_PR1.docx
@@ -747,11 +747,7 @@
       </w:pPr>
       <w:r>
         <w:rPr/>
-        <w:t xml:space="preserve">1 </w:t>
-      </w:r>
-      <w:r>
-        <w:rPr/>
-        <w:t>Лексична граматика</w:t>
+        <w:t>1 Лексична граматика</w:t>
       </w:r>
     </w:p>
     <w:p>
@@ -2714,11 +2710,7 @@
       </w:pPr>
       <w:r>
         <w:rPr/>
-        <w:t>2 К</w:t>
-      </w:r>
-      <w:r>
-        <w:rPr/>
-        <w:t>інцеві автомати, які використовуються під час аналізу</w:t>
+        <w:t>2 Кінцеві автомати, які використовуються під час аналізу</w:t>
       </w:r>
     </w:p>
     <w:p>
@@ -2973,11 +2965,7 @@
         </w:rPr>
       </w:pPr>
       <w:r>
-        <w:rPr>
-          <w:i/>
-          <w:iCs/>
-          <w:lang w:val="en-US"/>
-        </w:rPr>
+        <w:rPr/>
       </w:r>
     </w:p>
     <w:p>
@@ -2987,7 +2975,96 @@
       </w:pPr>
       <w:r>
         <w:rPr/>
-        <w:t>Текст лексичного аналізатора з основними коментарями.</w:t>
+        <w:t xml:space="preserve">3 </w:t>
+      </w:r>
+      <w:r>
+        <w:rPr/>
+        <w:t>Інтерфейс роботи з програмою в декількох режимах</w:t>
+      </w:r>
+    </w:p>
+    <w:p>
+      <w:pPr>
+        <w:pStyle w:val="P1"/>
+        <w:rPr/>
+      </w:pPr>
+      <w:r>
+        <w:rPr/>
+      </w:r>
+    </w:p>
+    <w:p>
+      <w:pPr>
+        <w:pStyle w:val="P1"/>
+        <w:rPr/>
+      </w:pPr>
+      <w:r>
+        <w:rPr/>
+        <w:t>Вигляд програми наведено нижче на рисунках:</w:t>
+      </w:r>
+    </w:p>
+    <w:p>
+      <w:pPr>
+        <w:pStyle w:val="P1"/>
+        <w:rPr/>
+      </w:pPr>
+      <w:r>
+        <w:rPr/>
+      </w:r>
+    </w:p>
+    <w:p>
+      <w:pPr>
+        <w:pStyle w:val="img1"/>
+        <w:rPr/>
+      </w:pPr>
+      <w:r>
+        <w:rPr/>
+        <w:drawing>
+          <wp:inline distT="0" distB="0" distL="0" distR="0">
+            <wp:extent cx="5731510" cy="6597015"/>
+            <wp:effectExtent l="0" t="0" r="0" b="0"/>
+            <wp:docPr id="4" name="Зображення4"/>
+            <wp:cNvGraphicFramePr>
+              <a:graphicFrameLocks xmlns:a="http://schemas.openxmlformats.org/drawingml/2006/main" noChangeAspect="1"/>
+            </wp:cNvGraphicFramePr>
+            <a:graphic xmlns:a="http://schemas.openxmlformats.org/drawingml/2006/main">
+              <a:graphicData uri="http://schemas.openxmlformats.org/drawingml/2006/picture">
+                <pic:pic xmlns:pic="http://schemas.openxmlformats.org/drawingml/2006/picture">
+                  <pic:nvPicPr>
+                    <pic:cNvPr id="4" name="Зображення4"/>
+                    <pic:cNvPicPr>
+                      <a:picLocks noChangeAspect="1" noChangeArrowheads="1"/>
+                    </pic:cNvPicPr>
+                  </pic:nvPicPr>
+                  <pic:blipFill>
+                    <a:blip r:embed="rId5"/>
+                    <a:stretch>
+                      <a:fillRect/>
+                    </a:stretch>
+                  </pic:blipFill>
+                  <pic:spPr bwMode="auto">
+                    <a:xfrm>
+                      <a:off x="0" y="0"/>
+                      <a:ext cx="5731510" cy="6597015"/>
+                    </a:xfrm>
+                    <a:prstGeom prst="rect">
+                      <a:avLst/>
+                    </a:prstGeom>
+                    <a:noFill/>
+                  </pic:spPr>
+                </pic:pic>
+              </a:graphicData>
+            </a:graphic>
+          </wp:inline>
+        </w:drawing>
+      </w:r>
+    </w:p>
+    <w:p>
+      <w:pPr>
+        <w:pStyle w:val="img1"/>
+        <w:rPr/>
+      </w:pPr>
+      <w:r>
+        <w:rPr/>
+        <w:t>Рисунок 3.1 — Вигляд програми</w:t>
       </w:r>
     </w:p>
     <w:p>
@@ -2997,7 +3074,39 @@
       </w:pPr>
       <w:r>
         <w:rPr/>
-        <w:t>Інтерфейс роботи з програмою в декількох режимах.</w:t>
+        <w:t xml:space="preserve">4 </w:t>
+      </w:r>
+      <w:r>
+        <w:rPr/>
+        <w:t>Результати тестування</w:t>
+      </w:r>
+    </w:p>
+    <w:p>
+      <w:pPr>
+        <w:pStyle w:val="P1"/>
+        <w:rPr/>
+      </w:pPr>
+      <w:r>
+        <w:rPr/>
+      </w:r>
+    </w:p>
+    <w:p>
+      <w:pPr>
+        <w:pStyle w:val="P1"/>
+        <w:rPr/>
+      </w:pPr>
+      <w:r>
+        <w:rPr/>
+        <w:t>Вхідні дані та результати роботи програми.</w:t>
+      </w:r>
+    </w:p>
+    <w:p>
+      <w:pPr>
+        <w:pStyle w:val="P1"/>
+        <w:rPr/>
+      </w:pPr>
+      <w:r>
+        <w:rPr/>
       </w:r>
     </w:p>
     <w:p>
@@ -3007,42 +3116,8 @@
       </w:pPr>
       <w:r>
         <w:rPr/>
-        <w:t>Результати тестування</w:t>
-      </w:r>
-    </w:p>
-    <w:p>
-      <w:pPr>
-        <w:pStyle w:val="P1"/>
-        <w:rPr/>
-      </w:pPr>
-      <w:r>
-        <w:rPr/>
-      </w:r>
-    </w:p>
-    <w:p>
-      <w:pPr>
-        <w:pStyle w:val="P1"/>
-        <w:rPr/>
-      </w:pPr>
-      <w:r>
-        <w:rPr/>
-        <w:t>Вхідні дані та результати роботи програми.</w:t>
-      </w:r>
-    </w:p>
-    <w:p>
-      <w:pPr>
-        <w:pStyle w:val="P1"/>
-        <w:rPr/>
-      </w:pPr>
-      <w:r>
-        <w:rPr/>
-      </w:r>
-    </w:p>
-    <w:p>
-      <w:pPr>
-        <w:pStyle w:val="H2"/>
-        <w:rPr/>
-      </w:pPr>
+        <w:t xml:space="preserve">5 </w:t>
+      </w:r>
       <w:r>
         <w:rPr/>
         <w:t xml:space="preserve">Перелік проблем </w:t>
@@ -3932,12 +4007,12 @@
       <w:lang w:val="en-US" w:eastAsia="uk-UA"/>
     </w:rPr>
   </w:style>
-  <w:style w:type="character" w:styleId="user">
-    <w:name w:val="Символ нумерації (user)"/>
+  <w:style w:type="character" w:styleId="Style12">
+    <w:name w:val="Символ нумерації"/>
     <w:qFormat/>
     <w:rPr/>
   </w:style>
-  <w:style w:type="paragraph" w:styleId="Style12">
+  <w:style w:type="paragraph" w:styleId="Style13">
     <w:name w:val="Заголовок"/>
     <w:basedOn w:val="Normal"/>
     <w:next w:val="BodyText"/>
@@ -3947,7 +4022,7 @@
       <w:spacing w:before="240" w:after="120"/>
     </w:pPr>
     <w:rPr>
-      <w:rFonts w:ascii="Liberation Sans" w:hAnsi="Liberation Sans" w:eastAsia="Microsoft YaHei" w:cs="Arial Unicode MS"/>
+      <w:rFonts w:ascii="Liberation Sans" w:hAnsi="Liberation Sans" w:eastAsia="Microsoft YaHei" w:cs="Lucida Sans"/>
       <w:sz w:val="28"/>
       <w:szCs w:val="28"/>
     </w:rPr>
@@ -3984,8 +4059,34 @@
       <w:szCs w:val="24"/>
     </w:rPr>
   </w:style>
-  <w:style w:type="paragraph" w:styleId="Style13">
+  <w:style w:type="paragraph" w:styleId="Style14">
     <w:name w:val="Покажчик"/>
+    <w:basedOn w:val="Normal"/>
+    <w:qFormat/>
+    <w:pPr>
+      <w:suppressLineNumbers/>
+    </w:pPr>
+    <w:rPr>
+      <w:rFonts w:cs="Lucida Sans"/>
+    </w:rPr>
+  </w:style>
+  <w:style w:type="paragraph" w:styleId="user">
+    <w:name w:val="Заголовок (user)"/>
+    <w:basedOn w:val="Normal"/>
+    <w:next w:val="BodyText"/>
+    <w:qFormat/>
+    <w:pPr>
+      <w:keepNext w:val="true"/>
+      <w:spacing w:before="240" w:after="120"/>
+    </w:pPr>
+    <w:rPr>
+      <w:rFonts w:ascii="Liberation Sans" w:hAnsi="Liberation Sans" w:eastAsia="Microsoft YaHei" w:cs="Arial Unicode MS"/>
+      <w:sz w:val="28"/>
+      <w:szCs w:val="28"/>
+    </w:rPr>
+  </w:style>
+  <w:style w:type="paragraph" w:styleId="user1">
+    <w:name w:val="Покажчик (user)"/>
     <w:basedOn w:val="Normal"/>
     <w:qFormat/>
     <w:pPr>
@@ -3995,35 +4096,9 @@
       <w:rFonts w:cs="Arial Unicode MS"/>
     </w:rPr>
   </w:style>
-  <w:style w:type="paragraph" w:styleId="user1">
-    <w:name w:val="Заголовок (user)"/>
-    <w:basedOn w:val="Normal"/>
-    <w:next w:val="BodyText"/>
-    <w:qFormat/>
-    <w:pPr>
-      <w:keepNext w:val="true"/>
-      <w:spacing w:before="240" w:after="120"/>
-    </w:pPr>
-    <w:rPr>
-      <w:rFonts w:ascii="Liberation Sans" w:hAnsi="Liberation Sans" w:eastAsia="Microsoft YaHei" w:cs="Lucida Sans"/>
-      <w:sz w:val="28"/>
-      <w:szCs w:val="28"/>
-    </w:rPr>
-  </w:style>
-  <w:style w:type="paragraph" w:styleId="user2">
-    <w:name w:val="Покажчик (user)"/>
-    <w:basedOn w:val="Normal"/>
-    <w:qFormat/>
-    <w:pPr>
-      <w:suppressLineNumbers/>
-    </w:pPr>
-    <w:rPr>
-      <w:rFonts w:cs="Lucida Sans"/>
-    </w:rPr>
-  </w:style>
   <w:style w:type="paragraph" w:styleId="IndexHeading">
     <w:name w:val="index heading"/>
-    <w:basedOn w:val="Style12"/>
+    <w:basedOn w:val="user"/>
     <w:pPr/>
     <w:rPr/>
   </w:style>
@@ -4296,8 +4371,8 @@
     </w:pPr>
     <w:rPr/>
   </w:style>
-  <w:style w:type="paragraph" w:styleId="Style14">
-    <w:name w:val="Верхній і нижній колонтитули"/>
+  <w:style w:type="paragraph" w:styleId="user2">
+    <w:name w:val="Верхній і нижній колонтитули (user)"/>
     <w:basedOn w:val="Normal"/>
     <w:qFormat/>
     <w:pPr>
@@ -4310,16 +4385,23 @@
     </w:pPr>
     <w:rPr/>
   </w:style>
+  <w:style w:type="paragraph" w:styleId="Style15">
+    <w:name w:val="Верхній і нижній колонтитули"/>
+    <w:basedOn w:val="Normal"/>
+    <w:qFormat/>
+    <w:pPr/>
+    <w:rPr/>
+  </w:style>
   <w:style w:type="paragraph" w:styleId="Footer">
     <w:name w:val="footer"/>
-    <w:basedOn w:val="Style14"/>
+    <w:basedOn w:val="user2"/>
     <w:pPr>
       <w:suppressLineNumbers/>
     </w:pPr>
     <w:rPr/>
   </w:style>
-  <w:style w:type="numbering" w:styleId="Style15" w:default="1">
-    <w:name w:val="Без маркерів"/>
+  <w:style w:type="numbering" w:styleId="user3" w:default="1">
+    <w:name w:val="Без маркерів (user)"/>
     <w:uiPriority w:val="99"/>
     <w:semiHidden/>
     <w:unhideWhenUsed/>

</xml_diff>

<commit_message>
docs: add SI1 docs
</commit_message>
<xml_diff>
--- a/42SI Stvorennja IDE/1/SI_KNT-122_Onyshchenko_19_PR1.docx
+++ b/42SI Stvorennja IDE/1/SI_KNT-122_Onyshchenko_19_PR1.docx
@@ -7,7 +7,9 @@
         <w:pStyle w:val="p11"/>
         <w:ind w:hanging="0"/>
         <w:jc w:val="center"/>
-        <w:rPr/>
+        <w:rPr>
+          <w:b/>
+        </w:rPr>
       </w:pPr>
       <w:r>
         <w:rPr>
@@ -21,7 +23,9 @@
         <w:pStyle w:val="p11"/>
         <w:ind w:hanging="0"/>
         <w:jc w:val="center"/>
-        <w:rPr/>
+        <w:rPr>
+          <w:b/>
+        </w:rPr>
       </w:pPr>
       <w:r>
         <w:rPr>
@@ -3019,7 +3023,7 @@
         <w:rPr/>
         <w:drawing>
           <wp:inline distT="0" distB="0" distL="0" distR="0">
-            <wp:extent cx="5731510" cy="6597015"/>
+            <wp:extent cx="5731510" cy="6644640"/>
             <wp:effectExtent l="0" t="0" r="0" b="0"/>
             <wp:docPr id="4" name="Зображення4"/>
             <wp:cNvGraphicFramePr>
@@ -3043,7 +3047,7 @@
                   <pic:spPr bwMode="auto">
                     <a:xfrm>
                       <a:off x="0" y="0"/>
-                      <a:ext cx="5731510" cy="6597015"/>
+                      <a:ext cx="5731510" cy="6644640"/>
                     </a:xfrm>
                     <a:prstGeom prst="rect">
                       <a:avLst/>
@@ -3064,7 +3068,82 @@
       </w:pPr>
       <w:r>
         <w:rPr/>
-        <w:t>Рисунок 3.1 — Вигляд програми</w:t>
+        <w:t>Рисунок 3.1 — Інтерфейс програми</w:t>
+      </w:r>
+    </w:p>
+    <w:p>
+      <w:pPr>
+        <w:pStyle w:val="P1"/>
+        <w:rPr/>
+      </w:pPr>
+      <w:r>
+        <w:rPr/>
+      </w:r>
+    </w:p>
+    <w:p>
+      <w:pPr>
+        <w:pStyle w:val="h11"/>
+        <w:rPr/>
+      </w:pPr>
+      <w:r>
+        <w:rPr/>
+        <w:t>Висновки</w:t>
+      </w:r>
+    </w:p>
+    <w:p>
+      <w:pPr>
+        <w:pStyle w:val="p11"/>
+        <w:rPr/>
+      </w:pPr>
+      <w:r>
+        <w:rPr/>
+      </w:r>
+    </w:p>
+    <w:p>
+      <w:pPr>
+        <w:pStyle w:val="p11"/>
+        <w:rPr/>
+      </w:pPr>
+      <w:r>
+        <w:rPr/>
+        <w:t xml:space="preserve">Благодаттю Господа Ісуса Христа зроблено роботу. Розроблено лексичний аналізатор мовою </w:t>
+      </w:r>
+      <w:r>
+        <w:rPr>
+          <w:lang w:val="en-US"/>
+        </w:rPr>
+        <w:t xml:space="preserve">Antlr </w:t>
+      </w:r>
+      <w:r>
+        <w:rPr>
+          <w:lang w:val="uk-UA"/>
+        </w:rPr>
+        <w:t xml:space="preserve">та програму мовою </w:t>
+      </w:r>
+      <w:r>
+        <w:rPr>
+          <w:lang w:val="en-US"/>
+        </w:rPr>
+        <w:t>Java.</w:t>
+      </w:r>
+    </w:p>
+    <w:p>
+      <w:pPr>
+        <w:pStyle w:val="p11"/>
+        <w:rPr/>
+      </w:pPr>
+      <w:r>
+        <w:rPr/>
+      </w:r>
+    </w:p>
+    <w:p>
+      <w:pPr>
+        <w:pStyle w:val="h11"/>
+        <w:rPr/>
+      </w:pPr>
+      <w:r>
+        <w:rPr/>
+        <w:t>Питання</w:t>
       </w:r>
     </w:p>
     <w:p>
@@ -3074,11 +3153,7 @@
       </w:pPr>
       <w:r>
         <w:rPr/>
-        <w:t xml:space="preserve">4 </w:t>
-      </w:r>
-      <w:r>
-        <w:rPr/>
-        <w:t>Результати тестування</w:t>
+        <w:t>З чого складається сучасне інтегроване середовище розробки?</w:t>
       </w:r>
     </w:p>
     <w:p>
@@ -3097,7 +3172,7 @@
       </w:pPr>
       <w:r>
         <w:rPr/>
-        <w:t>Вхідні дані та результати роботи програми.</w:t>
+        <w:t>Складається з багатьох частин, зокрема:</w:t>
       </w:r>
     </w:p>
     <w:p>
@@ -3107,6 +3182,36 @@
       </w:pPr>
       <w:r>
         <w:rPr/>
+        <w:t>- текстовий редактор;</w:t>
+      </w:r>
+    </w:p>
+    <w:p>
+      <w:pPr>
+        <w:pStyle w:val="P1"/>
+        <w:rPr/>
+      </w:pPr>
+      <w:r>
+        <w:rPr/>
+        <w:t>- менеджер проєктів;</w:t>
+      </w:r>
+    </w:p>
+    <w:p>
+      <w:pPr>
+        <w:pStyle w:val="P1"/>
+        <w:rPr/>
+      </w:pPr>
+      <w:r>
+        <w:rPr/>
+        <w:t>- інтеграція з системами контролю версій.</w:t>
+      </w:r>
+    </w:p>
+    <w:p>
+      <w:pPr>
+        <w:pStyle w:val="P1"/>
+        <w:rPr/>
+      </w:pPr>
+      <w:r>
+        <w:rPr/>
       </w:r>
     </w:p>
     <w:p>
@@ -3116,97 +3221,72 @@
       </w:pPr>
       <w:r>
         <w:rPr/>
-        <w:t xml:space="preserve">5 </w:t>
-      </w:r>
-      <w:r>
-        <w:rPr/>
-        <w:t xml:space="preserve">Перелік проблем </w:t>
-      </w:r>
-    </w:p>
-    <w:p>
-      <w:pPr>
-        <w:pStyle w:val="p11"/>
-        <w:rPr/>
-      </w:pPr>
-      <w:r>
-        <w:rPr/>
-      </w:r>
-    </w:p>
-    <w:p>
-      <w:pPr>
-        <w:pStyle w:val="p11"/>
-        <w:rPr/>
-      </w:pPr>
-      <w:r>
-        <w:rPr/>
-        <w:t>Які були виявлені і розв’язані або не розв’язані під час роботи над проєктом, з описом відповідної ситуації.</w:t>
-      </w:r>
-    </w:p>
-    <w:p>
-      <w:pPr>
-        <w:pStyle w:val="p11"/>
-        <w:rPr/>
-      </w:pPr>
-      <w:r>
-        <w:rPr/>
-        <w:t>Якщо проблему було розв’язано, то необхідно додатково описати прийняті рішення. Якщо проблему не було розв’язано, ситуацію має бути ідентифіковано максимально детально з поясненням виявлених причин.</w:t>
-      </w:r>
-    </w:p>
-    <w:p>
-      <w:pPr>
-        <w:pStyle w:val="p11"/>
-        <w:rPr/>
-      </w:pPr>
-      <w:r>
-        <w:rPr/>
-      </w:r>
-    </w:p>
-    <w:p>
-      <w:pPr>
-        <w:pStyle w:val="h11"/>
-        <w:rPr/>
-      </w:pPr>
-      <w:r>
-        <w:rPr/>
-        <w:t>Висновки</w:t>
-      </w:r>
-    </w:p>
-    <w:p>
-      <w:pPr>
-        <w:pStyle w:val="p11"/>
-        <w:rPr/>
-      </w:pPr>
-      <w:r>
-        <w:rPr/>
-      </w:r>
-    </w:p>
-    <w:p>
-      <w:pPr>
-        <w:pStyle w:val="p11"/>
-        <w:rPr/>
-      </w:pPr>
-      <w:r>
-        <w:rPr/>
-        <w:t>Висновки, що відображають особисто отримані результати виконання роботи та їх критичний аналіз.</w:t>
-      </w:r>
-    </w:p>
-    <w:p>
-      <w:pPr>
-        <w:pStyle w:val="p11"/>
-        <w:rPr/>
-      </w:pPr>
-      <w:r>
-        <w:rPr/>
-      </w:r>
-    </w:p>
-    <w:p>
-      <w:pPr>
-        <w:pStyle w:val="h11"/>
-        <w:rPr/>
-      </w:pPr>
-      <w:r>
-        <w:rPr/>
-        <w:t>Питання</w:t>
+        <w:t xml:space="preserve">Чим відрізняються компілятори та </w:t>
+      </w:r>
+      <w:r>
+        <w:rPr/>
+        <w:t>інтерпретатори</w:t>
+      </w:r>
+      <w:r>
+        <w:rPr/>
+        <w:t>?</w:t>
+      </w:r>
+    </w:p>
+    <w:p>
+      <w:pPr>
+        <w:pStyle w:val="P1"/>
+        <w:rPr/>
+      </w:pPr>
+      <w:r>
+        <w:rPr/>
+      </w:r>
+    </w:p>
+    <w:p>
+      <w:pPr>
+        <w:pStyle w:val="P1"/>
+        <w:rPr/>
+      </w:pPr>
+      <w:r>
+        <w:rPr/>
+        <w:t>Компілятор перекладає весь код у машинний одразу, а інтерпретатор виконує його рядок за рядком.</w:t>
+      </w:r>
+    </w:p>
+    <w:p>
+      <w:pPr>
+        <w:pStyle w:val="P1"/>
+        <w:rPr/>
+      </w:pPr>
+      <w:r>
+        <w:rPr/>
+      </w:r>
+    </w:p>
+    <w:p>
+      <w:pPr>
+        <w:pStyle w:val="H2"/>
+        <w:rPr/>
+      </w:pPr>
+      <w:r>
+        <w:rPr/>
+        <w:t>Що є результатом та входом лексичного аналізатору?</w:t>
+      </w:r>
+    </w:p>
+    <w:p>
+      <w:pPr>
+        <w:pStyle w:val="P1"/>
+        <w:rPr/>
+      </w:pPr>
+      <w:r>
+        <w:rPr/>
+      </w:r>
+    </w:p>
+    <w:p>
+      <w:pPr>
+        <w:pStyle w:val="P1"/>
+        <w:rPr/>
+      </w:pPr>
+      <w:r>
+        <w:rPr/>
+        <w:t>Результатом лексичного аналізатору є потік токенів.</w:t>
       </w:r>
     </w:p>
     <w:sectPr>
@@ -3227,7 +3307,7 @@
   <w:docDefaults>
     <w:rPrDefault>
       <w:rPr>
-        <w:rFonts w:ascii="Calibri" w:hAnsi="Calibri" w:eastAsia="Calibri" w:cs="" w:asciiTheme="minorHAnsi" w:cstheme="minorBidi" w:eastAsiaTheme="minorHAnsi" w:hAnsiTheme="minorHAnsi"/>
+        <w:rFonts w:ascii="Calibri" w:hAnsi="Calibri" w:eastAsia="Calibri" w:cs="Tahoma"/>
         <w:sz w:val="22"/>
         <w:szCs w:val="22"/>
         <w:lang w:val="uk-UA" w:eastAsia="en-US" w:bidi="ar-SA"/>
@@ -3239,391 +3319,15 @@
       </w:pPr>
     </w:pPrDefault>
   </w:docDefaults>
-  <w:latentStyles w:defLockedState="0" w:defUIPriority="99" w:defSemiHidden="0" w:defUnhideWhenUsed="0" w:defQFormat="0" w:count="376">
-    <w:lsdException w:name="Normal" w:uiPriority="0"/>
-    <w:lsdException w:name="heading 1" w:uiPriority="9"/>
-    <w:lsdException w:name="heading 2" w:uiPriority="9" w:semiHidden="1" w:unhideWhenUsed="1"/>
-    <w:lsdException w:name="heading 3" w:uiPriority="9" w:semiHidden="1" w:unhideWhenUsed="1"/>
-    <w:lsdException w:name="heading 4" w:uiPriority="9" w:semiHidden="1" w:unhideWhenUsed="1"/>
-    <w:lsdException w:name="heading 5" w:uiPriority="9" w:semiHidden="1" w:unhideWhenUsed="1" w:qFormat="1"/>
-    <w:lsdException w:name="heading 6" w:uiPriority="9" w:semiHidden="1" w:unhideWhenUsed="1" w:qFormat="1"/>
-    <w:lsdException w:name="heading 7" w:uiPriority="9" w:semiHidden="1" w:unhideWhenUsed="1" w:qFormat="1"/>
-    <w:lsdException w:name="heading 8" w:uiPriority="9" w:semiHidden="1" w:unhideWhenUsed="1" w:qFormat="1"/>
-    <w:lsdException w:name="heading 9" w:uiPriority="9" w:semiHidden="1" w:unhideWhenUsed="1" w:qFormat="1"/>
-    <w:lsdException w:name="index 1" w:semiHidden="1" w:unhideWhenUsed="1"/>
-    <w:lsdException w:name="index 2" w:semiHidden="1" w:unhideWhenUsed="1"/>
-    <w:lsdException w:name="index 3" w:semiHidden="1" w:unhideWhenUsed="1"/>
-    <w:lsdException w:name="index 4" w:semiHidden="1" w:unhideWhenUsed="1"/>
-    <w:lsdException w:name="index 5" w:semiHidden="1" w:unhideWhenUsed="1"/>
-    <w:lsdException w:name="index 6" w:semiHidden="1" w:unhideWhenUsed="1"/>
-    <w:lsdException w:name="index 7" w:semiHidden="1" w:unhideWhenUsed="1"/>
-    <w:lsdException w:name="index 8" w:semiHidden="1" w:unhideWhenUsed="1"/>
-    <w:lsdException w:name="index 9" w:semiHidden="1" w:unhideWhenUsed="1"/>
-    <w:lsdException w:name="toc 1" w:uiPriority="39" w:semiHidden="1" w:unhideWhenUsed="1"/>
-    <w:lsdException w:name="toc 2" w:uiPriority="39" w:semiHidden="1" w:unhideWhenUsed="1"/>
-    <w:lsdException w:name="toc 3" w:uiPriority="39" w:semiHidden="1" w:unhideWhenUsed="1"/>
-    <w:lsdException w:name="toc 4" w:uiPriority="39" w:semiHidden="1" w:unhideWhenUsed="1"/>
-    <w:lsdException w:name="toc 5" w:uiPriority="39" w:semiHidden="1" w:unhideWhenUsed="1"/>
-    <w:lsdException w:name="toc 6" w:uiPriority="39" w:semiHidden="1" w:unhideWhenUsed="1"/>
-    <w:lsdException w:name="toc 7" w:uiPriority="39" w:semiHidden="1" w:unhideWhenUsed="1"/>
-    <w:lsdException w:name="toc 8" w:uiPriority="39" w:semiHidden="1" w:unhideWhenUsed="1"/>
-    <w:lsdException w:name="toc 9" w:uiPriority="39" w:semiHidden="1" w:unhideWhenUsed="1"/>
-    <w:lsdException w:name="Normal Indent" w:semiHidden="1" w:unhideWhenUsed="1"/>
-    <w:lsdException w:name="footnote text" w:semiHidden="1" w:unhideWhenUsed="1"/>
-    <w:lsdException w:name="annotation text" w:semiHidden="1" w:unhideWhenUsed="1"/>
-    <w:lsdException w:name="header" w:semiHidden="1" w:unhideWhenUsed="1"/>
-    <w:lsdException w:name="footer" w:semiHidden="1" w:unhideWhenUsed="1"/>
-    <w:lsdException w:name="index heading" w:semiHidden="1" w:unhideWhenUsed="1"/>
-    <w:lsdException w:name="caption" w:uiPriority="35" w:semiHidden="1" w:unhideWhenUsed="1" w:qFormat="1"/>
-    <w:lsdException w:name="table of figures" w:semiHidden="1" w:unhideWhenUsed="1"/>
-    <w:lsdException w:name="envelope address" w:semiHidden="1" w:unhideWhenUsed="1"/>
-    <w:lsdException w:name="envelope return" w:semiHidden="1" w:unhideWhenUsed="1"/>
-    <w:lsdException w:name="footnote reference" w:semiHidden="1" w:unhideWhenUsed="1"/>
-    <w:lsdException w:name="annotation reference" w:semiHidden="1" w:unhideWhenUsed="1"/>
-    <w:lsdException w:name="line number" w:semiHidden="1" w:unhideWhenUsed="1"/>
-    <w:lsdException w:name="page number" w:semiHidden="1" w:unhideWhenUsed="1"/>
-    <w:lsdException w:name="endnote reference" w:semiHidden="1" w:unhideWhenUsed="1"/>
-    <w:lsdException w:name="endnote text" w:semiHidden="1" w:unhideWhenUsed="1"/>
-    <w:lsdException w:name="table of authorities" w:semiHidden="1" w:unhideWhenUsed="1"/>
-    <w:lsdException w:name="macro" w:semiHidden="1" w:unhideWhenUsed="1"/>
-    <w:lsdException w:name="toa heading" w:semiHidden="1" w:unhideWhenUsed="1"/>
-    <w:lsdException w:name="List" w:semiHidden="1" w:unhideWhenUsed="1"/>
-    <w:lsdException w:name="List Bullet" w:semiHidden="1" w:unhideWhenUsed="1"/>
-    <w:lsdException w:name="List Number" w:semiHidden="1" w:unhideWhenUsed="1"/>
-    <w:lsdException w:name="List 2" w:semiHidden="1" w:unhideWhenUsed="1"/>
-    <w:lsdException w:name="List 3" w:semiHidden="1" w:unhideWhenUsed="1"/>
-    <w:lsdException w:name="List 4" w:semiHidden="1" w:unhideWhenUsed="1"/>
-    <w:lsdException w:name="List 5" w:semiHidden="1" w:unhideWhenUsed="1"/>
-    <w:lsdException w:name="List Bullet 2" w:semiHidden="1" w:unhideWhenUsed="1"/>
-    <w:lsdException w:name="List Bullet 3" w:semiHidden="1" w:unhideWhenUsed="1"/>
-    <w:lsdException w:name="List Bullet 4" w:semiHidden="1" w:unhideWhenUsed="1"/>
-    <w:lsdException w:name="List Bullet 5" w:semiHidden="1" w:unhideWhenUsed="1"/>
-    <w:lsdException w:name="List Number 2" w:semiHidden="1" w:unhideWhenUsed="1"/>
-    <w:lsdException w:name="List Number 3" w:semiHidden="1" w:unhideWhenUsed="1"/>
-    <w:lsdException w:name="List Number 4" w:semiHidden="1" w:unhideWhenUsed="1"/>
-    <w:lsdException w:name="List Number 5" w:semiHidden="1" w:unhideWhenUsed="1"/>
-    <w:lsdException w:name="Title" w:uiPriority="10"/>
-    <w:lsdException w:name="Closing" w:semiHidden="1" w:unhideWhenUsed="1"/>
-    <w:lsdException w:name="Signature" w:semiHidden="1" w:unhideWhenUsed="1"/>
-    <w:lsdException w:name="Default Paragraph Font" w:uiPriority="1" w:semiHidden="1" w:unhideWhenUsed="1"/>
-    <w:lsdException w:name="Body Text" w:semiHidden="1" w:unhideWhenUsed="1"/>
-    <w:lsdException w:name="Body Text Indent" w:semiHidden="1" w:unhideWhenUsed="1"/>
-    <w:lsdException w:name="List Continue" w:semiHidden="1" w:unhideWhenUsed="1"/>
-    <w:lsdException w:name="List Continue 2" w:semiHidden="1" w:unhideWhenUsed="1"/>
-    <w:lsdException w:name="List Continue 3" w:semiHidden="1" w:unhideWhenUsed="1"/>
-    <w:lsdException w:name="List Continue 4" w:semiHidden="1" w:unhideWhenUsed="1"/>
-    <w:lsdException w:name="List Continue 5" w:semiHidden="1" w:unhideWhenUsed="1"/>
-    <w:lsdException w:name="Message Header" w:semiHidden="1" w:unhideWhenUsed="1"/>
-    <w:lsdException w:name="Subtitle" w:uiPriority="11"/>
-    <w:lsdException w:name="Salutation" w:semiHidden="1" w:unhideWhenUsed="1"/>
-    <w:lsdException w:name="Date" w:semiHidden="1" w:unhideWhenUsed="1"/>
-    <w:lsdException w:name="Body Text First Indent" w:semiHidden="1" w:unhideWhenUsed="1"/>
-    <w:lsdException w:name="Body Text First Indent 2" w:semiHidden="1" w:unhideWhenUsed="1"/>
-    <w:lsdException w:name="Note Heading" w:semiHidden="1" w:unhideWhenUsed="1"/>
-    <w:lsdException w:name="Body Text 2" w:semiHidden="1" w:unhideWhenUsed="1"/>
-    <w:lsdException w:name="Body Text 3" w:semiHidden="1" w:unhideWhenUsed="1"/>
-    <w:lsdException w:name="Body Text Indent 2" w:semiHidden="1" w:unhideWhenUsed="1"/>
-    <w:lsdException w:name="Body Text Indent 3" w:semiHidden="1" w:unhideWhenUsed="1"/>
-    <w:lsdException w:name="Block Text" w:semiHidden="1" w:unhideWhenUsed="1"/>
-    <w:lsdException w:name="Hyperlink" w:semiHidden="1" w:unhideWhenUsed="1"/>
-    <w:lsdException w:name="FollowedHyperlink" w:semiHidden="1" w:unhideWhenUsed="1"/>
-    <w:lsdException w:name="Strong" w:uiPriority="22"/>
-    <w:lsdException w:name="Emphasis" w:uiPriority="20"/>
-    <w:lsdException w:name="Document Map" w:semiHidden="1" w:unhideWhenUsed="1"/>
-    <w:lsdException w:name="Plain Text" w:semiHidden="1" w:unhideWhenUsed="1"/>
-    <w:lsdException w:name="E-mail Signature" w:semiHidden="1" w:unhideWhenUsed="1"/>
-    <w:lsdException w:name="HTML Top of Form" w:semiHidden="1" w:unhideWhenUsed="1"/>
-    <w:lsdException w:name="HTML Bottom of Form" w:semiHidden="1" w:unhideWhenUsed="1"/>
-    <w:lsdException w:name="Normal (Web)" w:semiHidden="1" w:unhideWhenUsed="1"/>
-    <w:lsdException w:name="HTML Acronym" w:semiHidden="1" w:unhideWhenUsed="1"/>
-    <w:lsdException w:name="HTML Address" w:semiHidden="1" w:unhideWhenUsed="1"/>
-    <w:lsdException w:name="HTML Cite" w:semiHidden="1" w:unhideWhenUsed="1"/>
-    <w:lsdException w:name="HTML Code" w:semiHidden="1" w:unhideWhenUsed="1"/>
-    <w:lsdException w:name="HTML Definition" w:semiHidden="1" w:unhideWhenUsed="1"/>
-    <w:lsdException w:name="HTML Keyboard" w:semiHidden="1" w:unhideWhenUsed="1"/>
-    <w:lsdException w:name="HTML Preformatted" w:semiHidden="1" w:unhideWhenUsed="1"/>
-    <w:lsdException w:name="HTML Sample" w:semiHidden="1" w:unhideWhenUsed="1"/>
-    <w:lsdException w:name="HTML Typewriter" w:semiHidden="1" w:unhideWhenUsed="1"/>
-    <w:lsdException w:name="HTML Variable" w:semiHidden="1" w:unhideWhenUsed="1"/>
-    <w:lsdException w:name="Normal Table" w:semiHidden="1" w:unhideWhenUsed="1"/>
-    <w:lsdException w:name="annotation subject" w:semiHidden="1" w:unhideWhenUsed="1"/>
-    <w:lsdException w:name="No List" w:semiHidden="1" w:unhideWhenUsed="1"/>
-    <w:lsdException w:name="Outline List 1" w:semiHidden="1" w:unhideWhenUsed="1"/>
-    <w:lsdException w:name="Outline List 2" w:semiHidden="1" w:unhideWhenUsed="1"/>
-    <w:lsdException w:name="Outline List 3" w:semiHidden="1" w:unhideWhenUsed="1"/>
-    <w:lsdException w:name="Table Simple 1" w:semiHidden="1" w:unhideWhenUsed="1"/>
-    <w:lsdException w:name="Table Simple 2" w:semiHidden="1" w:unhideWhenUsed="1"/>
-    <w:lsdException w:name="Table Simple 3" w:semiHidden="1" w:unhideWhenUsed="1"/>
-    <w:lsdException w:name="Table Classic 1" w:semiHidden="1" w:unhideWhenUsed="1"/>
-    <w:lsdException w:name="Table Classic 2" w:semiHidden="1" w:unhideWhenUsed="1"/>
-    <w:lsdException w:name="Table Classic 3" w:semiHidden="1" w:unhideWhenUsed="1"/>
-    <w:lsdException w:name="Table Classic 4" w:semiHidden="1" w:unhideWhenUsed="1"/>
-    <w:lsdException w:name="Table Colorful 1" w:semiHidden="1" w:unhideWhenUsed="1"/>
-    <w:lsdException w:name="Table Colorful 2" w:semiHidden="1" w:unhideWhenUsed="1"/>
-    <w:lsdException w:name="Table Colorful 3" w:semiHidden="1" w:unhideWhenUsed="1"/>
-    <w:lsdException w:name="Table Columns 1" w:semiHidden="1" w:unhideWhenUsed="1"/>
-    <w:lsdException w:name="Table Columns 2" w:semiHidden="1" w:unhideWhenUsed="1"/>
-    <w:lsdException w:name="Table Columns 3" w:semiHidden="1" w:unhideWhenUsed="1"/>
-    <w:lsdException w:name="Table Columns 4" w:semiHidden="1" w:unhideWhenUsed="1"/>
-    <w:lsdException w:name="Table Columns 5" w:semiHidden="1" w:unhideWhenUsed="1"/>
-    <w:lsdException w:name="Table Grid 1" w:semiHidden="1" w:unhideWhenUsed="1"/>
-    <w:lsdException w:name="Table Grid 2" w:semiHidden="1" w:unhideWhenUsed="1"/>
-    <w:lsdException w:name="Table Grid 3" w:semiHidden="1" w:unhideWhenUsed="1"/>
-    <w:lsdException w:name="Table Grid 4" w:semiHidden="1" w:unhideWhenUsed="1"/>
-    <w:lsdException w:name="Table Grid 5" w:semiHidden="1" w:unhideWhenUsed="1"/>
-    <w:lsdException w:name="Table Grid 6" w:semiHidden="1" w:unhideWhenUsed="1"/>
-    <w:lsdException w:name="Table Grid 7" w:semiHidden="1" w:unhideWhenUsed="1"/>
-    <w:lsdException w:name="Table Grid 8" w:semiHidden="1" w:unhideWhenUsed="1"/>
-    <w:lsdException w:name="Table List 1" w:semiHidden="1" w:unhideWhenUsed="1"/>
-    <w:lsdException w:name="Table List 2" w:semiHidden="1" w:unhideWhenUsed="1"/>
-    <w:lsdException w:name="Table List 3" w:semiHidden="1" w:unhideWhenUsed="1"/>
-    <w:lsdException w:name="Table List 4" w:semiHidden="1" w:unhideWhenUsed="1"/>
-    <w:lsdException w:name="Table List 5" w:semiHidden="1" w:unhideWhenUsed="1"/>
-    <w:lsdException w:name="Table List 6" w:semiHidden="1" w:unhideWhenUsed="1"/>
-    <w:lsdException w:name="Table List 7" w:semiHidden="1" w:unhideWhenUsed="1"/>
-    <w:lsdException w:name="Table List 8" w:semiHidden="1" w:unhideWhenUsed="1"/>
-    <w:lsdException w:name="Table 3D effects 1" w:semiHidden="1" w:unhideWhenUsed="1"/>
-    <w:lsdException w:name="Table 3D effects 2" w:semiHidden="1" w:unhideWhenUsed="1"/>
-    <w:lsdException w:name="Table 3D effects 3" w:semiHidden="1" w:unhideWhenUsed="1"/>
-    <w:lsdException w:name="Table Contemporary" w:semiHidden="1" w:unhideWhenUsed="1"/>
-    <w:lsdException w:name="Table Elegant" w:semiHidden="1" w:unhideWhenUsed="1"/>
-    <w:lsdException w:name="Table Professional" w:semiHidden="1" w:unhideWhenUsed="1"/>
-    <w:lsdException w:name="Table Subtle 1" w:semiHidden="1" w:unhideWhenUsed="1"/>
-    <w:lsdException w:name="Table Subtle 2" w:semiHidden="1" w:unhideWhenUsed="1"/>
-    <w:lsdException w:name="Table Web 1" w:semiHidden="1" w:unhideWhenUsed="1"/>
-    <w:lsdException w:name="Table Web 2" w:semiHidden="1" w:unhideWhenUsed="1"/>
-    <w:lsdException w:name="Table Web 3" w:semiHidden="1" w:unhideWhenUsed="1"/>
-    <w:lsdException w:name="Balloon Text" w:semiHidden="1" w:unhideWhenUsed="1"/>
-    <w:lsdException w:name="Table Grid" w:uiPriority="39"/>
-    <w:lsdException w:name="Table Theme" w:semiHidden="1" w:unhideWhenUsed="1"/>
-    <w:lsdException w:name="Placeholder Text" w:semiHidden="1"/>
-    <w:lsdException w:name="No Spacing" w:uiPriority="1"/>
-    <w:lsdException w:name="Light Shading" w:uiPriority="60"/>
-    <w:lsdException w:name="Light List" w:uiPriority="61"/>
-    <w:lsdException w:name="Light Grid" w:uiPriority="62"/>
-    <w:lsdException w:name="Medium Shading 1" w:uiPriority="63"/>
-    <w:lsdException w:name="Medium Shading 2" w:uiPriority="64"/>
-    <w:lsdException w:name="Medium List 1" w:uiPriority="65"/>
-    <w:lsdException w:name="Medium List 2" w:uiPriority="66"/>
-    <w:lsdException w:name="Medium Grid 1" w:uiPriority="67"/>
-    <w:lsdException w:name="Medium Grid 2" w:uiPriority="68"/>
-    <w:lsdException w:name="Medium Grid 3" w:uiPriority="69"/>
-    <w:lsdException w:name="Dark List" w:uiPriority="70"/>
-    <w:lsdException w:name="Colorful Shading" w:uiPriority="71"/>
-    <w:lsdException w:name="Colorful List" w:uiPriority="72"/>
-    <w:lsdException w:name="Colorful Grid" w:uiPriority="73"/>
-    <w:lsdException w:name="Light Shading Accent 1" w:uiPriority="60"/>
-    <w:lsdException w:name="Light List Accent 1" w:uiPriority="61"/>
-    <w:lsdException w:name="Light Grid Accent 1" w:uiPriority="62"/>
-    <w:lsdException w:name="Medium Shading 1 Accent 1" w:uiPriority="63"/>
-    <w:lsdException w:name="Medium Shading 2 Accent 1" w:uiPriority="64"/>
-    <w:lsdException w:name="Medium List 1 Accent 1" w:uiPriority="65"/>
-    <w:lsdException w:name="Revision" w:semiHidden="1"/>
-    <w:lsdException w:name="List Paragraph" w:uiPriority="34"/>
-    <w:lsdException w:name="Quote" w:uiPriority="29"/>
-    <w:lsdException w:name="Intense Quote" w:uiPriority="30"/>
-    <w:lsdException w:name="Medium List 2 Accent 1" w:uiPriority="66"/>
-    <w:lsdException w:name="Medium Grid 1 Accent 1" w:uiPriority="67"/>
-    <w:lsdException w:name="Medium Grid 2 Accent 1" w:uiPriority="68"/>
-    <w:lsdException w:name="Medium Grid 3 Accent 1" w:uiPriority="69"/>
-    <w:lsdException w:name="Dark List Accent 1" w:uiPriority="70"/>
-    <w:lsdException w:name="Colorful Shading Accent 1" w:uiPriority="71"/>
-    <w:lsdException w:name="Colorful List Accent 1" w:uiPriority="72"/>
-    <w:lsdException w:name="Colorful Grid Accent 1" w:uiPriority="73"/>
-    <w:lsdException w:name="Light Shading Accent 2" w:uiPriority="60"/>
-    <w:lsdException w:name="Light List Accent 2" w:uiPriority="61"/>
-    <w:lsdException w:name="Light Grid Accent 2" w:uiPriority="62"/>
-    <w:lsdException w:name="Medium Shading 1 Accent 2" w:uiPriority="63"/>
-    <w:lsdException w:name="Medium Shading 2 Accent 2" w:uiPriority="64"/>
-    <w:lsdException w:name="Medium List 1 Accent 2" w:uiPriority="65"/>
-    <w:lsdException w:name="Medium List 2 Accent 2" w:uiPriority="66"/>
-    <w:lsdException w:name="Medium Grid 1 Accent 2" w:uiPriority="67"/>
-    <w:lsdException w:name="Medium Grid 2 Accent 2" w:uiPriority="68"/>
-    <w:lsdException w:name="Medium Grid 3 Accent 2" w:uiPriority="69"/>
-    <w:lsdException w:name="Dark List Accent 2" w:uiPriority="70"/>
-    <w:lsdException w:name="Colorful Shading Accent 2" w:uiPriority="71"/>
-    <w:lsdException w:name="Colorful List Accent 2" w:uiPriority="72"/>
-    <w:lsdException w:name="Colorful Grid Accent 2" w:uiPriority="73"/>
-    <w:lsdException w:name="Light Shading Accent 3" w:uiPriority="60"/>
-    <w:lsdException w:name="Light List Accent 3" w:uiPriority="61"/>
-    <w:lsdException w:name="Light Grid Accent 3" w:uiPriority="62"/>
-    <w:lsdException w:name="Medium Shading 1 Accent 3" w:uiPriority="63"/>
-    <w:lsdException w:name="Medium Shading 2 Accent 3" w:uiPriority="64"/>
-    <w:lsdException w:name="Medium List 1 Accent 3" w:uiPriority="65"/>
-    <w:lsdException w:name="Medium List 2 Accent 3" w:uiPriority="66"/>
-    <w:lsdException w:name="Medium Grid 1 Accent 3" w:uiPriority="67"/>
-    <w:lsdException w:name="Medium Grid 2 Accent 3" w:uiPriority="68"/>
-    <w:lsdException w:name="Medium Grid 3 Accent 3" w:uiPriority="69"/>
-    <w:lsdException w:name="Dark List Accent 3" w:uiPriority="70"/>
-    <w:lsdException w:name="Colorful Shading Accent 3" w:uiPriority="71"/>
-    <w:lsdException w:name="Colorful List Accent 3" w:uiPriority="72"/>
-    <w:lsdException w:name="Colorful Grid Accent 3" w:uiPriority="73"/>
-    <w:lsdException w:name="Light Shading Accent 4" w:uiPriority="60"/>
-    <w:lsdException w:name="Light List Accent 4" w:uiPriority="61"/>
-    <w:lsdException w:name="Light Grid Accent 4" w:uiPriority="62"/>
-    <w:lsdException w:name="Medium Shading 1 Accent 4" w:uiPriority="63"/>
-    <w:lsdException w:name="Medium Shading 2 Accent 4" w:uiPriority="64"/>
-    <w:lsdException w:name="Medium List 1 Accent 4" w:uiPriority="65"/>
-    <w:lsdException w:name="Medium List 2 Accent 4" w:uiPriority="66"/>
-    <w:lsdException w:name="Medium Grid 1 Accent 4" w:uiPriority="67"/>
-    <w:lsdException w:name="Medium Grid 2 Accent 4" w:uiPriority="68"/>
-    <w:lsdException w:name="Medium Grid 3 Accent 4" w:uiPriority="69"/>
-    <w:lsdException w:name="Dark List Accent 4" w:uiPriority="70"/>
-    <w:lsdException w:name="Colorful Shading Accent 4" w:uiPriority="71"/>
-    <w:lsdException w:name="Colorful List Accent 4" w:uiPriority="72"/>
-    <w:lsdException w:name="Colorful Grid Accent 4" w:uiPriority="73"/>
-    <w:lsdException w:name="Light Shading Accent 5" w:uiPriority="60"/>
-    <w:lsdException w:name="Light List Accent 5" w:uiPriority="61"/>
-    <w:lsdException w:name="Light Grid Accent 5" w:uiPriority="62"/>
-    <w:lsdException w:name="Medium Shading 1 Accent 5" w:uiPriority="63"/>
-    <w:lsdException w:name="Medium Shading 2 Accent 5" w:uiPriority="64"/>
-    <w:lsdException w:name="Medium List 1 Accent 5" w:uiPriority="65"/>
-    <w:lsdException w:name="Medium List 2 Accent 5" w:uiPriority="66"/>
-    <w:lsdException w:name="Medium Grid 1 Accent 5" w:uiPriority="67"/>
-    <w:lsdException w:name="Medium Grid 2 Accent 5" w:uiPriority="68"/>
-    <w:lsdException w:name="Medium Grid 3 Accent 5" w:uiPriority="69"/>
-    <w:lsdException w:name="Dark List Accent 5" w:uiPriority="70"/>
-    <w:lsdException w:name="Colorful Shading Accent 5" w:uiPriority="71"/>
-    <w:lsdException w:name="Colorful List Accent 5" w:uiPriority="72"/>
-    <w:lsdException w:name="Colorful Grid Accent 5" w:uiPriority="73"/>
-    <w:lsdException w:name="Light Shading Accent 6" w:uiPriority="60"/>
-    <w:lsdException w:name="Light List Accent 6" w:uiPriority="61"/>
-    <w:lsdException w:name="Light Grid Accent 6" w:uiPriority="62"/>
-    <w:lsdException w:name="Medium Shading 1 Accent 6" w:uiPriority="63"/>
-    <w:lsdException w:name="Medium Shading 2 Accent 6" w:uiPriority="64"/>
-    <w:lsdException w:name="Medium List 1 Accent 6" w:uiPriority="65"/>
-    <w:lsdException w:name="Medium List 2 Accent 6" w:uiPriority="66"/>
-    <w:lsdException w:name="Medium Grid 1 Accent 6" w:uiPriority="67"/>
-    <w:lsdException w:name="Medium Grid 2 Accent 6" w:uiPriority="68"/>
-    <w:lsdException w:name="Medium Grid 3 Accent 6" w:uiPriority="69"/>
-    <w:lsdException w:name="Dark List Accent 6" w:uiPriority="70"/>
-    <w:lsdException w:name="Colorful Shading Accent 6" w:uiPriority="71"/>
-    <w:lsdException w:name="Colorful List Accent 6" w:uiPriority="72"/>
-    <w:lsdException w:name="Colorful Grid Accent 6" w:uiPriority="73"/>
-    <w:lsdException w:name="Subtle Emphasis" w:uiPriority="19"/>
-    <w:lsdException w:name="Intense Emphasis" w:uiPriority="21"/>
-    <w:lsdException w:name="Subtle Reference" w:uiPriority="31"/>
-    <w:lsdException w:name="Intense Reference" w:uiPriority="32"/>
-    <w:lsdException w:name="Book Title" w:uiPriority="33"/>
-    <w:lsdException w:name="Bibliography" w:uiPriority="37" w:semiHidden="1" w:unhideWhenUsed="1"/>
-    <w:lsdException w:name="TOC Heading" w:uiPriority="39" w:semiHidden="1" w:unhideWhenUsed="1"/>
-    <w:lsdException w:name="Plain Table 1" w:uiPriority="41"/>
-    <w:lsdException w:name="Plain Table 2" w:uiPriority="42"/>
-    <w:lsdException w:name="Plain Table 3" w:uiPriority="43"/>
-    <w:lsdException w:name="Plain Table 4" w:uiPriority="44"/>
-    <w:lsdException w:name="Plain Table 5" w:uiPriority="45"/>
-    <w:lsdException w:name="Grid Table Light" w:uiPriority="40"/>
-    <w:lsdException w:name="Grid Table 1 Light" w:uiPriority="46"/>
-    <w:lsdException w:name="Grid Table 2" w:uiPriority="47"/>
-    <w:lsdException w:name="Grid Table 3" w:uiPriority="48"/>
-    <w:lsdException w:name="Grid Table 4" w:uiPriority="49"/>
-    <w:lsdException w:name="Grid Table 5 Dark" w:uiPriority="50"/>
-    <w:lsdException w:name="Grid Table 6 Colorful" w:uiPriority="51"/>
-    <w:lsdException w:name="Grid Table 7 Colorful" w:uiPriority="52"/>
-    <w:lsdException w:name="Grid Table 1 Light Accent 1" w:uiPriority="46"/>
-    <w:lsdException w:name="Grid Table 2 Accent 1" w:uiPriority="47"/>
-    <w:lsdException w:name="Grid Table 3 Accent 1" w:uiPriority="48"/>
-    <w:lsdException w:name="Grid Table 4 Accent 1" w:uiPriority="49"/>
-    <w:lsdException w:name="Grid Table 5 Dark Accent 1" w:uiPriority="50"/>
-    <w:lsdException w:name="Grid Table 6 Colorful Accent 1" w:uiPriority="51"/>
-    <w:lsdException w:name="Grid Table 7 Colorful Accent 1" w:uiPriority="52"/>
-    <w:lsdException w:name="Grid Table 1 Light Accent 2" w:uiPriority="46"/>
-    <w:lsdException w:name="Grid Table 2 Accent 2" w:uiPriority="47"/>
-    <w:lsdException w:name="Grid Table 3 Accent 2" w:uiPriority="48"/>
-    <w:lsdException w:name="Grid Table 4 Accent 2" w:uiPriority="49"/>
-    <w:lsdException w:name="Grid Table 5 Dark Accent 2" w:uiPriority="50"/>
-    <w:lsdException w:name="Grid Table 6 Colorful Accent 2" w:uiPriority="51"/>
-    <w:lsdException w:name="Grid Table 7 Colorful Accent 2" w:uiPriority="52"/>
-    <w:lsdException w:name="Grid Table 1 Light Accent 3" w:uiPriority="46"/>
-    <w:lsdException w:name="Grid Table 2 Accent 3" w:uiPriority="47"/>
-    <w:lsdException w:name="Grid Table 3 Accent 3" w:uiPriority="48"/>
-    <w:lsdException w:name="Grid Table 4 Accent 3" w:uiPriority="49"/>
-    <w:lsdException w:name="Grid Table 5 Dark Accent 3" w:uiPriority="50"/>
-    <w:lsdException w:name="Grid Table 6 Colorful Accent 3" w:uiPriority="51"/>
-    <w:lsdException w:name="Grid Table 7 Colorful Accent 3" w:uiPriority="52"/>
-    <w:lsdException w:name="Grid Table 1 Light Accent 4" w:uiPriority="46"/>
-    <w:lsdException w:name="Grid Table 2 Accent 4" w:uiPriority="47"/>
-    <w:lsdException w:name="Grid Table 3 Accent 4" w:uiPriority="48"/>
-    <w:lsdException w:name="Grid Table 4 Accent 4" w:uiPriority="49"/>
-    <w:lsdException w:name="Grid Table 5 Dark Accent 4" w:uiPriority="50"/>
-    <w:lsdException w:name="Grid Table 6 Colorful Accent 4" w:uiPriority="51"/>
-    <w:lsdException w:name="Grid Table 7 Colorful Accent 4" w:uiPriority="52"/>
-    <w:lsdException w:name="Grid Table 1 Light Accent 5" w:uiPriority="46"/>
-    <w:lsdException w:name="Grid Table 2 Accent 5" w:uiPriority="47"/>
-    <w:lsdException w:name="Grid Table 3 Accent 5" w:uiPriority="48"/>
-    <w:lsdException w:name="Grid Table 4 Accent 5" w:uiPriority="49"/>
-    <w:lsdException w:name="Grid Table 5 Dark Accent 5" w:uiPriority="50"/>
-    <w:lsdException w:name="Grid Table 6 Colorful Accent 5" w:uiPriority="51"/>
-    <w:lsdException w:name="Grid Table 7 Colorful Accent 5" w:uiPriority="52"/>
-    <w:lsdException w:name="Grid Table 1 Light Accent 6" w:uiPriority="46"/>
-    <w:lsdException w:name="Grid Table 2 Accent 6" w:uiPriority="47"/>
-    <w:lsdException w:name="Grid Table 3 Accent 6" w:uiPriority="48"/>
-    <w:lsdException w:name="Grid Table 4 Accent 6" w:uiPriority="49"/>
-    <w:lsdException w:name="Grid Table 5 Dark Accent 6" w:uiPriority="50"/>
-    <w:lsdException w:name="Grid Table 6 Colorful Accent 6" w:uiPriority="51"/>
-    <w:lsdException w:name="Grid Table 7 Colorful Accent 6" w:uiPriority="52"/>
-    <w:lsdException w:name="List Table 1 Light" w:uiPriority="46"/>
-    <w:lsdException w:name="List Table 2" w:uiPriority="47"/>
-    <w:lsdException w:name="List Table 3" w:uiPriority="48"/>
-    <w:lsdException w:name="List Table 4" w:uiPriority="49"/>
-    <w:lsdException w:name="List Table 5 Dark" w:uiPriority="50"/>
-    <w:lsdException w:name="List Table 6 Colorful" w:uiPriority="51"/>
-    <w:lsdException w:name="List Table 7 Colorful" w:uiPriority="52"/>
-    <w:lsdException w:name="List Table 1 Light Accent 1" w:uiPriority="46"/>
-    <w:lsdException w:name="List Table 2 Accent 1" w:uiPriority="47"/>
-    <w:lsdException w:name="List Table 3 Accent 1" w:uiPriority="48"/>
-    <w:lsdException w:name="List Table 4 Accent 1" w:uiPriority="49"/>
-    <w:lsdException w:name="List Table 5 Dark Accent 1" w:uiPriority="50"/>
-    <w:lsdException w:name="List Table 6 Colorful Accent 1" w:uiPriority="51"/>
-    <w:lsdException w:name="List Table 7 Colorful Accent 1" w:uiPriority="52"/>
-    <w:lsdException w:name="List Table 1 Light Accent 2" w:uiPriority="46"/>
-    <w:lsdException w:name="List Table 2 Accent 2" w:uiPriority="47"/>
-    <w:lsdException w:name="List Table 3 Accent 2" w:uiPriority="48"/>
-    <w:lsdException w:name="List Table 4 Accent 2" w:uiPriority="49"/>
-    <w:lsdException w:name="List Table 5 Dark Accent 2" w:uiPriority="50"/>
-    <w:lsdException w:name="List Table 6 Colorful Accent 2" w:uiPriority="51"/>
-    <w:lsdException w:name="List Table 7 Colorful Accent 2" w:uiPriority="52"/>
-    <w:lsdException w:name="List Table 1 Light Accent 3" w:uiPriority="46"/>
-    <w:lsdException w:name="List Table 2 Accent 3" w:uiPriority="47"/>
-    <w:lsdException w:name="List Table 3 Accent 3" w:uiPriority="48"/>
-    <w:lsdException w:name="List Table 4 Accent 3" w:uiPriority="49"/>
-    <w:lsdException w:name="List Table 5 Dark Accent 3" w:uiPriority="50"/>
-    <w:lsdException w:name="List Table 6 Colorful Accent 3" w:uiPriority="51"/>
-    <w:lsdException w:name="List Table 7 Colorful Accent 3" w:uiPriority="52"/>
-    <w:lsdException w:name="List Table 1 Light Accent 4" w:uiPriority="46"/>
-    <w:lsdException w:name="List Table 2 Accent 4" w:uiPriority="47"/>
-    <w:lsdException w:name="List Table 3 Accent 4" w:uiPriority="48"/>
-    <w:lsdException w:name="List Table 4 Accent 4" w:uiPriority="49"/>
-    <w:lsdException w:name="List Table 5 Dark Accent 4" w:uiPriority="50"/>
-    <w:lsdException w:name="List Table 6 Colorful Accent 4" w:uiPriority="51"/>
-    <w:lsdException w:name="List Table 7 Colorful Accent 4" w:uiPriority="52"/>
-    <w:lsdException w:name="List Table 1 Light Accent 5" w:uiPriority="46"/>
-    <w:lsdException w:name="List Table 2 Accent 5" w:uiPriority="47"/>
-    <w:lsdException w:name="List Table 3 Accent 5" w:uiPriority="48"/>
-    <w:lsdException w:name="List Table 4 Accent 5" w:uiPriority="49"/>
-    <w:lsdException w:name="List Table 5 Dark Accent 5" w:uiPriority="50"/>
-    <w:lsdException w:name="List Table 6 Colorful Accent 5" w:uiPriority="51"/>
-    <w:lsdException w:name="List Table 7 Colorful Accent 5" w:uiPriority="52"/>
-    <w:lsdException w:name="List Table 1 Light Accent 6" w:uiPriority="46"/>
-    <w:lsdException w:name="List Table 2 Accent 6" w:uiPriority="47"/>
-    <w:lsdException w:name="List Table 3 Accent 6" w:uiPriority="48"/>
-    <w:lsdException w:name="List Table 4 Accent 6" w:uiPriority="49"/>
-    <w:lsdException w:name="List Table 5 Dark Accent 6" w:uiPriority="50"/>
-    <w:lsdException w:name="List Table 6 Colorful Accent 6" w:uiPriority="51"/>
-    <w:lsdException w:name="List Table 7 Colorful Accent 6" w:uiPriority="52"/>
-    <w:lsdException w:name="Mention" w:semiHidden="1" w:unhideWhenUsed="1"/>
-    <w:lsdException w:name="Smart Hyperlink" w:semiHidden="1" w:unhideWhenUsed="1"/>
-    <w:lsdException w:name="Hashtag" w:semiHidden="1" w:unhideWhenUsed="1"/>
-    <w:lsdException w:name="Unresolved Mention" w:semiHidden="1" w:unhideWhenUsed="1"/>
-    <w:lsdException w:name="Smart Link" w:semiHidden="1" w:unhideWhenUsed="1"/>
-  </w:latentStyles>
-  <w:style w:type="paragraph" w:styleId="Normal" w:default="1">
+  <w:style w:type="paragraph" w:styleId="Normal">
     <w:name w:val="Normal"/>
     <w:qFormat/>
-    <w:rsid w:val="00cd76ed"/>
     <w:pPr>
       <w:widowControl/>
       <w:suppressAutoHyphens w:val="true"/>
+      <w:kinsoku w:val="true"/>
+      <w:overflowPunct w:val="true"/>
+      <w:autoSpaceDE w:val="true"/>
       <w:bidi w:val="0"/>
       <w:spacing w:lineRule="auto" w:line="360" w:before="0" w:after="0"/>
       <w:ind w:firstLine="851"/>
@@ -3643,16 +3347,19 @@
     <w:basedOn w:val="Normal"/>
     <w:next w:val="Normal"/>
     <w:link w:val="1"/>
-    <w:uiPriority w:val="9"/>
-    <w:qFormat/>
-    <w:rsid w:val="00cd76ed"/>
+    <w:qFormat/>
     <w:pPr>
       <w:keepNext w:val="true"/>
       <w:keepLines/>
+      <w:numPr>
+        <w:ilvl w:val="0"/>
+        <w:numId w:val="0"/>
+      </w:numPr>
+      <w:ind w:firstLine="851"/>
       <w:outlineLvl w:val="0"/>
     </w:pPr>
     <w:rPr>
-      <w:rFonts w:ascii="Calibri Light" w:hAnsi="Calibri Light" w:eastAsia="" w:cs="" w:asciiTheme="majorHAnsi" w:cstheme="majorBidi" w:eastAsiaTheme="majorEastAsia" w:hAnsiTheme="majorHAnsi"/>
+      <w:rFonts w:ascii="Calibri Light" w:hAnsi="Calibri Light" w:eastAsia="Calibri" w:cs="Tahoma"/>
       <w:color w:themeColor="accent1" w:themeShade="bf" w:val="2F5496"/>
       <w:sz w:val="32"/>
       <w:szCs w:val="32"/>
@@ -3663,18 +3370,20 @@
     <w:basedOn w:val="Normal"/>
     <w:next w:val="Normal"/>
     <w:link w:val="2"/>
-    <w:uiPriority w:val="9"/>
-    <w:unhideWhenUsed/>
-    <w:qFormat/>
-    <w:rsid w:val="008a48c4"/>
+    <w:qFormat/>
     <w:pPr>
       <w:keepNext w:val="true"/>
       <w:keepLines/>
+      <w:numPr>
+        <w:ilvl w:val="0"/>
+        <w:numId w:val="0"/>
+      </w:numPr>
       <w:spacing w:before="40" w:after="0"/>
+      <w:ind w:firstLine="851"/>
       <w:outlineLvl w:val="1"/>
     </w:pPr>
     <w:rPr>
-      <w:rFonts w:ascii="Calibri Light" w:hAnsi="Calibri Light" w:eastAsia="" w:cs="" w:asciiTheme="majorHAnsi" w:cstheme="majorBidi" w:eastAsiaTheme="majorEastAsia" w:hAnsiTheme="majorHAnsi"/>
+      <w:rFonts w:ascii="Calibri Light" w:hAnsi="Calibri Light" w:eastAsia="Calibri" w:cs="Tahoma"/>
       <w:color w:themeColor="accent1" w:themeShade="bf" w:val="2F5496"/>
       <w:sz w:val="26"/>
       <w:szCs w:val="26"/>
@@ -3685,86 +3394,79 @@
     <w:basedOn w:val="Normal"/>
     <w:next w:val="Normal"/>
     <w:link w:val="3"/>
-    <w:uiPriority w:val="9"/>
-    <w:unhideWhenUsed/>
-    <w:qFormat/>
-    <w:rsid w:val="007e0631"/>
+    <w:qFormat/>
     <w:pPr>
       <w:keepNext w:val="true"/>
       <w:keepLines/>
+      <w:numPr>
+        <w:ilvl w:val="0"/>
+        <w:numId w:val="0"/>
+      </w:numPr>
       <w:spacing w:before="40" w:after="0"/>
+      <w:ind w:firstLine="851"/>
       <w:outlineLvl w:val="2"/>
     </w:pPr>
     <w:rPr>
-      <w:rFonts w:ascii="Calibri Light" w:hAnsi="Calibri Light" w:eastAsia="" w:cs="" w:asciiTheme="majorHAnsi" w:cstheme="majorBidi" w:eastAsiaTheme="majorEastAsia" w:hAnsiTheme="majorHAnsi"/>
+      <w:rFonts w:ascii="Calibri Light" w:hAnsi="Calibri Light" w:eastAsia="Calibri" w:cs="Tahoma"/>
       <w:color w:themeColor="accent1" w:themeShade="7f" w:val="1F3763"/>
       <w:sz w:val="24"/>
       <w:szCs w:val="24"/>
     </w:rPr>
   </w:style>
-  <w:style w:type="character" w:styleId="DefaultParagraphFont" w:default="1">
+  <w:style w:type="character" w:styleId="DefaultParagraphFont">
     <w:name w:val="Default Paragraph Font"/>
-    <w:uiPriority w:val="1"/>
-    <w:semiHidden/>
-    <w:unhideWhenUsed/>
     <w:qFormat/>
     <w:rPr/>
   </w:style>
-  <w:style w:type="character" w:styleId="1" w:customStyle="1">
+  <w:style w:type="character" w:styleId="1">
     <w:name w:val="Заголовок 1 Знак"/>
     <w:basedOn w:val="DefaultParagraphFont"/>
-    <w:uiPriority w:val="9"/>
-    <w:qFormat/>
-    <w:rsid w:val="00cd76ed"/>
+    <w:qFormat/>
     <w:rPr>
-      <w:rFonts w:ascii="Calibri Light" w:hAnsi="Calibri Light" w:eastAsia="" w:cs="" w:asciiTheme="majorHAnsi" w:cstheme="majorBidi" w:eastAsiaTheme="majorEastAsia" w:hAnsiTheme="majorHAnsi"/>
+      <w:rFonts w:ascii="Calibri Light" w:hAnsi="Calibri Light" w:eastAsia="Calibri" w:cs="Tahoma"/>
       <w:color w:themeColor="accent1" w:themeShade="bf" w:val="2F5496"/>
       <w:sz w:val="32"/>
       <w:szCs w:val="32"/>
       <w:lang w:eastAsia="uk-UA"/>
     </w:rPr>
   </w:style>
-  <w:style w:type="character" w:styleId="2" w:customStyle="1">
+  <w:style w:type="character" w:styleId="2">
     <w:name w:val="Заголовок 2 Знак"/>
     <w:basedOn w:val="DefaultParagraphFont"/>
-    <w:uiPriority w:val="9"/>
-    <w:qFormat/>
-    <w:rsid w:val="008a48c4"/>
+    <w:qFormat/>
     <w:rPr>
-      <w:rFonts w:ascii="Calibri Light" w:hAnsi="Calibri Light" w:eastAsia="" w:cs="" w:asciiTheme="majorHAnsi" w:cstheme="majorBidi" w:eastAsiaTheme="majorEastAsia" w:hAnsiTheme="majorHAnsi"/>
+      <w:rFonts w:ascii="Calibri Light" w:hAnsi="Calibri Light" w:eastAsia="Calibri" w:cs="Tahoma"/>
       <w:color w:themeColor="accent1" w:themeShade="bf" w:val="2F5496"/>
       <w:sz w:val="26"/>
       <w:szCs w:val="26"/>
       <w:lang w:eastAsia="uk-UA"/>
     </w:rPr>
   </w:style>
-  <w:style w:type="character" w:styleId="H1Char" w:customStyle="1">
+  <w:style w:type="character" w:styleId="H1Char">
     <w:name w:val="H1 Char"/>
     <w:basedOn w:val="1"/>
     <w:qFormat/>
-    <w:rsid w:val="00e9279b"/>
     <w:rPr>
-      <w:rFonts w:ascii="Times New Roman" w:hAnsi="Times New Roman" w:eastAsia="" w:cs="Times New Roman" w:eastAsiaTheme="majorEastAsia"/>
+      <w:rFonts w:ascii="Times New Roman" w:hAnsi="Times New Roman" w:eastAsia="Calibri" w:cs="Times New Roman"/>
       <w:b/>
       <w:bCs/>
       <w:smallCaps/>
-      <w:color w:themeColor="text1" w:val="000000"/>
+      <w:color w:themeColor="dark1" w:val="000000"/>
       <w:sz w:val="28"/>
       <w:szCs w:val="28"/>
       <w:lang w:eastAsia="uk-UA"/>
     </w:rPr>
   </w:style>
-  <w:style w:type="character" w:styleId="H2Char" w:customStyle="1">
+  <w:style w:type="character" w:styleId="H2Char">
     <w:name w:val="H2 Char"/>
     <w:basedOn w:val="2"/>
     <w:link w:val="H2"/>
     <w:qFormat/>
-    <w:rsid w:val="00062cf8"/>
     <w:rPr>
-      <w:rFonts w:ascii="Times New Roman" w:hAnsi="Times New Roman" w:eastAsia="" w:cs="Times New Roman" w:eastAsiaTheme="majorEastAsia"/>
+      <w:rFonts w:ascii="Times New Roman" w:hAnsi="Times New Roman" w:eastAsia="Calibri" w:cs="Times New Roman"/>
       <w:b/>
       <w:bCs/>
-      <w:color w:themeColor="text1" w:val="000000"/>
+      <w:color w:themeColor="dark1" w:val="000000"/>
       <w:sz w:val="28"/>
       <w:szCs w:val="26"/>
       <w:lang w:eastAsia="uk-UA"/>
@@ -3773,36 +3475,30 @@
   <w:style w:type="character" w:styleId="Hyperlink">
     <w:name w:val="Hyperlink"/>
     <w:basedOn w:val="DefaultParagraphFont"/>
-    <w:uiPriority w:val="99"/>
-    <w:unhideWhenUsed/>
-    <w:rsid w:val="00062cf8"/>
     <w:rPr>
       <w:color w:themeColor="hyperlink" w:val="0563C1"/>
       <w:u w:val="single"/>
     </w:rPr>
   </w:style>
-  <w:style w:type="character" w:styleId="3" w:customStyle="1">
+  <w:style w:type="character" w:styleId="3">
     <w:name w:val="Заголовок 3 Знак"/>
     <w:basedOn w:val="DefaultParagraphFont"/>
-    <w:uiPriority w:val="9"/>
-    <w:qFormat/>
-    <w:rsid w:val="007e0631"/>
+    <w:qFormat/>
     <w:rPr>
-      <w:rFonts w:ascii="Calibri Light" w:hAnsi="Calibri Light" w:eastAsia="" w:cs="" w:asciiTheme="majorHAnsi" w:cstheme="majorBidi" w:eastAsiaTheme="majorEastAsia" w:hAnsiTheme="majorHAnsi"/>
+      <w:rFonts w:ascii="Calibri Light" w:hAnsi="Calibri Light" w:eastAsia="Calibri" w:cs="Tahoma"/>
       <w:color w:themeColor="accent1" w:themeShade="7f" w:val="1F3763"/>
       <w:sz w:val="24"/>
       <w:szCs w:val="24"/>
       <w:lang w:eastAsia="uk-UA"/>
     </w:rPr>
   </w:style>
-  <w:style w:type="character" w:styleId="H3Char" w:customStyle="1">
+  <w:style w:type="character" w:styleId="H3Char">
     <w:name w:val="H3 Char"/>
     <w:basedOn w:val="3"/>
     <w:link w:val="H3"/>
     <w:qFormat/>
-    <w:rsid w:val="00dc3221"/>
     <w:rPr>
-      <w:rFonts w:ascii="Times New Roman" w:hAnsi="Times New Roman" w:eastAsia="" w:cs="Times New Roman" w:eastAsiaTheme="majorEastAsia"/>
+      <w:rFonts w:ascii="Times New Roman" w:hAnsi="Times New Roman" w:eastAsia="Calibri" w:cs="Times New Roman"/>
       <w:b/>
       <w:bCs/>
       <w:i/>
@@ -3812,18 +3508,16 @@
       <w:lang w:eastAsia="uk-UA"/>
     </w:rPr>
   </w:style>
-  <w:style w:type="character" w:styleId="Style11" w:customStyle="1">
+  <w:style w:type="character" w:styleId="Style11">
     <w:name w:val="Цитата Знак"/>
     <w:basedOn w:val="DefaultParagraphFont"/>
     <w:link w:val="Quote"/>
-    <w:uiPriority w:val="29"/>
-    <w:qFormat/>
-    <w:rsid w:val="00d22788"/>
+    <w:qFormat/>
     <w:rPr>
       <w:rFonts w:ascii="Times New Roman" w:hAnsi="Times New Roman" w:eastAsia="Times New Roman" w:cs="Times New Roman"/>
       <w:i/>
       <w:iCs/>
-      <w:color w:themeColor="text1" w:themeTint="bf" w:val="404040"/>
+      <w:color w:themeColor="dark1" w:themeTint="bf" w:val="404040"/>
       <w:sz w:val="28"/>
       <w:szCs w:val="28"/>
       <w:lang w:eastAsia="uk-UA"/>
@@ -3832,39 +3526,33 @@
   <w:style w:type="character" w:styleId="UnresolvedMention">
     <w:name w:val="Unresolved Mention"/>
     <w:basedOn w:val="DefaultParagraphFont"/>
-    <w:uiPriority w:val="99"/>
-    <w:semiHidden/>
-    <w:unhideWhenUsed/>
-    <w:qFormat/>
-    <w:rsid w:val="00e11f54"/>
+    <w:qFormat/>
     <w:rPr>
       <w:color w:val="605E5C"/>
       <w:shd w:fill="E1DFDD" w:val="clear"/>
     </w:rPr>
   </w:style>
-  <w:style w:type="character" w:styleId="H4" w:customStyle="1">
+  <w:style w:type="character" w:styleId="H4">
     <w:name w:val="H4 Знак"/>
     <w:basedOn w:val="H3Char"/>
     <w:link w:val="H41"/>
     <w:qFormat/>
-    <w:rsid w:val="00375986"/>
     <w:rPr>
-      <w:rFonts w:ascii="Times New Roman" w:hAnsi="Times New Roman" w:eastAsia="" w:cs="Times New Roman" w:eastAsiaTheme="majorEastAsia"/>
+      <w:rFonts w:ascii="Times New Roman" w:hAnsi="Times New Roman" w:eastAsia="Calibri" w:cs="Times New Roman"/>
       <w:b/>
       <w:bCs/>
       <w:i/>
-      <w:color w:themeColor="text1" w:val="000000"/>
+      <w:color w:themeColor="dark1" w:val="000000"/>
       <w:sz w:val="28"/>
       <w:szCs w:val="24"/>
       <w:lang w:eastAsia="uk-UA"/>
     </w:rPr>
   </w:style>
-  <w:style w:type="character" w:styleId="P" w:customStyle="1">
+  <w:style w:type="character" w:styleId="P">
     <w:name w:val="P Знак"/>
     <w:basedOn w:val="DefaultParagraphFont"/>
     <w:link w:val="P1"/>
     <w:qFormat/>
-    <w:rsid w:val="00dc3221"/>
     <w:rPr>
       <w:rFonts w:ascii="Times New Roman" w:hAnsi="Times New Roman" w:eastAsia="Times New Roman" w:cs="Times New Roman"/>
       <w:sz w:val="28"/>
@@ -3872,11 +3560,10 @@
       <w:lang w:eastAsia="uk-UA"/>
     </w:rPr>
   </w:style>
-  <w:style w:type="character" w:styleId="IMG" w:customStyle="1">
+  <w:style w:type="character" w:styleId="IMG">
     <w:name w:val="IMG Знак"/>
     <w:basedOn w:val="P"/>
     <w:qFormat/>
-    <w:rsid w:val="007e21e3"/>
     <w:rPr>
       <w:rFonts w:ascii="Times New Roman" w:hAnsi="Times New Roman" w:eastAsia="Times New Roman" w:cs="Times New Roman"/>
       <w:sz w:val="28"/>
@@ -3884,13 +3571,11 @@
       <w:lang w:eastAsia="uk-UA"/>
     </w:rPr>
   </w:style>
-  <w:style w:type="character" w:styleId="HTML" w:customStyle="1">
+  <w:style w:type="character" w:styleId="HTML">
     <w:name w:val="Стандартний HTML Знак"/>
     <w:basedOn w:val="DefaultParagraphFont"/>
     <w:link w:val="HTMLPreformatted"/>
-    <w:uiPriority w:val="99"/>
-    <w:qFormat/>
-    <w:rsid w:val="00485ae4"/>
+    <w:qFormat/>
     <w:rPr>
       <w:rFonts w:ascii="Courier New" w:hAnsi="Courier New" w:eastAsia="Times New Roman" w:cs="Courier New"/>
       <w:sz w:val="20"/>
@@ -3901,83 +3586,71 @@
   <w:style w:type="character" w:styleId="HTMLCode">
     <w:name w:val="HTML Code"/>
     <w:basedOn w:val="DefaultParagraphFont"/>
-    <w:uiPriority w:val="99"/>
-    <w:semiHidden/>
-    <w:unhideWhenUsed/>
-    <w:qFormat/>
-    <w:rsid w:val="00485ae4"/>
+    <w:qFormat/>
     <w:rPr>
       <w:rFonts w:ascii="Courier New" w:hAnsi="Courier New" w:eastAsia="Times New Roman" w:cs="Courier New"/>
       <w:sz w:val="20"/>
       <w:szCs w:val="20"/>
     </w:rPr>
   </w:style>
-  <w:style w:type="character" w:styleId="hljs-builtin" w:customStyle="1">
+  <w:style w:type="character" w:styleId="hljs-builtin">
     <w:name w:val="hljs-built_in"/>
     <w:basedOn w:val="DefaultParagraphFont"/>
     <w:qFormat/>
-    <w:rsid w:val="00485ae4"/>
     <w:rPr/>
   </w:style>
-  <w:style w:type="character" w:styleId="hljs-function" w:customStyle="1">
+  <w:style w:type="character" w:styleId="hljs-function">
     <w:name w:val="hljs-function"/>
     <w:basedOn w:val="DefaultParagraphFont"/>
     <w:qFormat/>
-    <w:rsid w:val="00485ae4"/>
     <w:rPr/>
   </w:style>
-  <w:style w:type="character" w:styleId="hljs-keyword" w:customStyle="1">
+  <w:style w:type="character" w:styleId="hljs-keyword">
     <w:name w:val="hljs-keyword"/>
     <w:basedOn w:val="DefaultParagraphFont"/>
     <w:qFormat/>
-    <w:rsid w:val="00485ae4"/>
     <w:rPr/>
   </w:style>
-  <w:style w:type="character" w:styleId="hljs-title" w:customStyle="1">
+  <w:style w:type="character" w:styleId="hljs-title">
     <w:name w:val="hljs-title"/>
     <w:basedOn w:val="DefaultParagraphFont"/>
     <w:qFormat/>
-    <w:rsid w:val="00485ae4"/>
     <w:rPr/>
   </w:style>
-  <w:style w:type="character" w:styleId="hljs-params" w:customStyle="1">
+  <w:style w:type="character" w:styleId="hljs-params">
     <w:name w:val="hljs-params"/>
     <w:basedOn w:val="DefaultParagraphFont"/>
     <w:qFormat/>
-    <w:rsid w:val="00485ae4"/>
     <w:rPr/>
   </w:style>
-  <w:style w:type="character" w:styleId="hljs-comment" w:customStyle="1">
+  <w:style w:type="character" w:styleId="hljs-comment">
     <w:name w:val="hljs-comment"/>
     <w:basedOn w:val="DefaultParagraphFont"/>
     <w:qFormat/>
-    <w:rsid w:val="00437c32"/>
     <w:rPr/>
   </w:style>
-  <w:style w:type="character" w:styleId="H5" w:customStyle="1">
+  <w:style w:type="character" w:styleId="H5">
     <w:name w:val="H5 Знак"/>
     <w:basedOn w:val="H4"/>
     <w:link w:val="H51"/>
     <w:qFormat/>
-    <w:rsid w:val="00b7017d"/>
     <w:rPr>
-      <w:rFonts w:ascii="Times New Roman" w:hAnsi="Times New Roman" w:eastAsia="" w:cs="Times New Roman" w:eastAsiaTheme="majorEastAsia"/>
+      <w:rFonts w:ascii="Times New Roman" w:hAnsi="Times New Roman" w:eastAsia="Calibri" w:cs="Times New Roman"/>
       <w:b/>
       <w:bCs/>
       <w:i/>
       <w:smallCaps/>
-      <w:color w:themeColor="text1" w:val="000000"/>
+      <w:color w:themeColor="dark1" w:val="000000"/>
       <w:sz w:val="28"/>
       <w:szCs w:val="24"/>
       <w:lang w:eastAsia="uk-UA"/>
     </w:rPr>
   </w:style>
-  <w:style w:type="character" w:styleId="H6" w:customStyle="1">
+  <w:style w:type="character" w:styleId="H6">
     <w:name w:val="H6 Знак"/>
     <w:basedOn w:val="P"/>
     <w:link w:val="H61"/>
     <w:qFormat/>
-    <w:rsid w:val="00b7017d"/>
     <w:rPr>
       <w:rFonts w:ascii="Times New Roman" w:hAnsi="Times New Roman" w:eastAsia="Times New Roman" w:cs="Times New Roman"/>
       <w:iCs/>
@@ -3987,19 +3660,17 @@
       <w:lang w:val="en-US" w:eastAsia="uk-UA"/>
     </w:rPr>
   </w:style>
-  <w:style w:type="character" w:styleId="hljs-number" w:customStyle="1">
+  <w:style w:type="character" w:styleId="hljs-number">
     <w:name w:val="hljs-number"/>
     <w:basedOn w:val="DefaultParagraphFont"/>
     <w:qFormat/>
-    <w:rsid w:val="00d010ea"/>
     <w:rPr/>
   </w:style>
-  <w:style w:type="character" w:styleId="CodeChar" w:customStyle="1">
+  <w:style w:type="character" w:styleId="CodeChar">
     <w:name w:val="Code Char"/>
     <w:basedOn w:val="DefaultParagraphFont"/>
     <w:link w:val="Code"/>
     <w:qFormat/>
-    <w:rsid w:val="00e34056"/>
     <w:rPr>
       <w:rFonts w:ascii="Courier New" w:hAnsi="Courier New" w:eastAsia="Times New Roman" w:cs="Cascadia Code"/>
       <w:sz w:val="21"/>
@@ -4106,10 +3777,7 @@
     <w:name w:val="TOC Heading"/>
     <w:basedOn w:val="Heading1"/>
     <w:next w:val="Normal"/>
-    <w:uiPriority w:val="39"/>
-    <w:unhideWhenUsed/>
-    <w:qFormat/>
-    <w:rsid w:val="00cd76ed"/>
+    <w:qFormat/>
     <w:pPr>
       <w:spacing w:lineRule="auto" w:line="259"/>
       <w:outlineLvl w:val="9"/>
@@ -4121,15 +3789,12 @@
     <w:basedOn w:val="Normal"/>
     <w:next w:val="Normal"/>
     <w:autoRedefine/>
-    <w:uiPriority w:val="39"/>
-    <w:unhideWhenUsed/>
-    <w:rsid w:val="00ad155b"/>
     <w:pPr>
       <w:spacing w:lineRule="auto" w:line="259" w:before="0" w:after="100"/>
       <w:ind w:left="220"/>
     </w:pPr>
     <w:rPr>
-      <w:rFonts w:ascii="Calibri" w:hAnsi="Calibri" w:eastAsia="" w:asciiTheme="minorHAnsi" w:eastAsiaTheme="minorEastAsia" w:hAnsiTheme="minorHAnsi"/>
+      <w:rFonts w:ascii="Calibri" w:hAnsi="Calibri" w:eastAsia="Calibri"/>
       <w:sz w:val="22"/>
       <w:szCs w:val="22"/>
     </w:rPr>
@@ -4139,14 +3804,11 @@
     <w:basedOn w:val="Normal"/>
     <w:next w:val="Normal"/>
     <w:autoRedefine/>
-    <w:uiPriority w:val="39"/>
-    <w:unhideWhenUsed/>
-    <w:rsid w:val="00ad155b"/>
     <w:pPr>
       <w:spacing w:lineRule="auto" w:line="259" w:before="0" w:after="100"/>
     </w:pPr>
     <w:rPr>
-      <w:rFonts w:ascii="Calibri" w:hAnsi="Calibri" w:eastAsia="" w:asciiTheme="minorHAnsi" w:eastAsiaTheme="minorEastAsia" w:hAnsiTheme="minorHAnsi"/>
+      <w:rFonts w:ascii="Calibri" w:hAnsi="Calibri" w:eastAsia="Calibri"/>
       <w:sz w:val="22"/>
       <w:szCs w:val="22"/>
     </w:rPr>
@@ -4156,53 +3818,47 @@
     <w:basedOn w:val="Normal"/>
     <w:next w:val="Normal"/>
     <w:autoRedefine/>
-    <w:uiPriority w:val="39"/>
-    <w:unhideWhenUsed/>
-    <w:rsid w:val="00ad155b"/>
     <w:pPr>
       <w:spacing w:lineRule="auto" w:line="259" w:before="0" w:after="100"/>
       <w:ind w:left="440"/>
     </w:pPr>
     <w:rPr>
-      <w:rFonts w:ascii="Calibri" w:hAnsi="Calibri" w:eastAsia="" w:asciiTheme="minorHAnsi" w:eastAsiaTheme="minorEastAsia" w:hAnsiTheme="minorHAnsi"/>
+      <w:rFonts w:ascii="Calibri" w:hAnsi="Calibri" w:eastAsia="Calibri"/>
       <w:sz w:val="22"/>
       <w:szCs w:val="22"/>
     </w:rPr>
   </w:style>
-  <w:style w:type="paragraph" w:styleId="H2" w:customStyle="1">
+  <w:style w:type="paragraph" w:styleId="H2">
     <w:name w:val="H2"/>
     <w:basedOn w:val="Heading2"/>
     <w:next w:val="P1"/>
     <w:link w:val="H2Char"/>
     <w:qFormat/>
-    <w:rsid w:val="00062cf8"/>
     <w:pPr/>
     <w:rPr>
       <w:rFonts w:ascii="Times New Roman" w:hAnsi="Times New Roman" w:cs="Times New Roman"/>
       <w:b/>
       <w:bCs/>
-      <w:color w:themeColor="text1" w:val="000000"/>
+      <w:color w:themeColor="dark1" w:val="000000"/>
       <w:sz w:val="28"/>
     </w:rPr>
   </w:style>
-  <w:style w:type="paragraph" w:styleId="P1" w:customStyle="1">
+  <w:style w:type="paragraph" w:styleId="P1">
     <w:name w:val="P"/>
     <w:basedOn w:val="Normal"/>
     <w:link w:val="P"/>
     <w:qFormat/>
-    <w:rsid w:val="00dc3221"/>
     <w:pPr>
       <w:jc w:val="both"/>
     </w:pPr>
     <w:rPr/>
   </w:style>
-  <w:style w:type="paragraph" w:styleId="H3" w:customStyle="1">
+  <w:style w:type="paragraph" w:styleId="H3">
     <w:name w:val="H3"/>
     <w:basedOn w:val="Heading3"/>
     <w:next w:val="P1"/>
     <w:link w:val="H3Char"/>
     <w:qFormat/>
-    <w:rsid w:val="00dc3221"/>
     <w:pPr/>
     <w:rPr>
       <w:rFonts w:ascii="Times New Roman" w:hAnsi="Times New Roman" w:cs="Times New Roman"/>
@@ -4218,9 +3874,7 @@
     <w:basedOn w:val="Normal"/>
     <w:next w:val="Normal"/>
     <w:link w:val="Style11"/>
-    <w:uiPriority w:val="29"/>
-    <w:qFormat/>
-    <w:rsid w:val="00d22788"/>
+    <w:qFormat/>
     <w:pPr>
       <w:spacing w:before="200" w:after="160"/>
       <w:ind w:left="864" w:right="864"/>
@@ -4229,17 +3883,21 @@
     <w:rPr>
       <w:i/>
       <w:iCs/>
-      <w:color w:themeColor="text1" w:themeTint="bf" w:val="404040"/>
+      <w:color w:themeColor="dark1" w:themeTint="bf" w:val="404040"/>
     </w:rPr>
   </w:style>
-  <w:style w:type="paragraph" w:styleId="H41" w:customStyle="1">
+  <w:style w:type="paragraph" w:styleId="H41">
     <w:name w:val="H4"/>
     <w:basedOn w:val="H3"/>
     <w:next w:val="P1"/>
     <w:link w:val="H4"/>
     <w:qFormat/>
-    <w:rsid w:val="00375986"/>
     <w:pPr>
+      <w:numPr>
+        <w:ilvl w:val="0"/>
+        <w:numId w:val="0"/>
+      </w:numPr>
+      <w:ind w:firstLine="851"/>
       <w:outlineLvl w:val="3"/>
     </w:pPr>
     <w:rPr/>
@@ -4248,10 +3906,7 @@
     <w:name w:val="HTML Preformatted"/>
     <w:basedOn w:val="Normal"/>
     <w:link w:val="HTML"/>
-    <w:uiPriority w:val="99"/>
-    <w:unhideWhenUsed/>
-    <w:qFormat/>
-    <w:rsid w:val="00485ae4"/>
+    <w:qFormat/>
     <w:pPr>
       <w:tabs>
         <w:tab w:val="clear" w:pos="851"/>
@@ -4281,28 +3936,36 @@
       <w:szCs w:val="20"/>
     </w:rPr>
   </w:style>
-  <w:style w:type="paragraph" w:styleId="H51" w:customStyle="1">
+  <w:style w:type="paragraph" w:styleId="H51">
     <w:name w:val="H5"/>
     <w:basedOn w:val="H41"/>
     <w:next w:val="P1"/>
     <w:link w:val="H5"/>
     <w:qFormat/>
-    <w:rsid w:val="00b7017d"/>
     <w:pPr>
+      <w:numPr>
+        <w:ilvl w:val="0"/>
+        <w:numId w:val="0"/>
+      </w:numPr>
+      <w:ind w:firstLine="851"/>
       <w:outlineLvl w:val="4"/>
     </w:pPr>
     <w:rPr>
       <w:smallCaps/>
     </w:rPr>
   </w:style>
-  <w:style w:type="paragraph" w:styleId="H61" w:customStyle="1">
+  <w:style w:type="paragraph" w:styleId="H61">
     <w:name w:val="H6"/>
     <w:basedOn w:val="P1"/>
     <w:next w:val="P1"/>
     <w:link w:val="H6"/>
     <w:qFormat/>
-    <w:rsid w:val="00b7017d"/>
     <w:pPr>
+      <w:numPr>
+        <w:ilvl w:val="0"/>
+        <w:numId w:val="0"/>
+      </w:numPr>
+      <w:ind w:firstLine="851"/>
       <w:outlineLvl w:val="5"/>
     </w:pPr>
     <w:rPr>
@@ -4311,13 +3974,12 @@
       <w:lang w:val="en-US"/>
     </w:rPr>
   </w:style>
-  <w:style w:type="paragraph" w:styleId="Code" w:customStyle="1">
+  <w:style w:type="paragraph" w:styleId="Code">
     <w:name w:val="Code"/>
     <w:basedOn w:val="Normal"/>
     <w:next w:val="P1"/>
     <w:link w:val="CodeChar"/>
     <w:qFormat/>
-    <w:rsid w:val="00e34056"/>
     <w:pPr>
       <w:spacing w:lineRule="auto" w:line="240"/>
       <w:ind w:hanging="0"/>
@@ -4400,26 +4062,9 @@
     </w:pPr>
     <w:rPr/>
   </w:style>
-  <w:style w:type="numbering" w:styleId="user3" w:default="1">
+  <w:style w:type="numbering" w:styleId="user3">
     <w:name w:val="Без маркерів (user)"/>
-    <w:uiPriority w:val="99"/>
-    <w:semiHidden/>
-    <w:unhideWhenUsed/>
-    <w:qFormat/>
-  </w:style>
-  <w:style w:type="table" w:default="1" w:styleId="a1">
-    <w:name w:val="Normal Table"/>
-    <w:uiPriority w:val="99"/>
-    <w:semiHidden/>
-    <w:unhideWhenUsed/>
-    <w:tblPr>
-      <w:tblCellMar>
-        <w:top w:w="0" w:type="dxa"/>
-        <w:left w:w="108" w:type="dxa"/>
-        <w:bottom w:w="0" w:type="dxa"/>
-        <w:right w:w="108" w:type="dxa"/>
-      </w:tblCellMar>
-    </w:tblPr>
+    <w:qFormat/>
   </w:style>
 </w:styles>
 </file>
@@ -4467,14 +4112,14 @@
     </a:clrScheme>
     <a:fontScheme name="Office">
       <a:majorFont>
-        <a:latin typeface="Calibri Light" panose="020F0302020204030204" pitchFamily="0" charset="1"/>
-        <a:ea typeface=""/>
-        <a:cs typeface=""/>
+        <a:latin typeface="Arial" pitchFamily="0" charset="1"/>
+        <a:ea typeface="DejaVu Sans" pitchFamily="0" charset="1"/>
+        <a:cs typeface="DejaVu Sans" pitchFamily="0" charset="1"/>
       </a:majorFont>
       <a:minorFont>
-        <a:latin typeface="Calibri" panose="020F0502020204030204" pitchFamily="0" charset="1"/>
-        <a:ea typeface=""/>
-        <a:cs typeface=""/>
+        <a:latin typeface="Arial" pitchFamily="0" charset="1"/>
+        <a:ea typeface="DejaVu Sans" pitchFamily="0" charset="1"/>
+        <a:cs typeface="DejaVu Sans" pitchFamily="0" charset="1"/>
       </a:minorFont>
     </a:fontScheme>
     <a:fmtScheme>
@@ -4482,67 +4127,25 @@
         <a:solidFill>
           <a:schemeClr val="phClr"/>
         </a:solidFill>
-        <a:gradFill>
-          <a:gsLst>
-            <a:gs pos="0">
-              <a:schemeClr val="phClr">
-                <a:lumMod val="110000"/>
-                <a:tint val="67000"/>
-              </a:schemeClr>
-            </a:gs>
-            <a:gs pos="50000">
-              <a:schemeClr val="phClr">
-                <a:lumMod val="105000"/>
-                <a:tint val="73000"/>
-              </a:schemeClr>
-            </a:gs>
-            <a:gs pos="100000">
-              <a:schemeClr val="phClr">
-                <a:lumMod val="105000"/>
-                <a:tint val="81000"/>
-              </a:schemeClr>
-            </a:gs>
-          </a:gsLst>
-          <a:lin ang="5400000" scaled="0"/>
-          <a:tileRect l="0" t="0" r="0" b="0"/>
-        </a:gradFill>
-        <a:gradFill>
-          <a:gsLst>
-            <a:gs pos="0">
-              <a:schemeClr val="phClr">
-                <a:lumMod val="102000"/>
-                <a:tint val="94000"/>
-              </a:schemeClr>
-            </a:gs>
-            <a:gs pos="50000">
-              <a:schemeClr val="phClr">
-                <a:lumMod val="100000"/>
-                <a:shade val="100000"/>
-              </a:schemeClr>
-            </a:gs>
-            <a:gs pos="100000">
-              <a:schemeClr val="phClr">
-                <a:lumMod val="99000"/>
-                <a:shade val="78000"/>
-              </a:schemeClr>
-            </a:gs>
-          </a:gsLst>
-          <a:lin ang="5400000" scaled="0"/>
-          <a:tileRect l="0" t="0" r="0" b="0"/>
-        </a:gradFill>
+        <a:solidFill>
+          <a:schemeClr val="phClr"/>
+        </a:solidFill>
+        <a:solidFill>
+          <a:schemeClr val="phClr"/>
+        </a:solidFill>
       </a:fillStyleLst>
       <a:lnStyleLst>
         <a:ln w="6350" cap="flat" cmpd="sng" algn="ctr">
           <a:prstDash val="solid"/>
-          <a:miter lim="800000"/>
+          <a:miter/>
         </a:ln>
-        <a:ln w="12700" cap="flat" cmpd="sng" algn="ctr">
+        <a:ln w="6350" cap="flat" cmpd="sng" algn="ctr">
           <a:prstDash val="solid"/>
-          <a:miter lim="800000"/>
+          <a:miter/>
         </a:ln>
-        <a:ln w="19050" cap="flat" cmpd="sng" algn="ctr">
+        <a:ln w="6350" cap="flat" cmpd="sng" algn="ctr">
           <a:prstDash val="solid"/>
-          <a:miter lim="800000"/>
+          <a:miter/>
         </a:ln>
       </a:lnStyleLst>
       <a:effectStyleLst>
@@ -4561,49 +4164,13 @@
           <a:schemeClr val="phClr"/>
         </a:solidFill>
         <a:solidFill>
-          <a:schemeClr val="phClr">
-            <a:tint val="95000"/>
-          </a:schemeClr>
+          <a:schemeClr val="phClr"/>
         </a:solidFill>
-        <a:gradFill>
-          <a:gsLst>
-            <a:gs pos="0">
-              <a:schemeClr val="phClr">
-                <a:tint val="93000"/>
-                <a:shade val="98000"/>
-                <a:lumMod val="102000"/>
-              </a:schemeClr>
-            </a:gs>
-            <a:gs pos="50000">
-              <a:schemeClr val="phClr">
-                <a:tint val="98000"/>
-                <a:shade val="90000"/>
-                <a:lumMod val="103000"/>
-              </a:schemeClr>
-            </a:gs>
-            <a:gs pos="100000">
-              <a:schemeClr val="phClr">
-                <a:shade val="63000"/>
-              </a:schemeClr>
-            </a:gs>
-          </a:gsLst>
-          <a:lin ang="5400000" scaled="0"/>
-          <a:tileRect l="0" t="0" r="0" b="0"/>
-        </a:gradFill>
+        <a:solidFill>
+          <a:schemeClr val="phClr"/>
+        </a:solidFill>
       </a:bgFillStyleLst>
     </a:fmtScheme>
   </a:themeElements>
 </a:theme>
-</file>
-
-<file path=customXml/item1.xml><?xml version="1.0" encoding="utf-8"?>
-<b:Sources xmlns:b="http://schemas.openxmlformats.org/officeDocument/2006/bibliography" xmlns="http://schemas.openxmlformats.org/officeDocument/2006/bibliography" SelectedStyle="\APASixthEditionOfficeOnline.xsl" StyleName="APA" Version="6"/>
-</file>
-
-<file path=customXml/itemProps1.xml><?xml version="1.0" encoding="utf-8"?>
-<ds:datastoreItem xmlns:ds="http://schemas.openxmlformats.org/officeDocument/2006/customXml" ds:itemID="{9CDA793C-AEE6-46D5-A769-7A5C37E1E6C2}">
-  <ds:schemaRefs>
-    <ds:schemaRef ds:uri="http://schemas.openxmlformats.org/officeDocument/2006/bibliography"/>
-  </ds:schemaRefs>
-</ds:datastoreItem>
 </file>
</xml_diff>

<commit_message>
feat: finish lab 1
</commit_message>
<xml_diff>
--- a/42SI Stvorennja IDE/1/SI_KNT-122_Onyshchenko_19_PR1.docx
+++ b/42SI Stvorennja IDE/1/SI_KNT-122_Onyshchenko_19_PR1.docx
@@ -324,7 +324,7 @@
         <w:tab/>
         <w:tab/>
         <w:tab/>
-        <w:t>Льовкін В.М.</w:t>
+        <w:t>Дейнега Л.Ю.</w:t>
       </w:r>
     </w:p>
     <w:p>
@@ -409,6 +409,7 @@
       <w:pPr>
         <w:pStyle w:val="h11"/>
         <w:spacing w:before="0" w:after="0"/>
+        <w:ind w:hanging="0" w:left="0"/>
         <w:rPr/>
       </w:pPr>
       <w:r>
@@ -453,6 +454,7 @@
     <w:p>
       <w:pPr>
         <w:pStyle w:val="h11"/>
+        <w:ind w:hanging="0" w:left="0"/>
         <w:rPr/>
       </w:pPr>
       <w:r>
@@ -737,6 +739,7 @@
     <w:p>
       <w:pPr>
         <w:pStyle w:val="h11"/>
+        <w:ind w:hanging="0" w:left="0"/>
         <w:rPr/>
       </w:pPr>
       <w:r>
@@ -747,6 +750,7 @@
     <w:p>
       <w:pPr>
         <w:pStyle w:val="H2"/>
+        <w:ind w:firstLine="851" w:left="0"/>
         <w:rPr/>
       </w:pPr>
       <w:r>
@@ -2710,6 +2714,7 @@
     <w:p>
       <w:pPr>
         <w:pStyle w:val="H2"/>
+        <w:ind w:firstLine="851" w:left="0"/>
         <w:rPr/>
       </w:pPr>
       <w:r>
@@ -2963,27 +2968,37 @@
         <w:pStyle w:val="P1"/>
         <w:rPr>
           <w:i/>
+          <w:iCs/>
+          <w:lang w:val="en-US"/>
+        </w:rPr>
+      </w:pPr>
+      <w:r>
+        <w:rPr>
           <w:i/>
           <w:iCs/>
           <w:lang w:val="en-US"/>
         </w:rPr>
-      </w:pPr>
-      <w:r>
-        <w:rPr/>
       </w:r>
     </w:p>
     <w:p>
       <w:pPr>
         <w:pStyle w:val="H2"/>
-        <w:rPr/>
-      </w:pPr>
-      <w:r>
-        <w:rPr/>
-        <w:t xml:space="preserve">3 </w:t>
-      </w:r>
-      <w:r>
-        <w:rPr/>
-        <w:t>Інтерфейс роботи з програмою в декількох режимах</w:t>
+        <w:ind w:firstLine="851" w:left="0"/>
+        <w:rPr/>
+      </w:pPr>
+      <w:r>
+        <w:rPr/>
+        <w:t>3 Інтерфейс роботи з програмою в декількох режимах</w:t>
+      </w:r>
+    </w:p>
+    <w:p>
+      <w:pPr>
+        <w:pStyle w:val="H3"/>
+        <w:rPr/>
+      </w:pPr>
+      <w:r>
+        <w:rPr/>
+        <w:t>Код</w:t>
       </w:r>
     </w:p>
     <w:p>
@@ -2993,6 +3008,1557 @@
       </w:pPr>
       <w:r>
         <w:rPr/>
+      </w:r>
+    </w:p>
+    <w:p>
+      <w:pPr>
+        <w:pStyle w:val="Code"/>
+        <w:rPr>
+          <w:rFonts w:ascii="Consolas" w:hAnsi="Consolas"/>
+        </w:rPr>
+      </w:pPr>
+      <w:r>
+        <w:rPr>
+          <w:rFonts w:ascii="Consolas" w:hAnsi="Consolas"/>
+        </w:rPr>
+        <w:t>import javax.swing.*;</w:t>
+      </w:r>
+    </w:p>
+    <w:p>
+      <w:pPr>
+        <w:pStyle w:val="Code"/>
+        <w:rPr>
+          <w:rFonts w:ascii="Consolas" w:hAnsi="Consolas"/>
+        </w:rPr>
+      </w:pPr>
+      <w:r>
+        <w:rPr>
+          <w:rFonts w:ascii="Consolas" w:hAnsi="Consolas"/>
+        </w:rPr>
+        <w:t>import javax.swing.event.DocumentEvent;</w:t>
+      </w:r>
+    </w:p>
+    <w:p>
+      <w:pPr>
+        <w:pStyle w:val="Code"/>
+        <w:rPr>
+          <w:rFonts w:ascii="Consolas" w:hAnsi="Consolas"/>
+        </w:rPr>
+      </w:pPr>
+      <w:r>
+        <w:rPr>
+          <w:rFonts w:ascii="Consolas" w:hAnsi="Consolas"/>
+        </w:rPr>
+        <w:t>import javax.swing.event.DocumentListener;</w:t>
+      </w:r>
+    </w:p>
+    <w:p>
+      <w:pPr>
+        <w:pStyle w:val="Code"/>
+        <w:rPr>
+          <w:rFonts w:ascii="Consolas" w:hAnsi="Consolas"/>
+        </w:rPr>
+      </w:pPr>
+      <w:r>
+        <w:rPr>
+          <w:rFonts w:ascii="Consolas" w:hAnsi="Consolas"/>
+        </w:rPr>
+        <w:t>import java.awt.*;</w:t>
+      </w:r>
+    </w:p>
+    <w:p>
+      <w:pPr>
+        <w:pStyle w:val="Code"/>
+        <w:rPr>
+          <w:rFonts w:ascii="Consolas" w:hAnsi="Consolas"/>
+        </w:rPr>
+      </w:pPr>
+      <w:r>
+        <w:rPr>
+          <w:rFonts w:ascii="Consolas" w:hAnsi="Consolas"/>
+        </w:rPr>
+        <w:t>import java.awt.event.ActionEvent;</w:t>
+      </w:r>
+    </w:p>
+    <w:p>
+      <w:pPr>
+        <w:pStyle w:val="Code"/>
+        <w:rPr>
+          <w:rFonts w:ascii="Consolas" w:hAnsi="Consolas"/>
+        </w:rPr>
+      </w:pPr>
+      <w:r>
+        <w:rPr>
+          <w:rFonts w:ascii="Consolas" w:hAnsi="Consolas"/>
+        </w:rPr>
+        <w:t>import java.awt.event.ActionListener;</w:t>
+      </w:r>
+    </w:p>
+    <w:p>
+      <w:pPr>
+        <w:pStyle w:val="Code"/>
+        <w:rPr>
+          <w:rFonts w:ascii="Consolas" w:hAnsi="Consolas"/>
+        </w:rPr>
+      </w:pPr>
+      <w:r>
+        <w:rPr>
+          <w:rFonts w:ascii="Consolas" w:hAnsi="Consolas"/>
+        </w:rPr>
+        <w:t>import java.io.*;</w:t>
+      </w:r>
+    </w:p>
+    <w:p>
+      <w:pPr>
+        <w:pStyle w:val="Code"/>
+        <w:rPr>
+          <w:rFonts w:ascii="Consolas" w:hAnsi="Consolas"/>
+        </w:rPr>
+      </w:pPr>
+      <w:r>
+        <w:rPr>
+          <w:rFonts w:ascii="Consolas" w:hAnsi="Consolas"/>
+        </w:rPr>
+      </w:r>
+    </w:p>
+    <w:p>
+      <w:pPr>
+        <w:pStyle w:val="Code"/>
+        <w:rPr>
+          <w:rFonts w:ascii="Consolas" w:hAnsi="Consolas"/>
+        </w:rPr>
+      </w:pPr>
+      <w:r>
+        <w:rPr>
+          <w:rFonts w:ascii="Consolas" w:hAnsi="Consolas"/>
+        </w:rPr>
+        <w:t>import gen.RustLexer;</w:t>
+      </w:r>
+    </w:p>
+    <w:p>
+      <w:pPr>
+        <w:pStyle w:val="Code"/>
+        <w:rPr>
+          <w:rFonts w:ascii="Consolas" w:hAnsi="Consolas"/>
+        </w:rPr>
+      </w:pPr>
+      <w:r>
+        <w:rPr>
+          <w:rFonts w:ascii="Consolas" w:hAnsi="Consolas"/>
+        </w:rPr>
+        <w:t>import gen.RustParser;</w:t>
+      </w:r>
+    </w:p>
+    <w:p>
+      <w:pPr>
+        <w:pStyle w:val="Code"/>
+        <w:rPr>
+          <w:rFonts w:ascii="Consolas" w:hAnsi="Consolas"/>
+        </w:rPr>
+      </w:pPr>
+      <w:r>
+        <w:rPr>
+          <w:rFonts w:ascii="Consolas" w:hAnsi="Consolas"/>
+        </w:rPr>
+        <w:t>import org.antlr.v4.runtime.*;</w:t>
+      </w:r>
+    </w:p>
+    <w:p>
+      <w:pPr>
+        <w:pStyle w:val="Code"/>
+        <w:rPr>
+          <w:rFonts w:ascii="Consolas" w:hAnsi="Consolas"/>
+        </w:rPr>
+      </w:pPr>
+      <w:r>
+        <w:rPr>
+          <w:rFonts w:ascii="Consolas" w:hAnsi="Consolas"/>
+        </w:rPr>
+        <w:t>import org.antlr.v4.runtime.tree.*;</w:t>
+      </w:r>
+    </w:p>
+    <w:p>
+      <w:pPr>
+        <w:pStyle w:val="Code"/>
+        <w:rPr>
+          <w:rFonts w:ascii="Consolas" w:hAnsi="Consolas"/>
+        </w:rPr>
+      </w:pPr>
+      <w:r>
+        <w:rPr>
+          <w:rFonts w:ascii="Consolas" w:hAnsi="Consolas"/>
+        </w:rPr>
+      </w:r>
+    </w:p>
+    <w:p>
+      <w:pPr>
+        <w:pStyle w:val="Code"/>
+        <w:rPr>
+          <w:rFonts w:ascii="Consolas" w:hAnsi="Consolas"/>
+        </w:rPr>
+      </w:pPr>
+      <w:r>
+        <w:rPr>
+          <w:rFonts w:ascii="Consolas" w:hAnsi="Consolas"/>
+        </w:rPr>
+        <w:t>public class Main {</w:t>
+      </w:r>
+    </w:p>
+    <w:p>
+      <w:pPr>
+        <w:pStyle w:val="Code"/>
+        <w:rPr>
+          <w:rFonts w:ascii="Consolas" w:hAnsi="Consolas"/>
+        </w:rPr>
+      </w:pPr>
+      <w:r>
+        <w:rPr>
+          <w:rFonts w:ascii="Consolas" w:hAnsi="Consolas"/>
+        </w:rPr>
+        <w:t xml:space="preserve">    </w:t>
+      </w:r>
+      <w:r>
+        <w:rPr>
+          <w:rFonts w:ascii="Consolas" w:hAnsi="Consolas"/>
+        </w:rPr>
+        <w:t>public static String appName = "42SI.1 Text Editor";</w:t>
+      </w:r>
+    </w:p>
+    <w:p>
+      <w:pPr>
+        <w:pStyle w:val="Code"/>
+        <w:rPr>
+          <w:rFonts w:ascii="Consolas" w:hAnsi="Consolas"/>
+        </w:rPr>
+      </w:pPr>
+      <w:r>
+        <w:rPr>
+          <w:rFonts w:ascii="Consolas" w:hAnsi="Consolas"/>
+        </w:rPr>
+      </w:r>
+    </w:p>
+    <w:p>
+      <w:pPr>
+        <w:pStyle w:val="Code"/>
+        <w:rPr>
+          <w:rFonts w:ascii="Consolas" w:hAnsi="Consolas"/>
+        </w:rPr>
+      </w:pPr>
+      <w:r>
+        <w:rPr>
+          <w:rFonts w:ascii="Consolas" w:hAnsi="Consolas"/>
+        </w:rPr>
+        <w:t xml:space="preserve">    </w:t>
+      </w:r>
+      <w:r>
+        <w:rPr>
+          <w:rFonts w:ascii="Consolas" w:hAnsi="Consolas"/>
+        </w:rPr>
+        <w:t>public static void main(String[] args) {</w:t>
+      </w:r>
+    </w:p>
+    <w:p>
+      <w:pPr>
+        <w:pStyle w:val="Code"/>
+        <w:rPr>
+          <w:rFonts w:ascii="Consolas" w:hAnsi="Consolas"/>
+        </w:rPr>
+      </w:pPr>
+      <w:r>
+        <w:rPr>
+          <w:rFonts w:ascii="Consolas" w:hAnsi="Consolas"/>
+        </w:rPr>
+        <w:t xml:space="preserve">        </w:t>
+      </w:r>
+      <w:r>
+        <w:rPr>
+          <w:rFonts w:ascii="Consolas" w:hAnsi="Consolas"/>
+        </w:rPr>
+        <w:t>String initialText = "fn main() {\n  let x = 10;\n  println!('Jesus is LORD')\n  let y = 30;\n\n  for (int i = 0; i &lt;= 10; i++} {\n    println!('Jesus is KING', i)\n  }\n}";</w:t>
+      </w:r>
+    </w:p>
+    <w:p>
+      <w:pPr>
+        <w:pStyle w:val="Code"/>
+        <w:rPr>
+          <w:rFonts w:ascii="Consolas" w:hAnsi="Consolas"/>
+        </w:rPr>
+      </w:pPr>
+      <w:r>
+        <w:rPr>
+          <w:rFonts w:ascii="Consolas" w:hAnsi="Consolas"/>
+        </w:rPr>
+        <w:t xml:space="preserve">        </w:t>
+      </w:r>
+      <w:r>
+        <w:rPr>
+          <w:rFonts w:ascii="Consolas" w:hAnsi="Consolas"/>
+        </w:rPr>
+        <w:t>JFrame frame = new JFrame(appName);</w:t>
+      </w:r>
+    </w:p>
+    <w:p>
+      <w:pPr>
+        <w:pStyle w:val="Code"/>
+        <w:rPr>
+          <w:rFonts w:ascii="Consolas" w:hAnsi="Consolas"/>
+        </w:rPr>
+      </w:pPr>
+      <w:r>
+        <w:rPr>
+          <w:rFonts w:ascii="Consolas" w:hAnsi="Consolas"/>
+        </w:rPr>
+        <w:t xml:space="preserve">        </w:t>
+      </w:r>
+      <w:r>
+        <w:rPr>
+          <w:rFonts w:ascii="Consolas" w:hAnsi="Consolas"/>
+        </w:rPr>
+        <w:t>JTextArea inputField = new JTextArea(initialText);</w:t>
+      </w:r>
+    </w:p>
+    <w:p>
+      <w:pPr>
+        <w:pStyle w:val="Code"/>
+        <w:rPr>
+          <w:rFonts w:ascii="Consolas" w:hAnsi="Consolas"/>
+        </w:rPr>
+      </w:pPr>
+      <w:r>
+        <w:rPr>
+          <w:rFonts w:ascii="Consolas" w:hAnsi="Consolas"/>
+        </w:rPr>
+        <w:t xml:space="preserve">        </w:t>
+      </w:r>
+      <w:r>
+        <w:rPr>
+          <w:rFonts w:ascii="Consolas" w:hAnsi="Consolas"/>
+        </w:rPr>
+        <w:t>inputField.setFont(new Font("Consolas", Font.PLAIN, 14));</w:t>
+      </w:r>
+    </w:p>
+    <w:p>
+      <w:pPr>
+        <w:pStyle w:val="Code"/>
+        <w:rPr>
+          <w:rFonts w:ascii="Consolas" w:hAnsi="Consolas"/>
+        </w:rPr>
+      </w:pPr>
+      <w:r>
+        <w:rPr>
+          <w:rFonts w:ascii="Consolas" w:hAnsi="Consolas"/>
+        </w:rPr>
+        <w:t xml:space="preserve">        </w:t>
+      </w:r>
+      <w:r>
+        <w:rPr>
+          <w:rFonts w:ascii="Consolas" w:hAnsi="Consolas"/>
+        </w:rPr>
+        <w:t>JTextArea outputField = new JTextArea();</w:t>
+      </w:r>
+    </w:p>
+    <w:p>
+      <w:pPr>
+        <w:pStyle w:val="Code"/>
+        <w:rPr>
+          <w:rFonts w:ascii="Consolas" w:hAnsi="Consolas"/>
+        </w:rPr>
+      </w:pPr>
+      <w:r>
+        <w:rPr>
+          <w:rFonts w:ascii="Consolas" w:hAnsi="Consolas"/>
+        </w:rPr>
+        <w:t xml:space="preserve">        </w:t>
+      </w:r>
+      <w:r>
+        <w:rPr>
+          <w:rFonts w:ascii="Consolas" w:hAnsi="Consolas"/>
+        </w:rPr>
+        <w:t>JButton analyze = new JButton("Analyze");</w:t>
+      </w:r>
+    </w:p>
+    <w:p>
+      <w:pPr>
+        <w:pStyle w:val="Code"/>
+        <w:rPr>
+          <w:rFonts w:ascii="Consolas" w:hAnsi="Consolas"/>
+        </w:rPr>
+      </w:pPr>
+      <w:r>
+        <w:rPr>
+          <w:rFonts w:ascii="Consolas" w:hAnsi="Consolas"/>
+        </w:rPr>
+        <w:t xml:space="preserve">        </w:t>
+      </w:r>
+      <w:r>
+        <w:rPr>
+          <w:rFonts w:ascii="Consolas" w:hAnsi="Consolas"/>
+        </w:rPr>
+        <w:t>JButton upload = new JButton("Upload");</w:t>
+      </w:r>
+    </w:p>
+    <w:p>
+      <w:pPr>
+        <w:pStyle w:val="Code"/>
+        <w:rPr>
+          <w:rFonts w:ascii="Consolas" w:hAnsi="Consolas"/>
+        </w:rPr>
+      </w:pPr>
+      <w:r>
+        <w:rPr>
+          <w:rFonts w:ascii="Consolas" w:hAnsi="Consolas"/>
+        </w:rPr>
+      </w:r>
+    </w:p>
+    <w:p>
+      <w:pPr>
+        <w:pStyle w:val="Code"/>
+        <w:rPr>
+          <w:rFonts w:ascii="Consolas" w:hAnsi="Consolas"/>
+        </w:rPr>
+      </w:pPr>
+      <w:r>
+        <w:rPr>
+          <w:rFonts w:ascii="Consolas" w:hAnsi="Consolas"/>
+        </w:rPr>
+        <w:t xml:space="preserve">        </w:t>
+      </w:r>
+      <w:r>
+        <w:rPr>
+          <w:rFonts w:ascii="Consolas" w:hAnsi="Consolas"/>
+        </w:rPr>
+        <w:t>JPanel panel = new JPanel();</w:t>
+      </w:r>
+    </w:p>
+    <w:p>
+      <w:pPr>
+        <w:pStyle w:val="Code"/>
+        <w:rPr>
+          <w:rFonts w:ascii="Consolas" w:hAnsi="Consolas"/>
+        </w:rPr>
+      </w:pPr>
+      <w:r>
+        <w:rPr>
+          <w:rFonts w:ascii="Consolas" w:hAnsi="Consolas"/>
+        </w:rPr>
+        <w:t xml:space="preserve">        </w:t>
+      </w:r>
+      <w:r>
+        <w:rPr>
+          <w:rFonts w:ascii="Consolas" w:hAnsi="Consolas"/>
+        </w:rPr>
+        <w:t>panel.setLayout(new FlowLayout());</w:t>
+      </w:r>
+    </w:p>
+    <w:p>
+      <w:pPr>
+        <w:pStyle w:val="Code"/>
+        <w:rPr>
+          <w:rFonts w:ascii="Consolas" w:hAnsi="Consolas"/>
+        </w:rPr>
+      </w:pPr>
+      <w:r>
+        <w:rPr>
+          <w:rFonts w:ascii="Consolas" w:hAnsi="Consolas"/>
+        </w:rPr>
+        <w:t xml:space="preserve">        </w:t>
+      </w:r>
+      <w:r>
+        <w:rPr>
+          <w:rFonts w:ascii="Consolas" w:hAnsi="Consolas"/>
+        </w:rPr>
+        <w:t>panel.add(analyze);</w:t>
+      </w:r>
+    </w:p>
+    <w:p>
+      <w:pPr>
+        <w:pStyle w:val="Code"/>
+        <w:rPr>
+          <w:rFonts w:ascii="Consolas" w:hAnsi="Consolas"/>
+        </w:rPr>
+      </w:pPr>
+      <w:r>
+        <w:rPr>
+          <w:rFonts w:ascii="Consolas" w:hAnsi="Consolas"/>
+        </w:rPr>
+        <w:t xml:space="preserve">        </w:t>
+      </w:r>
+      <w:r>
+        <w:rPr>
+          <w:rFonts w:ascii="Consolas" w:hAnsi="Consolas"/>
+        </w:rPr>
+        <w:t>panel.add(upload);</w:t>
+      </w:r>
+    </w:p>
+    <w:p>
+      <w:pPr>
+        <w:pStyle w:val="Code"/>
+        <w:rPr>
+          <w:rFonts w:ascii="Consolas" w:hAnsi="Consolas"/>
+        </w:rPr>
+      </w:pPr>
+      <w:r>
+        <w:rPr>
+          <w:rFonts w:ascii="Consolas" w:hAnsi="Consolas"/>
+        </w:rPr>
+      </w:r>
+    </w:p>
+    <w:p>
+      <w:pPr>
+        <w:pStyle w:val="Code"/>
+        <w:rPr>
+          <w:rFonts w:ascii="Consolas" w:hAnsi="Consolas"/>
+        </w:rPr>
+      </w:pPr>
+      <w:r>
+        <w:rPr>
+          <w:rFonts w:ascii="Consolas" w:hAnsi="Consolas"/>
+        </w:rPr>
+        <w:t xml:space="preserve">        </w:t>
+      </w:r>
+      <w:r>
+        <w:rPr>
+          <w:rFonts w:ascii="Consolas" w:hAnsi="Consolas"/>
+        </w:rPr>
+        <w:t>frame.setLayout(new GridLayout(3,1));</w:t>
+      </w:r>
+    </w:p>
+    <w:p>
+      <w:pPr>
+        <w:pStyle w:val="Code"/>
+        <w:rPr>
+          <w:rFonts w:ascii="Consolas" w:hAnsi="Consolas"/>
+        </w:rPr>
+      </w:pPr>
+      <w:r>
+        <w:rPr>
+          <w:rFonts w:ascii="Consolas" w:hAnsi="Consolas"/>
+        </w:rPr>
+        <w:t xml:space="preserve">        </w:t>
+      </w:r>
+      <w:r>
+        <w:rPr>
+          <w:rFonts w:ascii="Consolas" w:hAnsi="Consolas"/>
+        </w:rPr>
+        <w:t>frame.add(inputField);</w:t>
+      </w:r>
+    </w:p>
+    <w:p>
+      <w:pPr>
+        <w:pStyle w:val="Code"/>
+        <w:rPr>
+          <w:rFonts w:ascii="Consolas" w:hAnsi="Consolas"/>
+        </w:rPr>
+      </w:pPr>
+      <w:r>
+        <w:rPr>
+          <w:rFonts w:ascii="Consolas" w:hAnsi="Consolas"/>
+        </w:rPr>
+        <w:t xml:space="preserve">        </w:t>
+      </w:r>
+      <w:r>
+        <w:rPr>
+          <w:rFonts w:ascii="Consolas" w:hAnsi="Consolas"/>
+        </w:rPr>
+        <w:t>JScrollPane inputScroll = new JScrollPane(inputField);</w:t>
+      </w:r>
+    </w:p>
+    <w:p>
+      <w:pPr>
+        <w:pStyle w:val="Code"/>
+        <w:rPr>
+          <w:rFonts w:ascii="Consolas" w:hAnsi="Consolas"/>
+        </w:rPr>
+      </w:pPr>
+      <w:r>
+        <w:rPr>
+          <w:rFonts w:ascii="Consolas" w:hAnsi="Consolas"/>
+        </w:rPr>
+        <w:t xml:space="preserve">        </w:t>
+      </w:r>
+      <w:r>
+        <w:rPr>
+          <w:rFonts w:ascii="Consolas" w:hAnsi="Consolas"/>
+        </w:rPr>
+        <w:t>frame.add(inputScroll);</w:t>
+      </w:r>
+    </w:p>
+    <w:p>
+      <w:pPr>
+        <w:pStyle w:val="Code"/>
+        <w:rPr>
+          <w:rFonts w:ascii="Consolas" w:hAnsi="Consolas"/>
+        </w:rPr>
+      </w:pPr>
+      <w:r>
+        <w:rPr>
+          <w:rFonts w:ascii="Consolas" w:hAnsi="Consolas"/>
+        </w:rPr>
+        <w:t xml:space="preserve">        </w:t>
+      </w:r>
+      <w:r>
+        <w:rPr>
+          <w:rFonts w:ascii="Consolas" w:hAnsi="Consolas"/>
+        </w:rPr>
+        <w:t>frame.add(panel);</w:t>
+      </w:r>
+    </w:p>
+    <w:p>
+      <w:pPr>
+        <w:pStyle w:val="Code"/>
+        <w:rPr>
+          <w:rFonts w:ascii="Consolas" w:hAnsi="Consolas"/>
+        </w:rPr>
+      </w:pPr>
+      <w:r>
+        <w:rPr>
+          <w:rFonts w:ascii="Consolas" w:hAnsi="Consolas"/>
+        </w:rPr>
+        <w:t xml:space="preserve">        </w:t>
+      </w:r>
+      <w:r>
+        <w:rPr>
+          <w:rFonts w:ascii="Consolas" w:hAnsi="Consolas"/>
+        </w:rPr>
+        <w:t>frame.add(outputField);</w:t>
+      </w:r>
+    </w:p>
+    <w:p>
+      <w:pPr>
+        <w:pStyle w:val="Code"/>
+        <w:rPr>
+          <w:rFonts w:ascii="Consolas" w:hAnsi="Consolas"/>
+        </w:rPr>
+      </w:pPr>
+      <w:r>
+        <w:rPr>
+          <w:rFonts w:ascii="Consolas" w:hAnsi="Consolas"/>
+        </w:rPr>
+        <w:t xml:space="preserve">        </w:t>
+      </w:r>
+      <w:r>
+        <w:rPr>
+          <w:rFonts w:ascii="Consolas" w:hAnsi="Consolas"/>
+        </w:rPr>
+        <w:t>JScrollPane outputScroll = new JScrollPane(outputField);</w:t>
+      </w:r>
+    </w:p>
+    <w:p>
+      <w:pPr>
+        <w:pStyle w:val="Code"/>
+        <w:rPr>
+          <w:rFonts w:ascii="Consolas" w:hAnsi="Consolas"/>
+        </w:rPr>
+      </w:pPr>
+      <w:r>
+        <w:rPr>
+          <w:rFonts w:ascii="Consolas" w:hAnsi="Consolas"/>
+        </w:rPr>
+        <w:t xml:space="preserve">        </w:t>
+      </w:r>
+      <w:r>
+        <w:rPr>
+          <w:rFonts w:ascii="Consolas" w:hAnsi="Consolas"/>
+        </w:rPr>
+        <w:t>frame.add(outputScroll);</w:t>
+      </w:r>
+    </w:p>
+    <w:p>
+      <w:pPr>
+        <w:pStyle w:val="Code"/>
+        <w:rPr>
+          <w:rFonts w:ascii="Consolas" w:hAnsi="Consolas"/>
+        </w:rPr>
+      </w:pPr>
+      <w:r>
+        <w:rPr>
+          <w:rFonts w:ascii="Consolas" w:hAnsi="Consolas"/>
+        </w:rPr>
+        <w:t xml:space="preserve">        </w:t>
+      </w:r>
+      <w:r>
+        <w:rPr>
+          <w:rFonts w:ascii="Consolas" w:hAnsi="Consolas"/>
+        </w:rPr>
+        <w:t>outputField.setEditable(false);</w:t>
+      </w:r>
+    </w:p>
+    <w:p>
+      <w:pPr>
+        <w:pStyle w:val="Code"/>
+        <w:rPr>
+          <w:rFonts w:ascii="Consolas" w:hAnsi="Consolas"/>
+        </w:rPr>
+      </w:pPr>
+      <w:r>
+        <w:rPr>
+          <w:rFonts w:ascii="Consolas" w:hAnsi="Consolas"/>
+        </w:rPr>
+      </w:r>
+    </w:p>
+    <w:p>
+      <w:pPr>
+        <w:pStyle w:val="Code"/>
+        <w:rPr>
+          <w:rFonts w:ascii="Consolas" w:hAnsi="Consolas"/>
+        </w:rPr>
+      </w:pPr>
+      <w:r>
+        <w:rPr>
+          <w:rFonts w:ascii="Consolas" w:hAnsi="Consolas"/>
+        </w:rPr>
+        <w:t xml:space="preserve">        </w:t>
+      </w:r>
+      <w:r>
+        <w:rPr>
+          <w:rFonts w:ascii="Consolas" w:hAnsi="Consolas"/>
+        </w:rPr>
+        <w:t>analyze.addActionListener(e -&gt; {</w:t>
+      </w:r>
+    </w:p>
+    <w:p>
+      <w:pPr>
+        <w:pStyle w:val="Code"/>
+        <w:rPr>
+          <w:rFonts w:ascii="Consolas" w:hAnsi="Consolas"/>
+        </w:rPr>
+      </w:pPr>
+      <w:r>
+        <w:rPr>
+          <w:rFonts w:ascii="Consolas" w:hAnsi="Consolas"/>
+        </w:rPr>
+        <w:t xml:space="preserve">            </w:t>
+      </w:r>
+      <w:r>
+        <w:rPr>
+          <w:rFonts w:ascii="Consolas" w:hAnsi="Consolas"/>
+        </w:rPr>
+        <w:t>outputField.setText("");</w:t>
+      </w:r>
+    </w:p>
+    <w:p>
+      <w:pPr>
+        <w:pStyle w:val="Code"/>
+        <w:rPr>
+          <w:rFonts w:ascii="Consolas" w:hAnsi="Consolas"/>
+        </w:rPr>
+      </w:pPr>
+      <w:r>
+        <w:rPr>
+          <w:rFonts w:ascii="Consolas" w:hAnsi="Consolas"/>
+        </w:rPr>
+        <w:t xml:space="preserve">            </w:t>
+      </w:r>
+      <w:r>
+        <w:rPr>
+          <w:rFonts w:ascii="Consolas" w:hAnsi="Consolas"/>
+        </w:rPr>
+        <w:t>RustLexer lexer = new RustLexer(CharStreams.fromString(inputField.getText()));</w:t>
+      </w:r>
+    </w:p>
+    <w:p>
+      <w:pPr>
+        <w:pStyle w:val="Code"/>
+        <w:rPr>
+          <w:rFonts w:ascii="Consolas" w:hAnsi="Consolas"/>
+        </w:rPr>
+      </w:pPr>
+      <w:r>
+        <w:rPr>
+          <w:rFonts w:ascii="Consolas" w:hAnsi="Consolas"/>
+        </w:rPr>
+        <w:t xml:space="preserve">            </w:t>
+      </w:r>
+      <w:r>
+        <w:rPr>
+          <w:rFonts w:ascii="Consolas" w:hAnsi="Consolas"/>
+        </w:rPr>
+        <w:t>CommonTokenStream tokens = new CommonTokenStream(lexer);</w:t>
+      </w:r>
+    </w:p>
+    <w:p>
+      <w:pPr>
+        <w:pStyle w:val="Code"/>
+        <w:rPr>
+          <w:rFonts w:ascii="Consolas" w:hAnsi="Consolas"/>
+        </w:rPr>
+      </w:pPr>
+      <w:r>
+        <w:rPr>
+          <w:rFonts w:ascii="Consolas" w:hAnsi="Consolas"/>
+        </w:rPr>
+        <w:t xml:space="preserve">            </w:t>
+      </w:r>
+      <w:r>
+        <w:rPr>
+          <w:rFonts w:ascii="Consolas" w:hAnsi="Consolas"/>
+        </w:rPr>
+        <w:t>RustParser parser = new RustParser(tokens);</w:t>
+      </w:r>
+    </w:p>
+    <w:p>
+      <w:pPr>
+        <w:pStyle w:val="Code"/>
+        <w:rPr>
+          <w:rFonts w:ascii="Consolas" w:hAnsi="Consolas"/>
+        </w:rPr>
+      </w:pPr>
+      <w:r>
+        <w:rPr>
+          <w:rFonts w:ascii="Consolas" w:hAnsi="Consolas"/>
+        </w:rPr>
+        <w:t xml:space="preserve">            </w:t>
+      </w:r>
+      <w:r>
+        <w:rPr>
+          <w:rFonts w:ascii="Consolas" w:hAnsi="Consolas"/>
+        </w:rPr>
+        <w:t>ParseTree tree = parser.start();</w:t>
+      </w:r>
+    </w:p>
+    <w:p>
+      <w:pPr>
+        <w:pStyle w:val="Code"/>
+        <w:rPr>
+          <w:rFonts w:ascii="Consolas" w:hAnsi="Consolas"/>
+        </w:rPr>
+      </w:pPr>
+      <w:r>
+        <w:rPr>
+          <w:rFonts w:ascii="Consolas" w:hAnsi="Consolas"/>
+        </w:rPr>
+        <w:t xml:space="preserve">            </w:t>
+      </w:r>
+      <w:r>
+        <w:rPr>
+          <w:rFonts w:ascii="Consolas" w:hAnsi="Consolas"/>
+        </w:rPr>
+        <w:t>outputField.setText(tree.toStringTree(parser));</w:t>
+      </w:r>
+    </w:p>
+    <w:p>
+      <w:pPr>
+        <w:pStyle w:val="Code"/>
+        <w:rPr>
+          <w:rFonts w:ascii="Consolas" w:hAnsi="Consolas"/>
+        </w:rPr>
+      </w:pPr>
+      <w:r>
+        <w:rPr>
+          <w:rFonts w:ascii="Consolas" w:hAnsi="Consolas"/>
+        </w:rPr>
+        <w:t xml:space="preserve">        </w:t>
+      </w:r>
+      <w:r>
+        <w:rPr>
+          <w:rFonts w:ascii="Consolas" w:hAnsi="Consolas"/>
+        </w:rPr>
+        <w:t>});</w:t>
+      </w:r>
+    </w:p>
+    <w:p>
+      <w:pPr>
+        <w:pStyle w:val="Code"/>
+        <w:rPr>
+          <w:rFonts w:ascii="Consolas" w:hAnsi="Consolas"/>
+        </w:rPr>
+      </w:pPr>
+      <w:r>
+        <w:rPr>
+          <w:rFonts w:ascii="Consolas" w:hAnsi="Consolas"/>
+        </w:rPr>
+      </w:r>
+    </w:p>
+    <w:p>
+      <w:pPr>
+        <w:pStyle w:val="Code"/>
+        <w:rPr>
+          <w:rFonts w:ascii="Consolas" w:hAnsi="Consolas"/>
+        </w:rPr>
+      </w:pPr>
+      <w:r>
+        <w:rPr>
+          <w:rFonts w:ascii="Consolas" w:hAnsi="Consolas"/>
+        </w:rPr>
+        <w:t xml:space="preserve">        </w:t>
+      </w:r>
+      <w:r>
+        <w:rPr>
+          <w:rFonts w:ascii="Consolas" w:hAnsi="Consolas"/>
+        </w:rPr>
+        <w:t>upload.addActionListener(new ActionListener() {</w:t>
+      </w:r>
+    </w:p>
+    <w:p>
+      <w:pPr>
+        <w:pStyle w:val="Code"/>
+        <w:rPr>
+          <w:rFonts w:ascii="Consolas" w:hAnsi="Consolas"/>
+        </w:rPr>
+      </w:pPr>
+      <w:r>
+        <w:rPr>
+          <w:rFonts w:ascii="Consolas" w:hAnsi="Consolas"/>
+        </w:rPr>
+        <w:t xml:space="preserve">            </w:t>
+      </w:r>
+      <w:r>
+        <w:rPr>
+          <w:rFonts w:ascii="Consolas" w:hAnsi="Consolas"/>
+        </w:rPr>
+        <w:t>@Override</w:t>
+      </w:r>
+    </w:p>
+    <w:p>
+      <w:pPr>
+        <w:pStyle w:val="Code"/>
+        <w:rPr>
+          <w:rFonts w:ascii="Consolas" w:hAnsi="Consolas"/>
+        </w:rPr>
+      </w:pPr>
+      <w:r>
+        <w:rPr>
+          <w:rFonts w:ascii="Consolas" w:hAnsi="Consolas"/>
+        </w:rPr>
+        <w:t xml:space="preserve">            </w:t>
+      </w:r>
+      <w:r>
+        <w:rPr>
+          <w:rFonts w:ascii="Consolas" w:hAnsi="Consolas"/>
+        </w:rPr>
+        <w:t>public</w:t>
+      </w:r>
+    </w:p>
+    <w:p>
+      <w:pPr>
+        <w:pStyle w:val="Code"/>
+        <w:rPr>
+          <w:rFonts w:ascii="Consolas" w:hAnsi="Consolas"/>
+        </w:rPr>
+      </w:pPr>
+      <w:r>
+        <w:rPr>
+          <w:rFonts w:ascii="Consolas" w:hAnsi="Consolas"/>
+        </w:rPr>
+        <w:t xml:space="preserve">            </w:t>
+      </w:r>
+      <w:r>
+        <w:rPr>
+          <w:rFonts w:ascii="Consolas" w:hAnsi="Consolas"/>
+        </w:rPr>
+        <w:t>void actionPerformed(ActionEvent e) {</w:t>
+      </w:r>
+    </w:p>
+    <w:p>
+      <w:pPr>
+        <w:pStyle w:val="Code"/>
+        <w:rPr>
+          <w:rFonts w:ascii="Consolas" w:hAnsi="Consolas"/>
+        </w:rPr>
+      </w:pPr>
+      <w:r>
+        <w:rPr>
+          <w:rFonts w:ascii="Consolas" w:hAnsi="Consolas"/>
+        </w:rPr>
+        <w:t xml:space="preserve">                </w:t>
+      </w:r>
+      <w:r>
+        <w:rPr>
+          <w:rFonts w:ascii="Consolas" w:hAnsi="Consolas"/>
+        </w:rPr>
+        <w:t>String initialPath = "D:\\University-Universytet\\42SI Stvorennja IDE\\";</w:t>
+      </w:r>
+    </w:p>
+    <w:p>
+      <w:pPr>
+        <w:pStyle w:val="Code"/>
+        <w:rPr>
+          <w:rFonts w:ascii="Consolas" w:hAnsi="Consolas"/>
+        </w:rPr>
+      </w:pPr>
+      <w:r>
+        <w:rPr>
+          <w:rFonts w:ascii="Consolas" w:hAnsi="Consolas"/>
+        </w:rPr>
+        <w:t xml:space="preserve">                </w:t>
+      </w:r>
+      <w:r>
+        <w:rPr>
+          <w:rFonts w:ascii="Consolas" w:hAnsi="Consolas"/>
+        </w:rPr>
+        <w:t>JFileChooser chooser = new JFileChooser(initialPath);</w:t>
+      </w:r>
+    </w:p>
+    <w:p>
+      <w:pPr>
+        <w:pStyle w:val="Code"/>
+        <w:rPr>
+          <w:rFonts w:ascii="Consolas" w:hAnsi="Consolas"/>
+        </w:rPr>
+      </w:pPr>
+      <w:r>
+        <w:rPr>
+          <w:rFonts w:ascii="Consolas" w:hAnsi="Consolas"/>
+        </w:rPr>
+        <w:t xml:space="preserve">                </w:t>
+      </w:r>
+      <w:r>
+        <w:rPr>
+          <w:rFonts w:ascii="Consolas" w:hAnsi="Consolas"/>
+        </w:rPr>
+        <w:t>int returnedValue = chooser.showOpenDialog(frame);</w:t>
+      </w:r>
+    </w:p>
+    <w:p>
+      <w:pPr>
+        <w:pStyle w:val="Code"/>
+        <w:rPr>
+          <w:rFonts w:ascii="Consolas" w:hAnsi="Consolas"/>
+        </w:rPr>
+      </w:pPr>
+      <w:r>
+        <w:rPr>
+          <w:rFonts w:ascii="Consolas" w:hAnsi="Consolas"/>
+        </w:rPr>
+      </w:r>
+    </w:p>
+    <w:p>
+      <w:pPr>
+        <w:pStyle w:val="Code"/>
+        <w:rPr>
+          <w:rFonts w:ascii="Consolas" w:hAnsi="Consolas"/>
+        </w:rPr>
+      </w:pPr>
+      <w:r>
+        <w:rPr>
+          <w:rFonts w:ascii="Consolas" w:hAnsi="Consolas"/>
+        </w:rPr>
+        <w:t xml:space="preserve">                </w:t>
+      </w:r>
+      <w:r>
+        <w:rPr>
+          <w:rFonts w:ascii="Consolas" w:hAnsi="Consolas"/>
+        </w:rPr>
+        <w:t>if (returnedValue == JFileChooser.APPROVE_OPTION) {</w:t>
+      </w:r>
+    </w:p>
+    <w:p>
+      <w:pPr>
+        <w:pStyle w:val="Code"/>
+        <w:rPr>
+          <w:rFonts w:ascii="Consolas" w:hAnsi="Consolas"/>
+        </w:rPr>
+      </w:pPr>
+      <w:r>
+        <w:rPr>
+          <w:rFonts w:ascii="Consolas" w:hAnsi="Consolas"/>
+        </w:rPr>
+        <w:t xml:space="preserve">                    </w:t>
+      </w:r>
+      <w:r>
+        <w:rPr>
+          <w:rFonts w:ascii="Consolas" w:hAnsi="Consolas"/>
+        </w:rPr>
+        <w:t>File file = chooser.getSelectedFile();</w:t>
+      </w:r>
+    </w:p>
+    <w:p>
+      <w:pPr>
+        <w:pStyle w:val="Code"/>
+        <w:rPr>
+          <w:rFonts w:ascii="Consolas" w:hAnsi="Consolas"/>
+        </w:rPr>
+      </w:pPr>
+      <w:r>
+        <w:rPr>
+          <w:rFonts w:ascii="Consolas" w:hAnsi="Consolas"/>
+        </w:rPr>
+        <w:t xml:space="preserve">                    </w:t>
+      </w:r>
+      <w:r>
+        <w:rPr>
+          <w:rFonts w:ascii="Consolas" w:hAnsi="Consolas"/>
+        </w:rPr>
+        <w:t>System.out.println(file.getPath());</w:t>
+      </w:r>
+    </w:p>
+    <w:p>
+      <w:pPr>
+        <w:pStyle w:val="Code"/>
+        <w:rPr>
+          <w:rFonts w:ascii="Consolas" w:hAnsi="Consolas"/>
+        </w:rPr>
+      </w:pPr>
+      <w:r>
+        <w:rPr>
+          <w:rFonts w:ascii="Consolas" w:hAnsi="Consolas"/>
+        </w:rPr>
+      </w:r>
+    </w:p>
+    <w:p>
+      <w:pPr>
+        <w:pStyle w:val="Code"/>
+        <w:rPr>
+          <w:rFonts w:ascii="Consolas" w:hAnsi="Consolas"/>
+        </w:rPr>
+      </w:pPr>
+      <w:r>
+        <w:rPr>
+          <w:rFonts w:ascii="Consolas" w:hAnsi="Consolas"/>
+        </w:rPr>
+        <w:t xml:space="preserve">                    </w:t>
+      </w:r>
+      <w:r>
+        <w:rPr>
+          <w:rFonts w:ascii="Consolas" w:hAnsi="Consolas"/>
+        </w:rPr>
+        <w:t>try {</w:t>
+      </w:r>
+    </w:p>
+    <w:p>
+      <w:pPr>
+        <w:pStyle w:val="Code"/>
+        <w:rPr>
+          <w:rFonts w:ascii="Consolas" w:hAnsi="Consolas"/>
+        </w:rPr>
+      </w:pPr>
+      <w:r>
+        <w:rPr>
+          <w:rFonts w:ascii="Consolas" w:hAnsi="Consolas"/>
+        </w:rPr>
+        <w:t xml:space="preserve">                        </w:t>
+      </w:r>
+      <w:r>
+        <w:rPr>
+          <w:rFonts w:ascii="Consolas" w:hAnsi="Consolas"/>
+        </w:rPr>
+        <w:t>FileReader reader = new FileReader(file);</w:t>
+      </w:r>
+    </w:p>
+    <w:p>
+      <w:pPr>
+        <w:pStyle w:val="Code"/>
+        <w:rPr>
+          <w:rFonts w:ascii="Consolas" w:hAnsi="Consolas"/>
+        </w:rPr>
+      </w:pPr>
+      <w:r>
+        <w:rPr>
+          <w:rFonts w:ascii="Consolas" w:hAnsi="Consolas"/>
+        </w:rPr>
+        <w:t xml:space="preserve">                        </w:t>
+      </w:r>
+      <w:r>
+        <w:rPr>
+          <w:rFonts w:ascii="Consolas" w:hAnsi="Consolas"/>
+        </w:rPr>
+        <w:t>BufferedReader bufferedReader = new BufferedReader(reader);</w:t>
+      </w:r>
+    </w:p>
+    <w:p>
+      <w:pPr>
+        <w:pStyle w:val="Code"/>
+        <w:rPr>
+          <w:rFonts w:ascii="Consolas" w:hAnsi="Consolas"/>
+        </w:rPr>
+      </w:pPr>
+      <w:r>
+        <w:rPr>
+          <w:rFonts w:ascii="Consolas" w:hAnsi="Consolas"/>
+        </w:rPr>
+      </w:r>
+    </w:p>
+    <w:p>
+      <w:pPr>
+        <w:pStyle w:val="Code"/>
+        <w:rPr>
+          <w:rFonts w:ascii="Consolas" w:hAnsi="Consolas"/>
+        </w:rPr>
+      </w:pPr>
+      <w:r>
+        <w:rPr>
+          <w:rFonts w:ascii="Consolas" w:hAnsi="Consolas"/>
+        </w:rPr>
+        <w:t xml:space="preserve">                        </w:t>
+      </w:r>
+      <w:r>
+        <w:rPr>
+          <w:rFonts w:ascii="Consolas" w:hAnsi="Consolas"/>
+        </w:rPr>
+        <w:t>String string1 = "";</w:t>
+      </w:r>
+    </w:p>
+    <w:p>
+      <w:pPr>
+        <w:pStyle w:val="Code"/>
+        <w:rPr>
+          <w:rFonts w:ascii="Consolas" w:hAnsi="Consolas"/>
+        </w:rPr>
+      </w:pPr>
+      <w:r>
+        <w:rPr>
+          <w:rFonts w:ascii="Consolas" w:hAnsi="Consolas"/>
+        </w:rPr>
+        <w:t xml:space="preserve">                        </w:t>
+      </w:r>
+      <w:r>
+        <w:rPr>
+          <w:rFonts w:ascii="Consolas" w:hAnsi="Consolas"/>
+        </w:rPr>
+        <w:t>StringBuilder string2 = new StringBuilder();</w:t>
+      </w:r>
+    </w:p>
+    <w:p>
+      <w:pPr>
+        <w:pStyle w:val="Code"/>
+        <w:rPr>
+          <w:rFonts w:ascii="Consolas" w:hAnsi="Consolas"/>
+        </w:rPr>
+      </w:pPr>
+      <w:r>
+        <w:rPr>
+          <w:rFonts w:ascii="Consolas" w:hAnsi="Consolas"/>
+        </w:rPr>
+      </w:r>
+    </w:p>
+    <w:p>
+      <w:pPr>
+        <w:pStyle w:val="Code"/>
+        <w:rPr>
+          <w:rFonts w:ascii="Consolas" w:hAnsi="Consolas"/>
+        </w:rPr>
+      </w:pPr>
+      <w:r>
+        <w:rPr>
+          <w:rFonts w:ascii="Consolas" w:hAnsi="Consolas"/>
+        </w:rPr>
+        <w:t xml:space="preserve">                        </w:t>
+      </w:r>
+      <w:r>
+        <w:rPr>
+          <w:rFonts w:ascii="Consolas" w:hAnsi="Consolas"/>
+        </w:rPr>
+        <w:t>while ((string1 = bufferedReader.readLine()) != null) {</w:t>
+      </w:r>
+    </w:p>
+    <w:p>
+      <w:pPr>
+        <w:pStyle w:val="Code"/>
+        <w:rPr>
+          <w:rFonts w:ascii="Consolas" w:hAnsi="Consolas"/>
+        </w:rPr>
+      </w:pPr>
+      <w:r>
+        <w:rPr>
+          <w:rFonts w:ascii="Consolas" w:hAnsi="Consolas"/>
+        </w:rPr>
+        <w:t xml:space="preserve">                            </w:t>
+      </w:r>
+      <w:r>
+        <w:rPr>
+          <w:rFonts w:ascii="Consolas" w:hAnsi="Consolas"/>
+        </w:rPr>
+        <w:t>string2.append(string1).append("\n");</w:t>
+      </w:r>
+    </w:p>
+    <w:p>
+      <w:pPr>
+        <w:pStyle w:val="Code"/>
+        <w:rPr>
+          <w:rFonts w:ascii="Consolas" w:hAnsi="Consolas"/>
+        </w:rPr>
+      </w:pPr>
+      <w:r>
+        <w:rPr>
+          <w:rFonts w:ascii="Consolas" w:hAnsi="Consolas"/>
+        </w:rPr>
+        <w:t xml:space="preserve">                        </w:t>
+      </w:r>
+      <w:r>
+        <w:rPr>
+          <w:rFonts w:ascii="Consolas" w:hAnsi="Consolas"/>
+        </w:rPr>
+        <w:t>}</w:t>
+      </w:r>
+    </w:p>
+    <w:p>
+      <w:pPr>
+        <w:pStyle w:val="Code"/>
+        <w:rPr>
+          <w:rFonts w:ascii="Consolas" w:hAnsi="Consolas"/>
+        </w:rPr>
+      </w:pPr>
+      <w:r>
+        <w:rPr>
+          <w:rFonts w:ascii="Consolas" w:hAnsi="Consolas"/>
+        </w:rPr>
+      </w:r>
+    </w:p>
+    <w:p>
+      <w:pPr>
+        <w:pStyle w:val="Code"/>
+        <w:rPr>
+          <w:rFonts w:ascii="Consolas" w:hAnsi="Consolas"/>
+        </w:rPr>
+      </w:pPr>
+      <w:r>
+        <w:rPr>
+          <w:rFonts w:ascii="Consolas" w:hAnsi="Consolas"/>
+        </w:rPr>
+        <w:t xml:space="preserve">                        </w:t>
+      </w:r>
+      <w:r>
+        <w:rPr>
+          <w:rFonts w:ascii="Consolas" w:hAnsi="Consolas"/>
+        </w:rPr>
+        <w:t>inputField.setText(string2.toString());</w:t>
+      </w:r>
+    </w:p>
+    <w:p>
+      <w:pPr>
+        <w:pStyle w:val="Code"/>
+        <w:rPr>
+          <w:rFonts w:ascii="Consolas" w:hAnsi="Consolas"/>
+        </w:rPr>
+      </w:pPr>
+      <w:r>
+        <w:rPr>
+          <w:rFonts w:ascii="Consolas" w:hAnsi="Consolas"/>
+        </w:rPr>
+        <w:t xml:space="preserve">                        </w:t>
+      </w:r>
+      <w:r>
+        <w:rPr>
+          <w:rFonts w:ascii="Consolas" w:hAnsi="Consolas"/>
+        </w:rPr>
+        <w:t>bufferedReader.close();</w:t>
+      </w:r>
+    </w:p>
+    <w:p>
+      <w:pPr>
+        <w:pStyle w:val="Code"/>
+        <w:rPr>
+          <w:rFonts w:ascii="Consolas" w:hAnsi="Consolas"/>
+        </w:rPr>
+      </w:pPr>
+      <w:r>
+        <w:rPr>
+          <w:rFonts w:ascii="Consolas" w:hAnsi="Consolas"/>
+        </w:rPr>
+        <w:t xml:space="preserve">                    </w:t>
+      </w:r>
+      <w:r>
+        <w:rPr>
+          <w:rFonts w:ascii="Consolas" w:hAnsi="Consolas"/>
+        </w:rPr>
+        <w:t>} catch (IOException fileNotFoundException) {</w:t>
+      </w:r>
+    </w:p>
+    <w:p>
+      <w:pPr>
+        <w:pStyle w:val="Code"/>
+        <w:rPr>
+          <w:rFonts w:ascii="Consolas" w:hAnsi="Consolas"/>
+        </w:rPr>
+      </w:pPr>
+      <w:r>
+        <w:rPr>
+          <w:rFonts w:ascii="Consolas" w:hAnsi="Consolas"/>
+        </w:rPr>
+        <w:t xml:space="preserve">                        </w:t>
+      </w:r>
+      <w:r>
+        <w:rPr>
+          <w:rFonts w:ascii="Consolas" w:hAnsi="Consolas"/>
+        </w:rPr>
+        <w:t>fileNotFoundException.printStackTrace();</w:t>
+      </w:r>
+    </w:p>
+    <w:p>
+      <w:pPr>
+        <w:pStyle w:val="Code"/>
+        <w:rPr>
+          <w:rFonts w:ascii="Consolas" w:hAnsi="Consolas"/>
+        </w:rPr>
+      </w:pPr>
+      <w:r>
+        <w:rPr>
+          <w:rFonts w:ascii="Consolas" w:hAnsi="Consolas"/>
+        </w:rPr>
+        <w:t xml:space="preserve">                    </w:t>
+      </w:r>
+      <w:r>
+        <w:rPr>
+          <w:rFonts w:ascii="Consolas" w:hAnsi="Consolas"/>
+        </w:rPr>
+        <w:t>}</w:t>
+      </w:r>
+    </w:p>
+    <w:p>
+      <w:pPr>
+        <w:pStyle w:val="Code"/>
+        <w:rPr>
+          <w:rFonts w:ascii="Consolas" w:hAnsi="Consolas"/>
+        </w:rPr>
+      </w:pPr>
+      <w:r>
+        <w:rPr>
+          <w:rFonts w:ascii="Consolas" w:hAnsi="Consolas"/>
+        </w:rPr>
+        <w:t xml:space="preserve">                </w:t>
+      </w:r>
+      <w:r>
+        <w:rPr>
+          <w:rFonts w:ascii="Consolas" w:hAnsi="Consolas"/>
+        </w:rPr>
+        <w:t>}</w:t>
+      </w:r>
+    </w:p>
+    <w:p>
+      <w:pPr>
+        <w:pStyle w:val="Code"/>
+        <w:rPr>
+          <w:rFonts w:ascii="Consolas" w:hAnsi="Consolas"/>
+        </w:rPr>
+      </w:pPr>
+      <w:r>
+        <w:rPr>
+          <w:rFonts w:ascii="Consolas" w:hAnsi="Consolas"/>
+        </w:rPr>
+        <w:t xml:space="preserve">            </w:t>
+      </w:r>
+      <w:r>
+        <w:rPr>
+          <w:rFonts w:ascii="Consolas" w:hAnsi="Consolas"/>
+        </w:rPr>
+        <w:t>}</w:t>
+      </w:r>
+    </w:p>
+    <w:p>
+      <w:pPr>
+        <w:pStyle w:val="Code"/>
+        <w:rPr>
+          <w:rFonts w:ascii="Consolas" w:hAnsi="Consolas"/>
+        </w:rPr>
+      </w:pPr>
+      <w:r>
+        <w:rPr>
+          <w:rFonts w:ascii="Consolas" w:hAnsi="Consolas"/>
+        </w:rPr>
+        <w:t xml:space="preserve">        </w:t>
+      </w:r>
+      <w:r>
+        <w:rPr>
+          <w:rFonts w:ascii="Consolas" w:hAnsi="Consolas"/>
+        </w:rPr>
+        <w:t>});</w:t>
+      </w:r>
+    </w:p>
+    <w:p>
+      <w:pPr>
+        <w:pStyle w:val="Code"/>
+        <w:rPr>
+          <w:rFonts w:ascii="Consolas" w:hAnsi="Consolas"/>
+        </w:rPr>
+      </w:pPr>
+      <w:r>
+        <w:rPr>
+          <w:rFonts w:ascii="Consolas" w:hAnsi="Consolas"/>
+        </w:rPr>
+      </w:r>
+    </w:p>
+    <w:p>
+      <w:pPr>
+        <w:pStyle w:val="Code"/>
+        <w:rPr>
+          <w:rFonts w:ascii="Consolas" w:hAnsi="Consolas"/>
+        </w:rPr>
+      </w:pPr>
+      <w:r>
+        <w:rPr>
+          <w:rFonts w:ascii="Consolas" w:hAnsi="Consolas"/>
+        </w:rPr>
+        <w:t xml:space="preserve">        </w:t>
+      </w:r>
+      <w:r>
+        <w:rPr>
+          <w:rFonts w:ascii="Consolas" w:hAnsi="Consolas"/>
+        </w:rPr>
+        <w:t>frame.setSize(400,300);</w:t>
+      </w:r>
+    </w:p>
+    <w:p>
+      <w:pPr>
+        <w:pStyle w:val="Code"/>
+        <w:rPr>
+          <w:rFonts w:ascii="Consolas" w:hAnsi="Consolas"/>
+        </w:rPr>
+      </w:pPr>
+      <w:r>
+        <w:rPr>
+          <w:rFonts w:ascii="Consolas" w:hAnsi="Consolas"/>
+        </w:rPr>
+        <w:t xml:space="preserve">        </w:t>
+      </w:r>
+      <w:r>
+        <w:rPr>
+          <w:rFonts w:ascii="Consolas" w:hAnsi="Consolas"/>
+        </w:rPr>
+        <w:t>frame.setVisible(true);</w:t>
+      </w:r>
+    </w:p>
+    <w:p>
+      <w:pPr>
+        <w:pStyle w:val="Code"/>
+        <w:rPr>
+          <w:rFonts w:ascii="Consolas" w:hAnsi="Consolas"/>
+        </w:rPr>
+      </w:pPr>
+      <w:r>
+        <w:rPr>
+          <w:rFonts w:ascii="Consolas" w:hAnsi="Consolas"/>
+        </w:rPr>
+        <w:t xml:space="preserve">    </w:t>
+      </w:r>
+      <w:r>
+        <w:rPr>
+          <w:rFonts w:ascii="Consolas" w:hAnsi="Consolas"/>
+        </w:rPr>
+        <w:t>}</w:t>
+      </w:r>
+    </w:p>
+    <w:p>
+      <w:pPr>
+        <w:pStyle w:val="Code"/>
+        <w:rPr>
+          <w:rFonts w:ascii="Consolas" w:hAnsi="Consolas"/>
+        </w:rPr>
+      </w:pPr>
+      <w:r>
+        <w:rPr>
+          <w:rFonts w:ascii="Consolas" w:hAnsi="Consolas"/>
+        </w:rPr>
+        <w:t>}</w:t>
+      </w:r>
+    </w:p>
+    <w:p>
+      <w:pPr>
+        <w:pStyle w:val="P1"/>
+        <w:rPr/>
+      </w:pPr>
+      <w:r>
+        <w:rPr/>
+      </w:r>
+    </w:p>
+    <w:p>
+      <w:pPr>
+        <w:pStyle w:val="H3"/>
+        <w:spacing w:before="0" w:after="0"/>
+        <w:rPr/>
+      </w:pPr>
+      <w:r>
+        <w:rPr/>
+        <w:t>Вигляд</w:t>
       </w:r>
     </w:p>
     <w:p>
@@ -3023,7 +4589,7 @@
         <w:rPr/>
         <w:drawing>
           <wp:inline distT="0" distB="0" distL="0" distR="0">
-            <wp:extent cx="5731510" cy="6644640"/>
+            <wp:extent cx="5731510" cy="3524250"/>
             <wp:effectExtent l="0" t="0" r="0" b="0"/>
             <wp:docPr id="4" name="Зображення4"/>
             <wp:cNvGraphicFramePr>
@@ -3047,7 +4613,7 @@
                   <pic:spPr bwMode="auto">
                     <a:xfrm>
                       <a:off x="0" y="0"/>
-                      <a:ext cx="5731510" cy="6644640"/>
+                      <a:ext cx="5731510" cy="3524250"/>
                     </a:xfrm>
                     <a:prstGeom prst="rect">
                       <a:avLst/>
@@ -3060,12 +4626,6 @@
           </wp:inline>
         </w:drawing>
       </w:r>
-    </w:p>
-    <w:p>
-      <w:pPr>
-        <w:pStyle w:val="img1"/>
-        <w:rPr/>
-      </w:pPr>
       <w:r>
         <w:rPr/>
         <w:t>Рисунок 3.1 — Інтерфейс програми</w:t>
@@ -3082,7 +4642,79 @@
     </w:p>
     <w:p>
       <w:pPr>
+        <w:pStyle w:val="H2"/>
+        <w:spacing w:lineRule="auto" w:line="360"/>
+        <w:rPr/>
+      </w:pPr>
+      <w:r>
+        <w:rPr/>
+        <w:t xml:space="preserve">4 </w:t>
+      </w:r>
+      <w:r>
+        <w:rPr>
+          <w:lang w:val="uk-UA"/>
+        </w:rPr>
+        <w:t>Труднощі</w:t>
+      </w:r>
+    </w:p>
+    <w:p>
+      <w:pPr>
+        <w:pStyle w:val="P1"/>
+        <w:rPr>
+          <w:lang w:val="uk-UA"/>
+        </w:rPr>
+      </w:pPr>
+      <w:r>
+        <w:rPr>
+          <w:lang w:val="uk-UA"/>
+        </w:rPr>
+      </w:r>
+    </w:p>
+    <w:p>
+      <w:pPr>
+        <w:pStyle w:val="P1"/>
+        <w:rPr>
+          <w:lang w:val="uk-UA"/>
+        </w:rPr>
+      </w:pPr>
+      <w:r>
+        <w:rPr>
+          <w:lang w:val="uk-UA"/>
+        </w:rPr>
+        <w:t>Виникли наступні труднощі в процесі роботи:</w:t>
+      </w:r>
+    </w:p>
+    <w:p>
+      <w:pPr>
+        <w:pStyle w:val="P1"/>
+        <w:rPr>
+          <w:lang w:val="uk-UA"/>
+        </w:rPr>
+      </w:pPr>
+      <w:r>
+        <w:rPr>
+          <w:lang w:val="uk-UA"/>
+        </w:rPr>
+        <w:t>- було додано елементи прокрутки у панель контейнер замість щоб додати їх до рамки;</w:t>
+      </w:r>
+    </w:p>
+    <w:p>
+      <w:pPr>
+        <w:pStyle w:val="P1"/>
+        <w:rPr>
+          <w:lang w:val="uk-UA"/>
+        </w:rPr>
+      </w:pPr>
+      <w:r>
+        <w:rPr>
+          <w:lang w:val="uk-UA"/>
+        </w:rPr>
+      </w:r>
+    </w:p>
+    <w:p>
+      <w:pPr>
         <w:pStyle w:val="h11"/>
+        <w:ind w:hanging="0" w:left="0"/>
         <w:rPr/>
       </w:pPr>
       <w:r>
@@ -3139,6 +4771,7 @@
     <w:p>
       <w:pPr>
         <w:pStyle w:val="h11"/>
+        <w:ind w:hanging="0" w:left="0"/>
         <w:rPr/>
       </w:pPr>
       <w:r>
@@ -3149,6 +4782,7 @@
     <w:p>
       <w:pPr>
         <w:pStyle w:val="H2"/>
+        <w:ind w:firstLine="851" w:left="0"/>
         <w:rPr/>
       </w:pPr>
       <w:r>
@@ -3217,19 +4851,12 @@
     <w:p>
       <w:pPr>
         <w:pStyle w:val="H2"/>
-        <w:rPr/>
-      </w:pPr>
-      <w:r>
-        <w:rPr/>
-        <w:t xml:space="preserve">Чим відрізняються компілятори та </w:t>
-      </w:r>
-      <w:r>
-        <w:rPr/>
-        <w:t>інтерпретатори</w:t>
-      </w:r>
-      <w:r>
-        <w:rPr/>
-        <w:t>?</w:t>
+        <w:ind w:firstLine="851" w:left="0"/>
+        <w:rPr/>
+      </w:pPr>
+      <w:r>
+        <w:rPr/>
+        <w:t>Чим відрізняються компілятори та інтерпретатори?</w:t>
       </w:r>
     </w:p>
     <w:p>
@@ -3263,6 +4890,7 @@
     <w:p>
       <w:pPr>
         <w:pStyle w:val="H2"/>
+        <w:ind w:firstLine="851" w:left="0"/>
         <w:rPr/>
       </w:pPr>
       <w:r>
@@ -3325,9 +4953,7 @@
     <w:pPr>
       <w:widowControl/>
       <w:suppressAutoHyphens w:val="true"/>
-      <w:kinsoku w:val="true"/>
       <w:overflowPunct w:val="true"/>
-      <w:autoSpaceDE w:val="true"/>
       <w:bidi w:val="0"/>
       <w:spacing w:lineRule="auto" w:line="360" w:before="0" w:after="0"/>
       <w:ind w:firstLine="851"/>
@@ -3351,10 +4977,6 @@
     <w:pPr>
       <w:keepNext w:val="true"/>
       <w:keepLines/>
-      <w:numPr>
-        <w:ilvl w:val="0"/>
-        <w:numId w:val="0"/>
-      </w:numPr>
       <w:ind w:firstLine="851"/>
       <w:outlineLvl w:val="0"/>
     </w:pPr>
@@ -3374,10 +4996,6 @@
     <w:pPr>
       <w:keepNext w:val="true"/>
       <w:keepLines/>
-      <w:numPr>
-        <w:ilvl w:val="0"/>
-        <w:numId w:val="0"/>
-      </w:numPr>
       <w:spacing w:before="40" w:after="0"/>
       <w:ind w:firstLine="851"/>
       <w:outlineLvl w:val="1"/>
@@ -3398,10 +5016,6 @@
     <w:pPr>
       <w:keepNext w:val="true"/>
       <w:keepLines/>
-      <w:numPr>
-        <w:ilvl w:val="0"/>
-        <w:numId w:val="0"/>
-      </w:numPr>
       <w:spacing w:before="40" w:after="0"/>
       <w:ind w:firstLine="851"/>
       <w:outlineLvl w:val="2"/>
@@ -3834,7 +5448,9 @@
     <w:next w:val="P1"/>
     <w:link w:val="H2Char"/>
     <w:qFormat/>
-    <w:pPr/>
+    <w:pPr>
+      <w:spacing w:before="0" w:after="0"/>
+    </w:pPr>
     <w:rPr>
       <w:rFonts w:ascii="Times New Roman" w:hAnsi="Times New Roman" w:cs="Times New Roman"/>
       <w:b/>
@@ -3859,7 +5475,9 @@
     <w:next w:val="P1"/>
     <w:link w:val="H3Char"/>
     <w:qFormat/>
-    <w:pPr/>
+    <w:pPr>
+      <w:spacing w:before="0" w:after="0"/>
+    </w:pPr>
     <w:rPr>
       <w:rFonts w:ascii="Times New Roman" w:hAnsi="Times New Roman" w:cs="Times New Roman"/>
       <w:b/>
@@ -3893,10 +5511,6 @@
     <w:link w:val="H4"/>
     <w:qFormat/>
     <w:pPr>
-      <w:numPr>
-        <w:ilvl w:val="0"/>
-        <w:numId w:val="0"/>
-      </w:numPr>
       <w:ind w:firstLine="851"/>
       <w:outlineLvl w:val="3"/>
     </w:pPr>
@@ -3943,10 +5557,6 @@
     <w:link w:val="H5"/>
     <w:qFormat/>
     <w:pPr>
-      <w:numPr>
-        <w:ilvl w:val="0"/>
-        <w:numId w:val="0"/>
-      </w:numPr>
       <w:ind w:firstLine="851"/>
       <w:outlineLvl w:val="4"/>
     </w:pPr>
@@ -3961,10 +5571,6 @@
     <w:link w:val="H6"/>
     <w:qFormat/>
     <w:pPr>
-      <w:numPr>
-        <w:ilvl w:val="0"/>
-        <w:numId w:val="0"/>
-      </w:numPr>
       <w:ind w:firstLine="851"/>
       <w:outlineLvl w:val="5"/>
     </w:pPr>

</xml_diff>